<commit_message>
Improve BIA Forms import wording and redesign configuration guide
Co-Authored-By: Claude Opus 5.5 <noreply@anthropic.com>
Claude-Session: https://claude.ai/code/session_01DNF5smNv24Ekp3ruMBbrsQ
</commit_message>
<xml_diff>
--- a/bia-comedica/BIA_COMEDICA_Guia_Configuracion_Forms.docx
+++ b/bia-comedica/BIA_COMEDICA_Guia_Configuracion_Forms.docx
@@ -2,17 +2,122 @@
 <file path=word/document.xml><?xml version="1.0" encoding="utf-8"?>
 <w:document xmlns:wpc="http://schemas.microsoft.com/office/word/2010/wordprocessingCanvas" xmlns:mo="http://schemas.microsoft.com/office/mac/office/2008/main" xmlns:mc="http://schemas.openxmlformats.org/markup-compatibility/2006" xmlns:mv="urn:schemas-microsoft-com:mac:vml" xmlns:o="urn:schemas-microsoft-com:office:office" xmlns:r="http://schemas.openxmlformats.org/officeDocument/2006/relationships" xmlns:m="http://schemas.openxmlformats.org/officeDocument/2006/math" xmlns:v="urn:schemas-microsoft-com:vml" xmlns:wp14="http://schemas.microsoft.com/office/word/2010/wordprocessingDrawing" xmlns:wp="http://schemas.openxmlformats.org/drawingml/2006/wordprocessingDrawing" xmlns:w10="urn:schemas-microsoft-com:office:word" xmlns:w="http://schemas.openxmlformats.org/wordprocessingml/2006/main" xmlns:w14="http://schemas.microsoft.com/office/word/2010/wordml" xmlns:wpg="http://schemas.microsoft.com/office/word/2010/wordprocessingGroup" xmlns:wpi="http://schemas.microsoft.com/office/word/2010/wordprocessingInk" xmlns:wne="http://schemas.microsoft.com/office/word/2006/wordml" xmlns:wps="http://schemas.microsoft.com/office/word/2010/wordprocessingShape" mc:Ignorable="w14 wp14">
   <w:body>
+    <w:tbl>
+      <w:tblPr>
+        <w:tblW w:type="auto" w:w="0"/>
+        <w:tblLook w:firstColumn="1" w:firstRow="1" w:lastColumn="0" w:lastRow="0" w:noHBand="0" w:noVBand="1" w:val="04A0"/>
+      </w:tblPr>
+      <w:tblGrid>
+        <w:gridCol w:w="9972"/>
+      </w:tblGrid>
+      <w:tr>
+        <w:tc>
+          <w:tcPr>
+            <w:tcW w:type="dxa" w:w="9972"/>
+            <w:shd w:val="clear" w:color="auto" w:fill="1F3864"/>
+          </w:tcPr>
+          <w:p>
+            <w:r/>
+            <w:r>
+              <w:rPr>
+                <w:b/>
+                <w:color w:val="FFFFFF"/>
+                <w:sz w:val="20"/>
+              </w:rPr>
+              <w:t>COMÉDICA DE R.L. · Departamento de Administración de Riesgos</w:t>
+            </w:r>
+          </w:p>
+          <w:p>
+            <w:r>
+              <w:rPr>
+                <w:b/>
+                <w:color w:val="FFFFFF"/>
+                <w:sz w:val="36"/>
+              </w:rPr>
+              <w:t>Guía de configuración en Microsoft Forms</w:t>
+            </w:r>
+          </w:p>
+          <w:p>
+            <w:r>
+              <w:rPr>
+                <w:color w:val="FFFFFF"/>
+                <w:sz w:val="22"/>
+              </w:rPr>
+              <w:t>Entrevista para el Análisis del Impacto del Negocio (BIA)</w:t>
+            </w:r>
+          </w:p>
+        </w:tc>
+      </w:tr>
+    </w:tbl>
+    <w:p/>
+    <w:tbl>
+      <w:tblPr>
+        <w:tblW w:type="auto" w:w="0"/>
+        <w:tblLook w:firstColumn="1" w:firstRow="1" w:lastColumn="0" w:lastRow="0" w:noHBand="0" w:noVBand="1" w:val="04A0"/>
+      </w:tblPr>
+      <w:tblGrid>
+        <w:gridCol w:w="9972"/>
+      </w:tblGrid>
+      <w:tr>
+        <w:tc>
+          <w:tcPr>
+            <w:tcW w:type="dxa" w:w="9972"/>
+            <w:shd w:val="clear" w:color="auto" w:fill="DCE6F2"/>
+          </w:tcPr>
+          <w:p>
+            <w:r/>
+            <w:r>
+              <w:rPr>
+                <w:b w:val="0"/>
+                <w:sz w:val="20"/>
+              </w:rPr>
+              <w:t>Este documento NO se importa. Úselo para revisar y terminar de configurar el formulario después de importar el archivo BIA_COMEDICA_Importar_Forms.docx.</w:t>
+            </w:r>
+          </w:p>
+        </w:tc>
+      </w:tr>
+    </w:tbl>
     <w:p>
       <w:pPr>
-        <w:pStyle w:val="Title"/>
+        <w:pStyle w:val="Heading1"/>
       </w:pPr>
       <w:r>
-        <w:t>Guía de configuración en Microsoft Forms - Entrevista BIA</w:t>
+        <w:rPr>
+          <w:color w:val="1F3864"/>
+        </w:rPr>
+        <w:t>1. Importar el formulario</w:t>
       </w:r>
     </w:p>
     <w:p>
+      <w:pPr>
+        <w:pStyle w:val="ListNumber"/>
+      </w:pPr>
       <w:r>
-        <w:t>Este documento NO se importa. Úselo para revisar el formulario después de la Importación rápida.</w:t>
+        <w:t>Entre a forms.office.com con su cuenta institucional.</w:t>
+      </w:r>
+    </w:p>
+    <w:p>
+      <w:pPr>
+        <w:pStyle w:val="ListNumber"/>
+      </w:pPr>
+      <w:r>
+        <w:t>Seleccione Importación rápida &gt; Cargar desde este dispositivo.</w:t>
+      </w:r>
+    </w:p>
+    <w:p>
+      <w:pPr>
+        <w:pStyle w:val="ListNumber"/>
+      </w:pPr>
+      <w:r>
+        <w:t>Elija el archivo BIA_COMEDICA_Importar_Forms.docx y seleccione Formulario.</w:t>
+      </w:r>
+    </w:p>
+    <w:p>
+      <w:pPr>
+        <w:pStyle w:val="ListNumber"/>
+      </w:pPr>
+      <w:r>
+        <w:t>Revise la vista previa: deben aparecer 6 secciones y 43 preguntas. Luego seleccione Iniciar revisión o Confirmar.</w:t>
       </w:r>
     </w:p>
     <w:p>
@@ -20,71 +125,603 @@
         <w:pStyle w:val="Heading1"/>
       </w:pPr>
       <w:r>
-        <w:t>Pasos</w:t>
+        <w:rPr>
+          <w:color w:val="1F3864"/>
+        </w:rPr>
+        <w:t>2. Ajustes que Forms no hace solo</w:t>
+      </w:r>
+    </w:p>
+    <w:tbl>
+      <w:tblPr>
+        <w:tblStyle w:val="TableGrid"/>
+        <w:tblW w:type="auto" w:w="0"/>
+        <w:jc w:val="center"/>
+        <w:tblLayout w:type="fixed"/>
+        <w:tblLook w:firstColumn="1" w:firstRow="1" w:lastColumn="0" w:lastRow="0" w:noHBand="0" w:noVBand="1" w:val="04A0"/>
+      </w:tblPr>
+      <w:tblGrid>
+        <w:gridCol w:w="2154"/>
+        <w:gridCol w:w="2835"/>
+        <w:gridCol w:w="4649"/>
+      </w:tblGrid>
+      <w:tr>
+        <w:tc>
+          <w:tcPr>
+            <w:tcW w:type="dxa" w:w="2154"/>
+            <w:shd w:val="clear" w:color="auto" w:fill="1F3864"/>
+          </w:tcPr>
+          <w:p>
+            <w:r/>
+            <w:r>
+              <w:rPr>
+                <w:b/>
+                <w:color w:val="FFFFFF"/>
+                <w:sz w:val="19"/>
+              </w:rPr>
+              <w:t>Ajuste</w:t>
+            </w:r>
+          </w:p>
+        </w:tc>
+        <w:tc>
+          <w:tcPr>
+            <w:tcW w:type="dxa" w:w="2835"/>
+            <w:shd w:val="clear" w:color="auto" w:fill="1F3864"/>
+          </w:tcPr>
+          <w:p>
+            <w:r/>
+            <w:r>
+              <w:rPr>
+                <w:b/>
+                <w:color w:val="FFFFFF"/>
+                <w:sz w:val="19"/>
+              </w:rPr>
+              <w:t>Dónde</w:t>
+            </w:r>
+          </w:p>
+        </w:tc>
+        <w:tc>
+          <w:tcPr>
+            <w:tcW w:type="dxa" w:w="4649"/>
+            <w:shd w:val="clear" w:color="auto" w:fill="1F3864"/>
+          </w:tcPr>
+          <w:p>
+            <w:r/>
+            <w:r>
+              <w:rPr>
+                <w:b/>
+                <w:color w:val="FFFFFF"/>
+                <w:sz w:val="19"/>
+              </w:rPr>
+              <w:t>Cómo</w:t>
+            </w:r>
+          </w:p>
+        </w:tc>
+      </w:tr>
+      <w:tr>
+        <w:tc>
+          <w:tcPr>
+            <w:tcW w:type="dxa" w:w="2154"/>
+          </w:tcPr>
+          <w:p>
+            <w:r/>
+            <w:r>
+              <w:rPr>
+                <w:b w:val="0"/>
+                <w:sz w:val="19"/>
+              </w:rPr>
+              <w:t>Marcar obligatorias</w:t>
+            </w:r>
+          </w:p>
+        </w:tc>
+        <w:tc>
+          <w:tcPr>
+            <w:tcW w:type="dxa" w:w="2835"/>
+          </w:tcPr>
+          <w:p>
+            <w:r/>
+            <w:r>
+              <w:rPr>
+                <w:b w:val="0"/>
+                <w:sz w:val="19"/>
+              </w:rPr>
+              <w:t>Preguntas con 'Sí' en la tabla de la sección 4</w:t>
+            </w:r>
+          </w:p>
+        </w:tc>
+        <w:tc>
+          <w:tcPr>
+            <w:tcW w:type="dxa" w:w="4649"/>
+          </w:tcPr>
+          <w:p>
+            <w:r/>
+            <w:r>
+              <w:rPr>
+                <w:b w:val="0"/>
+                <w:sz w:val="19"/>
+              </w:rPr>
+              <w:t>Active el interruptor Obligatorio en cada pregunta.</w:t>
+            </w:r>
+          </w:p>
+        </w:tc>
+      </w:tr>
+      <w:tr>
+        <w:tc>
+          <w:tcPr>
+            <w:tcW w:type="dxa" w:w="2154"/>
+            <w:shd w:val="clear" w:color="auto" w:fill="F2F2F2"/>
+          </w:tcPr>
+          <w:p>
+            <w:r/>
+            <w:r>
+              <w:rPr>
+                <w:b w:val="0"/>
+                <w:sz w:val="19"/>
+              </w:rPr>
+              <w:t>Respuesta larga</w:t>
+            </w:r>
+          </w:p>
+        </w:tc>
+        <w:tc>
+          <w:tcPr>
+            <w:tcW w:type="dxa" w:w="2835"/>
+            <w:shd w:val="clear" w:color="auto" w:fill="F2F2F2"/>
+          </w:tcPr>
+          <w:p>
+            <w:r/>
+            <w:r>
+              <w:rPr>
+                <w:b w:val="0"/>
+                <w:sz w:val="19"/>
+              </w:rPr>
+              <w:t>Preguntas de tipo Texto largo</w:t>
+            </w:r>
+          </w:p>
+        </w:tc>
+        <w:tc>
+          <w:tcPr>
+            <w:tcW w:type="dxa" w:w="4649"/>
+            <w:shd w:val="clear" w:color="auto" w:fill="F2F2F2"/>
+          </w:tcPr>
+          <w:p>
+            <w:r/>
+            <w:r>
+              <w:rPr>
+                <w:b w:val="0"/>
+                <w:sz w:val="19"/>
+              </w:rPr>
+              <w:t>Active Respuesta larga (Forms las importa como texto corto).</w:t>
+            </w:r>
+          </w:p>
+        </w:tc>
+      </w:tr>
+      <w:tr>
+        <w:tc>
+          <w:tcPr>
+            <w:tcW w:type="dxa" w:w="2154"/>
+          </w:tcPr>
+          <w:p>
+            <w:r/>
+            <w:r>
+              <w:rPr>
+                <w:b w:val="0"/>
+                <w:sz w:val="19"/>
+              </w:rPr>
+              <w:t>Pregunta de fecha</w:t>
+            </w:r>
+          </w:p>
+        </w:tc>
+        <w:tc>
+          <w:tcPr>
+            <w:tcW w:type="dxa" w:w="2835"/>
+          </w:tcPr>
+          <w:p>
+            <w:r/>
+            <w:r>
+              <w:rPr>
+                <w:b w:val="0"/>
+                <w:sz w:val="19"/>
+              </w:rPr>
+              <w:t>Pregunta 1</w:t>
+            </w:r>
+          </w:p>
+        </w:tc>
+        <w:tc>
+          <w:tcPr>
+            <w:tcW w:type="dxa" w:w="4649"/>
+          </w:tcPr>
+          <w:p>
+            <w:r/>
+            <w:r>
+              <w:rPr>
+                <w:b w:val="0"/>
+                <w:sz w:val="19"/>
+              </w:rPr>
+              <w:t>Si no quedó como Fecha, cambie el tipo a Fecha.</w:t>
+            </w:r>
+          </w:p>
+        </w:tc>
+      </w:tr>
+      <w:tr>
+        <w:tc>
+          <w:tcPr>
+            <w:tcW w:type="dxa" w:w="2154"/>
+            <w:shd w:val="clear" w:color="auto" w:fill="F2F2F2"/>
+          </w:tcPr>
+          <w:p>
+            <w:r/>
+            <w:r>
+              <w:rPr>
+                <w:b w:val="0"/>
+                <w:sz w:val="19"/>
+              </w:rPr>
+              <w:t>Opción Otro</w:t>
+            </w:r>
+          </w:p>
+        </w:tc>
+        <w:tc>
+          <w:tcPr>
+            <w:tcW w:type="dxa" w:w="2835"/>
+            <w:shd w:val="clear" w:color="auto" w:fill="F2F2F2"/>
+          </w:tcPr>
+          <w:p>
+            <w:r/>
+            <w:r>
+              <w:rPr>
+                <w:b w:val="0"/>
+                <w:sz w:val="19"/>
+              </w:rPr>
+              <w:t>Pregunta 28 (respaldos)</w:t>
+            </w:r>
+          </w:p>
+        </w:tc>
+        <w:tc>
+          <w:tcPr>
+            <w:tcW w:type="dxa" w:w="4649"/>
+            <w:shd w:val="clear" w:color="auto" w:fill="F2F2F2"/>
+          </w:tcPr>
+          <w:p>
+            <w:r/>
+            <w:r>
+              <w:rPr>
+                <w:b w:val="0"/>
+                <w:sz w:val="19"/>
+              </w:rPr>
+              <w:t>Seleccione Agregar opción "Otro".</w:t>
+            </w:r>
+          </w:p>
+        </w:tc>
+      </w:tr>
+      <w:tr>
+        <w:tc>
+          <w:tcPr>
+            <w:tcW w:type="dxa" w:w="2154"/>
+          </w:tcPr>
+          <w:p>
+            <w:r/>
+            <w:r>
+              <w:rPr>
+                <w:b w:val="0"/>
+                <w:sz w:val="19"/>
+              </w:rPr>
+              <w:t>Lista de gerencias (opcional)</w:t>
+            </w:r>
+          </w:p>
+        </w:tc>
+        <w:tc>
+          <w:tcPr>
+            <w:tcW w:type="dxa" w:w="2835"/>
+          </w:tcPr>
+          <w:p>
+            <w:r/>
+            <w:r>
+              <w:rPr>
+                <w:b w:val="0"/>
+                <w:sz w:val="19"/>
+              </w:rPr>
+              <w:t>Pregunta 4</w:t>
+            </w:r>
+          </w:p>
+        </w:tc>
+        <w:tc>
+          <w:tcPr>
+            <w:tcW w:type="dxa" w:w="4649"/>
+          </w:tcPr>
+          <w:p>
+            <w:r/>
+            <w:r>
+              <w:rPr>
+                <w:b w:val="0"/>
+                <w:sz w:val="19"/>
+              </w:rPr>
+              <w:t>Cambie a Opción y active Lista desplegable con las gerencias.</w:t>
+            </w:r>
+          </w:p>
+        </w:tc>
+      </w:tr>
+      <w:tr>
+        <w:tc>
+          <w:tcPr>
+            <w:tcW w:type="dxa" w:w="2154"/>
+            <w:shd w:val="clear" w:color="auto" w:fill="F2F2F2"/>
+          </w:tcPr>
+          <w:p>
+            <w:r/>
+            <w:r>
+              <w:rPr>
+                <w:b w:val="0"/>
+                <w:sz w:val="19"/>
+              </w:rPr>
+              <w:t>Likert (opcional)</w:t>
+            </w:r>
+          </w:p>
+        </w:tc>
+        <w:tc>
+          <w:tcPr>
+            <w:tcW w:type="dxa" w:w="2835"/>
+            <w:shd w:val="clear" w:color="auto" w:fill="F2F2F2"/>
+          </w:tcPr>
+          <w:p>
+            <w:r/>
+            <w:r>
+              <w:rPr>
+                <w:b w:val="0"/>
+                <w:sz w:val="19"/>
+              </w:rPr>
+              <w:t>Preguntas 9 a 15</w:t>
+            </w:r>
+          </w:p>
+        </w:tc>
+        <w:tc>
+          <w:tcPr>
+            <w:tcW w:type="dxa" w:w="4649"/>
+            <w:shd w:val="clear" w:color="auto" w:fill="F2F2F2"/>
+          </w:tcPr>
+          <w:p>
+            <w:r/>
+            <w:r>
+              <w:rPr>
+                <w:b w:val="0"/>
+                <w:sz w:val="19"/>
+              </w:rPr>
+              <w:t>Cree una pregunta Likert con las 7 declaraciones y la escala Muy alto a Muy bajo; luego elimine las 7 preguntas.</w:t>
+            </w:r>
+          </w:p>
+        </w:tc>
+      </w:tr>
+    </w:tbl>
+    <w:p>
+      <w:pPr>
+        <w:pStyle w:val="Heading1"/>
+      </w:pPr>
+      <w:r>
+        <w:rPr>
+          <w:color w:val="1F3864"/>
+        </w:rPr>
+        <w:t>3. Ramificación</w:t>
       </w:r>
     </w:p>
     <w:p>
-      <w:pPr>
-        <w:pStyle w:val="ListNumber"/>
-      </w:pPr>
       <w:r>
-        <w:t>En forms.office.com: Importación rápida &gt; Cargar desde este dispositivo &gt; seleccione el archivo de importación &gt; elija Formulario.</w:t>
+        <w:t>En el menú ··· (Más configuraciones) &gt; Ramificación, configure:</w:t>
       </w:r>
     </w:p>
+    <w:tbl>
+      <w:tblPr>
+        <w:tblStyle w:val="TableGrid"/>
+        <w:tblW w:type="auto" w:w="0"/>
+        <w:jc w:val="center"/>
+        <w:tblLayout w:type="fixed"/>
+        <w:tblLook w:firstColumn="1" w:firstRow="1" w:lastColumn="0" w:lastRow="0" w:noHBand="0" w:noVBand="1" w:val="04A0"/>
+      </w:tblPr>
+      <w:tblGrid>
+        <w:gridCol w:w="4535"/>
+        <w:gridCol w:w="1701"/>
+        <w:gridCol w:w="3402"/>
+      </w:tblGrid>
+      <w:tr>
+        <w:tc>
+          <w:tcPr>
+            <w:tcW w:type="dxa" w:w="4535"/>
+            <w:shd w:val="clear" w:color="auto" w:fill="1F3864"/>
+          </w:tcPr>
+          <w:p>
+            <w:r/>
+            <w:r>
+              <w:rPr>
+                <w:b/>
+                <w:color w:val="FFFFFF"/>
+                <w:sz w:val="19"/>
+              </w:rPr>
+              <w:t>Pregunta</w:t>
+            </w:r>
+          </w:p>
+        </w:tc>
+        <w:tc>
+          <w:tcPr>
+            <w:tcW w:type="dxa" w:w="1701"/>
+            <w:shd w:val="clear" w:color="auto" w:fill="1F3864"/>
+          </w:tcPr>
+          <w:p>
+            <w:r/>
+            <w:r>
+              <w:rPr>
+                <w:b/>
+                <w:color w:val="FFFFFF"/>
+                <w:sz w:val="19"/>
+              </w:rPr>
+              <w:t>Si responde</w:t>
+            </w:r>
+          </w:p>
+        </w:tc>
+        <w:tc>
+          <w:tcPr>
+            <w:tcW w:type="dxa" w:w="3402"/>
+            <w:shd w:val="clear" w:color="auto" w:fill="1F3864"/>
+          </w:tcPr>
+          <w:p>
+            <w:r/>
+            <w:r>
+              <w:rPr>
+                <w:b/>
+                <w:color w:val="FFFFFF"/>
+                <w:sz w:val="19"/>
+              </w:rPr>
+              <w:t>Ir a</w:t>
+            </w:r>
+          </w:p>
+        </w:tc>
+      </w:tr>
+      <w:tr>
+        <w:tc>
+          <w:tcPr>
+            <w:tcW w:type="dxa" w:w="4535"/>
+          </w:tcPr>
+          <w:p>
+            <w:r/>
+            <w:r>
+              <w:rPr>
+                <w:b w:val="0"/>
+                <w:sz w:val="19"/>
+              </w:rPr>
+              <w:t>20. Procedimientos manuales o alternos</w:t>
+            </w:r>
+          </w:p>
+        </w:tc>
+        <w:tc>
+          <w:tcPr>
+            <w:tcW w:type="dxa" w:w="1701"/>
+          </w:tcPr>
+          <w:p>
+            <w:r/>
+            <w:r>
+              <w:rPr>
+                <w:b w:val="0"/>
+                <w:sz w:val="19"/>
+              </w:rPr>
+              <w:t>No</w:t>
+            </w:r>
+          </w:p>
+        </w:tc>
+        <w:tc>
+          <w:tcPr>
+            <w:tcW w:type="dxa" w:w="3402"/>
+          </w:tcPr>
+          <w:p>
+            <w:r/>
+            <w:r>
+              <w:rPr>
+                <w:b w:val="0"/>
+                <w:sz w:val="19"/>
+              </w:rPr>
+              <w:t>Pregunta 23 (MTPD)</w:t>
+            </w:r>
+          </w:p>
+        </w:tc>
+      </w:tr>
+      <w:tr>
+        <w:tc>
+          <w:tcPr>
+            <w:tcW w:type="dxa" w:w="4535"/>
+            <w:shd w:val="clear" w:color="auto" w:fill="F2F2F2"/>
+          </w:tcPr>
+          <w:p>
+            <w:r/>
+            <w:r>
+              <w:rPr>
+                <w:b w:val="0"/>
+                <w:sz w:val="19"/>
+              </w:rPr>
+              <w:t>36. Proveedores críticos</w:t>
+            </w:r>
+          </w:p>
+        </w:tc>
+        <w:tc>
+          <w:tcPr>
+            <w:tcW w:type="dxa" w:w="1701"/>
+            <w:shd w:val="clear" w:color="auto" w:fill="F2F2F2"/>
+          </w:tcPr>
+          <w:p>
+            <w:r/>
+            <w:r>
+              <w:rPr>
+                <w:b w:val="0"/>
+                <w:sz w:val="19"/>
+              </w:rPr>
+              <w:t>No</w:t>
+            </w:r>
+          </w:p>
+        </w:tc>
+        <w:tc>
+          <w:tcPr>
+            <w:tcW w:type="dxa" w:w="3402"/>
+            <w:shd w:val="clear" w:color="auto" w:fill="F2F2F2"/>
+          </w:tcPr>
+          <w:p>
+            <w:r/>
+            <w:r>
+              <w:rPr>
+                <w:b w:val="0"/>
+                <w:sz w:val="19"/>
+              </w:rPr>
+              <w:t>Pregunta 38 (alternativas)</w:t>
+            </w:r>
+          </w:p>
+        </w:tc>
+      </w:tr>
+      <w:tr>
+        <w:tc>
+          <w:tcPr>
+            <w:tcW w:type="dxa" w:w="4535"/>
+          </w:tcPr>
+          <w:p>
+            <w:r/>
+            <w:r>
+              <w:rPr>
+                <w:b w:val="0"/>
+                <w:sz w:val="19"/>
+              </w:rPr>
+              <w:t>42. Confirmación de la información</w:t>
+            </w:r>
+          </w:p>
+        </w:tc>
+        <w:tc>
+          <w:tcPr>
+            <w:tcW w:type="dxa" w:w="1701"/>
+          </w:tcPr>
+          <w:p>
+            <w:r/>
+            <w:r>
+              <w:rPr>
+                <w:b w:val="0"/>
+                <w:sz w:val="19"/>
+              </w:rPr>
+              <w:t>Sí</w:t>
+            </w:r>
+          </w:p>
+        </w:tc>
+        <w:tc>
+          <w:tcPr>
+            <w:tcW w:type="dxa" w:w="3402"/>
+          </w:tcPr>
+          <w:p>
+            <w:r/>
+            <w:r>
+              <w:rPr>
+                <w:b w:val="0"/>
+                <w:sz w:val="19"/>
+              </w:rPr>
+              <w:t>Fin del formulario</w:t>
+            </w:r>
+          </w:p>
+        </w:tc>
+      </w:tr>
+    </w:tbl>
     <w:p>
-      <w:pPr>
-        <w:pStyle w:val="ListNumber"/>
-      </w:pPr>
       <w:r>
-        <w:t>Compare el resultado con la tabla de abajo: tipo de respuesta y obligatoria. Forms no importa la marca de obligatoria; actívela pregunta por pregunta.</w:t>
-      </w:r>
-    </w:p>
-    <w:p>
-      <w:pPr>
-        <w:pStyle w:val="ListNumber"/>
-      </w:pPr>
-      <w:r>
-        <w:t>Para las preguntas de Texto largo, active la opción 'Respuesta larga' (Forms las importa como texto corto).</w:t>
-      </w:r>
-    </w:p>
-    <w:p>
-      <w:pPr>
-        <w:pStyle w:val="ListNumber"/>
-      </w:pPr>
-      <w:r>
-        <w:t>Severidad de impactos (preguntas 9 a 15): se importan como siete preguntas de opción con la misma escala. Si prefiere una sola pregunta tipo Likert, cree una pregunta Likert con las declaraciones Financiero, Operacional, Legal, Reputacional, Clientes, Personas e Infraestructura y equipo, y elimine las siete preguntas.</w:t>
-      </w:r>
-    </w:p>
-    <w:p>
-      <w:pPr>
-        <w:pStyle w:val="ListNumber"/>
-      </w:pPr>
-      <w:r>
-        <w:t>Pregunta 'Gerencia o departamento': puede cambiarla a Opción o Lista desplegable con las gerencias de la Cooperativa.</w:t>
-      </w:r>
-    </w:p>
-    <w:p>
-      <w:pPr>
-        <w:pStyle w:val="ListNumber"/>
-      </w:pPr>
-      <w:r>
-        <w:t>Ramificación (menú ... &gt; Ramificación): pregunta 20 (procedimientos alternos) 'No' &gt; ir a la pregunta 23; pregunta 36 (proveedores críticos) 'No' &gt; ir a la pregunta 38; pregunta 42 (confirmación) 'Sí' &gt; Fin del formulario.</w:t>
-      </w:r>
-    </w:p>
-    <w:p>
-      <w:pPr>
-        <w:pStyle w:val="ListNumber"/>
-      </w:pPr>
-      <w:r>
-        <w:t>En la pregunta de frecuencia de respaldo, si desea texto libre para 'Otro', elimine esa opción y use 'Agregar opción Otro'.</w:t>
-      </w:r>
-    </w:p>
-    <w:p>
-      <w:pPr>
-        <w:pStyle w:val="ListNumber"/>
-      </w:pPr>
-      <w:r>
-        <w:t>Haga una respuesta de prueba antes de compartir.</w:t>
+        <w:rPr>
+          <w:i/>
+        </w:rPr>
+        <w:t>Las preguntas a las que se salta (21, 22, 37 y 43) deben quedar como no obligatorias.</w:t>
       </w:r>
     </w:p>
     <w:p>
@@ -92,58 +729,91 @@
         <w:pStyle w:val="Heading1"/>
       </w:pPr>
       <w:r>
-        <w:t>Tipo de respuesta por pregunta</w:t>
+        <w:rPr>
+          <w:color w:val="1F3864"/>
+        </w:rPr>
+        <w:t>4. Tipo de respuesta por pregunta</w:t>
       </w:r>
     </w:p>
     <w:tbl>
       <w:tblPr>
-        <w:tblStyle w:val="LightGrid-Accent1"/>
+        <w:tblStyle w:val="TableGrid"/>
         <w:tblW w:type="auto" w:w="0"/>
+        <w:jc w:val="center"/>
+        <w:tblLayout w:type="fixed"/>
         <w:tblLook w:firstColumn="1" w:firstRow="1" w:lastColumn="0" w:lastRow="0" w:noHBand="0" w:noVBand="1" w:val="04A0"/>
       </w:tblPr>
       <w:tblGrid>
-        <w:gridCol w:w="2160"/>
-        <w:gridCol w:w="2160"/>
-        <w:gridCol w:w="2160"/>
-        <w:gridCol w:w="2160"/>
+        <w:gridCol w:w="624"/>
+        <w:gridCol w:w="6236"/>
+        <w:gridCol w:w="1474"/>
+        <w:gridCol w:w="1304"/>
       </w:tblGrid>
       <w:tr>
         <w:tc>
           <w:tcPr>
-            <w:tcW w:type="dxa" w:w="2160"/>
+            <w:tcW w:type="dxa" w:w="624"/>
+            <w:shd w:val="clear" w:color="auto" w:fill="1F3864"/>
           </w:tcPr>
           <w:p>
+            <w:r/>
             <w:r>
+              <w:rPr>
+                <w:b/>
+                <w:color w:val="FFFFFF"/>
+                <w:sz w:val="19"/>
+              </w:rPr>
               <w:t>N.º</w:t>
             </w:r>
           </w:p>
         </w:tc>
         <w:tc>
           <w:tcPr>
-            <w:tcW w:type="dxa" w:w="2160"/>
+            <w:tcW w:type="dxa" w:w="6236"/>
+            <w:shd w:val="clear" w:color="auto" w:fill="1F3864"/>
           </w:tcPr>
           <w:p>
+            <w:r/>
             <w:r>
+              <w:rPr>
+                <w:b/>
+                <w:color w:val="FFFFFF"/>
+                <w:sz w:val="19"/>
+              </w:rPr>
               <w:t>Pregunta</w:t>
             </w:r>
           </w:p>
         </w:tc>
         <w:tc>
           <w:tcPr>
-            <w:tcW w:type="dxa" w:w="2160"/>
+            <w:tcW w:type="dxa" w:w="1474"/>
+            <w:shd w:val="clear" w:color="auto" w:fill="1F3864"/>
           </w:tcPr>
           <w:p>
+            <w:r/>
             <w:r>
+              <w:rPr>
+                <w:b/>
+                <w:color w:val="FFFFFF"/>
+                <w:sz w:val="19"/>
+              </w:rPr>
               <w:t>Tipo</w:t>
             </w:r>
           </w:p>
         </w:tc>
         <w:tc>
           <w:tcPr>
-            <w:tcW w:type="dxa" w:w="2160"/>
+            <w:tcW w:type="dxa" w:w="1304"/>
+            <w:shd w:val="clear" w:color="auto" w:fill="1F3864"/>
           </w:tcPr>
           <w:p>
+            <w:r/>
             <w:r>
+              <w:rPr>
+                <w:b/>
+                <w:color w:val="FFFFFF"/>
+                <w:sz w:val="19"/>
+              </w:rPr>
               <w:t>Obligatoria</w:t>
             </w:r>
           </w:p>
@@ -152,40 +822,73 @@
       <w:tr>
         <w:tc>
           <w:tcPr>
-            <w:tcW w:type="dxa" w:w="2160"/>
+            <w:tcW w:type="dxa" w:w="624"/>
           </w:tcPr>
           <w:p>
+            <w:pPr>
+              <w:jc w:val="center"/>
+            </w:pPr>
+            <w:r/>
             <w:r>
+              <w:rPr>
+                <w:b w:val="0"/>
+                <w:sz w:val="19"/>
+              </w:rPr>
               <w:t>1</w:t>
             </w:r>
           </w:p>
         </w:tc>
         <w:tc>
           <w:tcPr>
-            <w:tcW w:type="dxa" w:w="2160"/>
+            <w:tcW w:type="dxa" w:w="6236"/>
           </w:tcPr>
           <w:p>
+            <w:r/>
             <w:r>
+              <w:rPr>
+                <w:b w:val="0"/>
+                <w:sz w:val="19"/>
+              </w:rPr>
               <w:t>Fecha de la entrevista</w:t>
             </w:r>
           </w:p>
         </w:tc>
         <w:tc>
           <w:tcPr>
-            <w:tcW w:type="dxa" w:w="2160"/>
+            <w:tcW w:type="dxa" w:w="1474"/>
           </w:tcPr>
           <w:p>
+            <w:pPr>
+              <w:jc w:val="center"/>
+            </w:pPr>
+            <w:r/>
             <w:r>
+              <w:rPr>
+                <w:b w:val="0"/>
+                <w:sz w:val="19"/>
+              </w:rPr>
               <w:t>Fecha</w:t>
             </w:r>
           </w:p>
         </w:tc>
         <w:tc>
           <w:tcPr>
-            <w:tcW w:type="dxa" w:w="2160"/>
+            <w:tcW w:type="dxa" w:w="1304"/>
           </w:tcPr>
           <w:p>
+            <w:pPr>
+              <w:jc w:val="center"/>
+            </w:pPr>
             <w:r>
+              <w:rPr>
+                <w:b/>
+              </w:rPr>
+            </w:r>
+            <w:r>
+              <w:rPr>
+                <w:b w:val="0"/>
+                <w:sz w:val="19"/>
+              </w:rPr>
               <w:t>Sí</w:t>
             </w:r>
           </w:p>
@@ -194,40 +897,77 @@
       <w:tr>
         <w:tc>
           <w:tcPr>
-            <w:tcW w:type="dxa" w:w="2160"/>
+            <w:tcW w:type="dxa" w:w="624"/>
+            <w:shd w:val="clear" w:color="auto" w:fill="F2F2F2"/>
           </w:tcPr>
           <w:p>
+            <w:pPr>
+              <w:jc w:val="center"/>
+            </w:pPr>
+            <w:r/>
             <w:r>
+              <w:rPr>
+                <w:b w:val="0"/>
+                <w:sz w:val="19"/>
+              </w:rPr>
               <w:t>2</w:t>
             </w:r>
           </w:p>
         </w:tc>
         <w:tc>
           <w:tcPr>
-            <w:tcW w:type="dxa" w:w="2160"/>
+            <w:tcW w:type="dxa" w:w="6236"/>
+            <w:shd w:val="clear" w:color="auto" w:fill="F2F2F2"/>
           </w:tcPr>
           <w:p>
+            <w:r/>
             <w:r>
+              <w:rPr>
+                <w:b w:val="0"/>
+                <w:sz w:val="19"/>
+              </w:rPr>
               <w:t>Nombre completo del entrevistado</w:t>
             </w:r>
           </w:p>
         </w:tc>
         <w:tc>
           <w:tcPr>
-            <w:tcW w:type="dxa" w:w="2160"/>
+            <w:tcW w:type="dxa" w:w="1474"/>
+            <w:shd w:val="clear" w:color="auto" w:fill="F2F2F2"/>
           </w:tcPr>
           <w:p>
+            <w:pPr>
+              <w:jc w:val="center"/>
+            </w:pPr>
+            <w:r/>
             <w:r>
+              <w:rPr>
+                <w:b w:val="0"/>
+                <w:sz w:val="19"/>
+              </w:rPr>
               <w:t>Texto corto</w:t>
             </w:r>
           </w:p>
         </w:tc>
         <w:tc>
           <w:tcPr>
-            <w:tcW w:type="dxa" w:w="2160"/>
+            <w:tcW w:type="dxa" w:w="1304"/>
+            <w:shd w:val="clear" w:color="auto" w:fill="F2F2F2"/>
           </w:tcPr>
           <w:p>
+            <w:pPr>
+              <w:jc w:val="center"/>
+            </w:pPr>
             <w:r>
+              <w:rPr>
+                <w:b/>
+              </w:rPr>
+            </w:r>
+            <w:r>
+              <w:rPr>
+                <w:b w:val="0"/>
+                <w:sz w:val="19"/>
+              </w:rPr>
               <w:t>Sí</w:t>
             </w:r>
           </w:p>
@@ -236,40 +976,73 @@
       <w:tr>
         <w:tc>
           <w:tcPr>
-            <w:tcW w:type="dxa" w:w="2160"/>
+            <w:tcW w:type="dxa" w:w="624"/>
           </w:tcPr>
           <w:p>
+            <w:pPr>
+              <w:jc w:val="center"/>
+            </w:pPr>
+            <w:r/>
             <w:r>
+              <w:rPr>
+                <w:b w:val="0"/>
+                <w:sz w:val="19"/>
+              </w:rPr>
               <w:t>3</w:t>
             </w:r>
           </w:p>
         </w:tc>
         <w:tc>
           <w:tcPr>
-            <w:tcW w:type="dxa" w:w="2160"/>
+            <w:tcW w:type="dxa" w:w="6236"/>
           </w:tcPr>
           <w:p>
+            <w:r/>
             <w:r>
+              <w:rPr>
+                <w:b w:val="0"/>
+                <w:sz w:val="19"/>
+              </w:rPr>
               <w:t>Cargo del entrevistado</w:t>
             </w:r>
           </w:p>
         </w:tc>
         <w:tc>
           <w:tcPr>
-            <w:tcW w:type="dxa" w:w="2160"/>
+            <w:tcW w:type="dxa" w:w="1474"/>
           </w:tcPr>
           <w:p>
+            <w:pPr>
+              <w:jc w:val="center"/>
+            </w:pPr>
+            <w:r/>
             <w:r>
+              <w:rPr>
+                <w:b w:val="0"/>
+                <w:sz w:val="19"/>
+              </w:rPr>
               <w:t>Texto corto</w:t>
             </w:r>
           </w:p>
         </w:tc>
         <w:tc>
           <w:tcPr>
-            <w:tcW w:type="dxa" w:w="2160"/>
+            <w:tcW w:type="dxa" w:w="1304"/>
           </w:tcPr>
           <w:p>
+            <w:pPr>
+              <w:jc w:val="center"/>
+            </w:pPr>
             <w:r>
+              <w:rPr>
+                <w:b/>
+              </w:rPr>
+            </w:r>
+            <w:r>
+              <w:rPr>
+                <w:b w:val="0"/>
+                <w:sz w:val="19"/>
+              </w:rPr>
               <w:t>Sí</w:t>
             </w:r>
           </w:p>
@@ -278,40 +1051,77 @@
       <w:tr>
         <w:tc>
           <w:tcPr>
-            <w:tcW w:type="dxa" w:w="2160"/>
+            <w:tcW w:type="dxa" w:w="624"/>
+            <w:shd w:val="clear" w:color="auto" w:fill="F2F2F2"/>
           </w:tcPr>
           <w:p>
+            <w:pPr>
+              <w:jc w:val="center"/>
+            </w:pPr>
+            <w:r/>
             <w:r>
+              <w:rPr>
+                <w:b w:val="0"/>
+                <w:sz w:val="19"/>
+              </w:rPr>
               <w:t>4</w:t>
             </w:r>
           </w:p>
         </w:tc>
         <w:tc>
           <w:tcPr>
-            <w:tcW w:type="dxa" w:w="2160"/>
+            <w:tcW w:type="dxa" w:w="6236"/>
+            <w:shd w:val="clear" w:color="auto" w:fill="F2F2F2"/>
           </w:tcPr>
           <w:p>
+            <w:r/>
             <w:r>
-              <w:t>Gerencia o departamento</w:t>
+              <w:rPr>
+                <w:b w:val="0"/>
+                <w:sz w:val="19"/>
+              </w:rPr>
+              <w:t>Gerencia o departamento al que pertenece</w:t>
             </w:r>
           </w:p>
         </w:tc>
         <w:tc>
           <w:tcPr>
-            <w:tcW w:type="dxa" w:w="2160"/>
+            <w:tcW w:type="dxa" w:w="1474"/>
+            <w:shd w:val="clear" w:color="auto" w:fill="F2F2F2"/>
           </w:tcPr>
           <w:p>
+            <w:pPr>
+              <w:jc w:val="center"/>
+            </w:pPr>
+            <w:r/>
             <w:r>
+              <w:rPr>
+                <w:b w:val="0"/>
+                <w:sz w:val="19"/>
+              </w:rPr>
               <w:t>Texto corto</w:t>
             </w:r>
           </w:p>
         </w:tc>
         <w:tc>
           <w:tcPr>
-            <w:tcW w:type="dxa" w:w="2160"/>
+            <w:tcW w:type="dxa" w:w="1304"/>
+            <w:shd w:val="clear" w:color="auto" w:fill="F2F2F2"/>
           </w:tcPr>
           <w:p>
+            <w:pPr>
+              <w:jc w:val="center"/>
+            </w:pPr>
             <w:r>
+              <w:rPr>
+                <w:b/>
+              </w:rPr>
+            </w:r>
+            <w:r>
+              <w:rPr>
+                <w:b w:val="0"/>
+                <w:sz w:val="19"/>
+              </w:rPr>
               <w:t>Sí</w:t>
             </w:r>
           </w:p>
@@ -320,40 +1130,73 @@
       <w:tr>
         <w:tc>
           <w:tcPr>
-            <w:tcW w:type="dxa" w:w="2160"/>
+            <w:tcW w:type="dxa" w:w="624"/>
           </w:tcPr>
           <w:p>
+            <w:pPr>
+              <w:jc w:val="center"/>
+            </w:pPr>
+            <w:r/>
             <w:r>
+              <w:rPr>
+                <w:b w:val="0"/>
+                <w:sz w:val="19"/>
+              </w:rPr>
               <w:t>5</w:t>
             </w:r>
           </w:p>
         </w:tc>
         <w:tc>
           <w:tcPr>
-            <w:tcW w:type="dxa" w:w="2160"/>
+            <w:tcW w:type="dxa" w:w="6236"/>
           </w:tcPr>
           <w:p>
+            <w:r/>
             <w:r>
-              <w:t>Proceso que representa</w:t>
+              <w:rPr>
+                <w:b w:val="0"/>
+                <w:sz w:val="19"/>
+              </w:rPr>
+              <w:t>Nombre del proceso que representa</w:t>
             </w:r>
           </w:p>
         </w:tc>
         <w:tc>
           <w:tcPr>
-            <w:tcW w:type="dxa" w:w="2160"/>
+            <w:tcW w:type="dxa" w:w="1474"/>
           </w:tcPr>
           <w:p>
+            <w:pPr>
+              <w:jc w:val="center"/>
+            </w:pPr>
+            <w:r/>
             <w:r>
+              <w:rPr>
+                <w:b w:val="0"/>
+                <w:sz w:val="19"/>
+              </w:rPr>
               <w:t>Texto corto</w:t>
             </w:r>
           </w:p>
         </w:tc>
         <w:tc>
           <w:tcPr>
-            <w:tcW w:type="dxa" w:w="2160"/>
+            <w:tcW w:type="dxa" w:w="1304"/>
           </w:tcPr>
           <w:p>
+            <w:pPr>
+              <w:jc w:val="center"/>
+            </w:pPr>
             <w:r>
+              <w:rPr>
+                <w:b/>
+              </w:rPr>
+            </w:r>
+            <w:r>
+              <w:rPr>
+                <w:b w:val="0"/>
+                <w:sz w:val="19"/>
+              </w:rPr>
               <w:t>Sí</w:t>
             </w:r>
           </w:p>
@@ -362,40 +1205,77 @@
       <w:tr>
         <w:tc>
           <w:tcPr>
-            <w:tcW w:type="dxa" w:w="2160"/>
+            <w:tcW w:type="dxa" w:w="624"/>
+            <w:shd w:val="clear" w:color="auto" w:fill="F2F2F2"/>
           </w:tcPr>
           <w:p>
+            <w:pPr>
+              <w:jc w:val="center"/>
+            </w:pPr>
+            <w:r/>
             <w:r>
+              <w:rPr>
+                <w:b w:val="0"/>
+                <w:sz w:val="19"/>
+              </w:rPr>
               <w:t>6</w:t>
             </w:r>
           </w:p>
         </w:tc>
         <w:tc>
           <w:tcPr>
-            <w:tcW w:type="dxa" w:w="2160"/>
+            <w:tcW w:type="dxa" w:w="6236"/>
+            <w:shd w:val="clear" w:color="auto" w:fill="F2F2F2"/>
           </w:tcPr>
           <w:p>
+            <w:r/>
             <w:r>
-              <w:t>Detalle los departamentos que participan o intervienen en el proceso y sus principales responsabilidades.</w:t>
+              <w:rPr>
+                <w:b w:val="0"/>
+                <w:sz w:val="19"/>
+              </w:rPr>
+              <w:t>¿Qué departamentos participan en el proceso y cuáles son sus principales responsabilidades?</w:t>
             </w:r>
           </w:p>
         </w:tc>
         <w:tc>
           <w:tcPr>
-            <w:tcW w:type="dxa" w:w="2160"/>
+            <w:tcW w:type="dxa" w:w="1474"/>
+            <w:shd w:val="clear" w:color="auto" w:fill="F2F2F2"/>
           </w:tcPr>
           <w:p>
+            <w:pPr>
+              <w:jc w:val="center"/>
+            </w:pPr>
+            <w:r/>
             <w:r>
+              <w:rPr>
+                <w:b w:val="0"/>
+                <w:sz w:val="19"/>
+              </w:rPr>
               <w:t>Texto largo</w:t>
             </w:r>
           </w:p>
         </w:tc>
         <w:tc>
           <w:tcPr>
-            <w:tcW w:type="dxa" w:w="2160"/>
+            <w:tcW w:type="dxa" w:w="1304"/>
+            <w:shd w:val="clear" w:color="auto" w:fill="F2F2F2"/>
           </w:tcPr>
           <w:p>
+            <w:pPr>
+              <w:jc w:val="center"/>
+            </w:pPr>
             <w:r>
+              <w:rPr>
+                <w:b/>
+              </w:rPr>
+            </w:r>
+            <w:r>
+              <w:rPr>
+                <w:b w:val="0"/>
+                <w:sz w:val="19"/>
+              </w:rPr>
               <w:t>Sí</w:t>
             </w:r>
           </w:p>
@@ -404,40 +1284,73 @@
       <w:tr>
         <w:tc>
           <w:tcPr>
-            <w:tcW w:type="dxa" w:w="2160"/>
+            <w:tcW w:type="dxa" w:w="624"/>
           </w:tcPr>
           <w:p>
+            <w:pPr>
+              <w:jc w:val="center"/>
+            </w:pPr>
+            <w:r/>
             <w:r>
+              <w:rPr>
+                <w:b w:val="0"/>
+                <w:sz w:val="19"/>
+              </w:rPr>
               <w:t>7</w:t>
             </w:r>
           </w:p>
         </w:tc>
         <w:tc>
           <w:tcPr>
-            <w:tcW w:type="dxa" w:w="2160"/>
+            <w:tcW w:type="dxa" w:w="6236"/>
           </w:tcPr>
           <w:p>
+            <w:r/>
             <w:r>
-              <w:t>Describa la amenaza que podría ocasionar la interrupción del proceso.</w:t>
+              <w:rPr>
+                <w:b w:val="0"/>
+                <w:sz w:val="19"/>
+              </w:rPr>
+              <w:t>¿Qué amenaza podría ocasionar la interrupción del proceso? (Ejemplo: falla tecnológica, cibe...</w:t>
             </w:r>
           </w:p>
         </w:tc>
         <w:tc>
           <w:tcPr>
-            <w:tcW w:type="dxa" w:w="2160"/>
+            <w:tcW w:type="dxa" w:w="1474"/>
           </w:tcPr>
           <w:p>
+            <w:pPr>
+              <w:jc w:val="center"/>
+            </w:pPr>
+            <w:r/>
             <w:r>
+              <w:rPr>
+                <w:b w:val="0"/>
+                <w:sz w:val="19"/>
+              </w:rPr>
               <w:t>Texto largo</w:t>
             </w:r>
           </w:p>
         </w:tc>
         <w:tc>
           <w:tcPr>
-            <w:tcW w:type="dxa" w:w="2160"/>
+            <w:tcW w:type="dxa" w:w="1304"/>
           </w:tcPr>
           <w:p>
+            <w:pPr>
+              <w:jc w:val="center"/>
+            </w:pPr>
             <w:r>
+              <w:rPr>
+                <w:b/>
+              </w:rPr>
+            </w:r>
+            <w:r>
+              <w:rPr>
+                <w:b w:val="0"/>
+                <w:sz w:val="19"/>
+              </w:rPr>
               <w:t>Sí</w:t>
             </w:r>
           </w:p>
@@ -446,40 +1359,77 @@
       <w:tr>
         <w:tc>
           <w:tcPr>
-            <w:tcW w:type="dxa" w:w="2160"/>
+            <w:tcW w:type="dxa" w:w="624"/>
+            <w:shd w:val="clear" w:color="auto" w:fill="F2F2F2"/>
           </w:tcPr>
           <w:p>
+            <w:pPr>
+              <w:jc w:val="center"/>
+            </w:pPr>
+            <w:r/>
             <w:r>
+              <w:rPr>
+                <w:b w:val="0"/>
+                <w:sz w:val="19"/>
+              </w:rPr>
               <w:t>8</w:t>
             </w:r>
           </w:p>
         </w:tc>
         <w:tc>
           <w:tcPr>
-            <w:tcW w:type="dxa" w:w="2160"/>
+            <w:tcW w:type="dxa" w:w="6236"/>
+            <w:shd w:val="clear" w:color="auto" w:fill="F2F2F2"/>
           </w:tcPr>
           <w:p>
+            <w:r/>
             <w:r>
-              <w:t>Describa el riesgo que podría materializarse si el proceso sufre una interrupción.</w:t>
+              <w:rPr>
+                <w:b w:val="0"/>
+                <w:sz w:val="19"/>
+              </w:rPr>
+              <w:t>¿Qué riesgo podría materializarse si el proceso se interrumpe?</w:t>
             </w:r>
           </w:p>
         </w:tc>
         <w:tc>
           <w:tcPr>
-            <w:tcW w:type="dxa" w:w="2160"/>
+            <w:tcW w:type="dxa" w:w="1474"/>
+            <w:shd w:val="clear" w:color="auto" w:fill="F2F2F2"/>
           </w:tcPr>
           <w:p>
+            <w:pPr>
+              <w:jc w:val="center"/>
+            </w:pPr>
+            <w:r/>
             <w:r>
+              <w:rPr>
+                <w:b w:val="0"/>
+                <w:sz w:val="19"/>
+              </w:rPr>
               <w:t>Texto largo</w:t>
             </w:r>
           </w:p>
         </w:tc>
         <w:tc>
           <w:tcPr>
-            <w:tcW w:type="dxa" w:w="2160"/>
+            <w:tcW w:type="dxa" w:w="1304"/>
+            <w:shd w:val="clear" w:color="auto" w:fill="F2F2F2"/>
           </w:tcPr>
           <w:p>
+            <w:pPr>
+              <w:jc w:val="center"/>
+            </w:pPr>
             <w:r>
+              <w:rPr>
+                <w:b/>
+              </w:rPr>
+            </w:r>
+            <w:r>
+              <w:rPr>
+                <w:b w:val="0"/>
+                <w:sz w:val="19"/>
+              </w:rPr>
               <w:t>Sí</w:t>
             </w:r>
           </w:p>
@@ -488,40 +1438,73 @@
       <w:tr>
         <w:tc>
           <w:tcPr>
-            <w:tcW w:type="dxa" w:w="2160"/>
+            <w:tcW w:type="dxa" w:w="624"/>
           </w:tcPr>
           <w:p>
+            <w:pPr>
+              <w:jc w:val="center"/>
+            </w:pPr>
+            <w:r/>
             <w:r>
+              <w:rPr>
+                <w:b w:val="0"/>
+                <w:sz w:val="19"/>
+              </w:rPr>
               <w:t>9</w:t>
             </w:r>
           </w:p>
         </w:tc>
         <w:tc>
           <w:tcPr>
-            <w:tcW w:type="dxa" w:w="2160"/>
+            <w:tcW w:type="dxa" w:w="6236"/>
           </w:tcPr>
           <w:p>
+            <w:r/>
             <w:r>
-              <w:t>Severidad del impacto financiero ante una interrupción del proceso</w:t>
+              <w:rPr>
+                <w:b w:val="0"/>
+                <w:sz w:val="19"/>
+              </w:rPr>
+              <w:t>Impacto financiero: ¿qué severidad tendría una interrupción del proceso?</w:t>
             </w:r>
           </w:p>
         </w:tc>
         <w:tc>
           <w:tcPr>
-            <w:tcW w:type="dxa" w:w="2160"/>
+            <w:tcW w:type="dxa" w:w="1474"/>
           </w:tcPr>
           <w:p>
+            <w:pPr>
+              <w:jc w:val="center"/>
+            </w:pPr>
+            <w:r/>
             <w:r>
+              <w:rPr>
+                <w:b w:val="0"/>
+                <w:sz w:val="19"/>
+              </w:rPr>
               <w:t>Opción</w:t>
             </w:r>
           </w:p>
         </w:tc>
         <w:tc>
           <w:tcPr>
-            <w:tcW w:type="dxa" w:w="2160"/>
+            <w:tcW w:type="dxa" w:w="1304"/>
           </w:tcPr>
           <w:p>
+            <w:pPr>
+              <w:jc w:val="center"/>
+            </w:pPr>
             <w:r>
+              <w:rPr>
+                <w:b/>
+              </w:rPr>
+            </w:r>
+            <w:r>
+              <w:rPr>
+                <w:b w:val="0"/>
+                <w:sz w:val="19"/>
+              </w:rPr>
               <w:t>Sí</w:t>
             </w:r>
           </w:p>
@@ -530,40 +1513,77 @@
       <w:tr>
         <w:tc>
           <w:tcPr>
-            <w:tcW w:type="dxa" w:w="2160"/>
+            <w:tcW w:type="dxa" w:w="624"/>
+            <w:shd w:val="clear" w:color="auto" w:fill="F2F2F2"/>
           </w:tcPr>
           <w:p>
+            <w:pPr>
+              <w:jc w:val="center"/>
+            </w:pPr>
+            <w:r/>
             <w:r>
+              <w:rPr>
+                <w:b w:val="0"/>
+                <w:sz w:val="19"/>
+              </w:rPr>
               <w:t>10</w:t>
             </w:r>
           </w:p>
         </w:tc>
         <w:tc>
           <w:tcPr>
-            <w:tcW w:type="dxa" w:w="2160"/>
+            <w:tcW w:type="dxa" w:w="6236"/>
+            <w:shd w:val="clear" w:color="auto" w:fill="F2F2F2"/>
           </w:tcPr>
           <w:p>
+            <w:r/>
             <w:r>
-              <w:t>Severidad del impacto operacional ante una interrupción del proceso</w:t>
+              <w:rPr>
+                <w:b w:val="0"/>
+                <w:sz w:val="19"/>
+              </w:rPr>
+              <w:t>Impacto operacional: ¿qué severidad tendría una interrupción del proceso?</w:t>
             </w:r>
           </w:p>
         </w:tc>
         <w:tc>
           <w:tcPr>
-            <w:tcW w:type="dxa" w:w="2160"/>
+            <w:tcW w:type="dxa" w:w="1474"/>
+            <w:shd w:val="clear" w:color="auto" w:fill="F2F2F2"/>
           </w:tcPr>
           <w:p>
+            <w:pPr>
+              <w:jc w:val="center"/>
+            </w:pPr>
+            <w:r/>
             <w:r>
+              <w:rPr>
+                <w:b w:val="0"/>
+                <w:sz w:val="19"/>
+              </w:rPr>
               <w:t>Opción</w:t>
             </w:r>
           </w:p>
         </w:tc>
         <w:tc>
           <w:tcPr>
-            <w:tcW w:type="dxa" w:w="2160"/>
+            <w:tcW w:type="dxa" w:w="1304"/>
+            <w:shd w:val="clear" w:color="auto" w:fill="F2F2F2"/>
           </w:tcPr>
           <w:p>
+            <w:pPr>
+              <w:jc w:val="center"/>
+            </w:pPr>
             <w:r>
+              <w:rPr>
+                <w:b/>
+              </w:rPr>
+            </w:r>
+            <w:r>
+              <w:rPr>
+                <w:b w:val="0"/>
+                <w:sz w:val="19"/>
+              </w:rPr>
               <w:t>Sí</w:t>
             </w:r>
           </w:p>
@@ -572,40 +1592,73 @@
       <w:tr>
         <w:tc>
           <w:tcPr>
-            <w:tcW w:type="dxa" w:w="2160"/>
+            <w:tcW w:type="dxa" w:w="624"/>
           </w:tcPr>
           <w:p>
+            <w:pPr>
+              <w:jc w:val="center"/>
+            </w:pPr>
+            <w:r/>
             <w:r>
+              <w:rPr>
+                <w:b w:val="0"/>
+                <w:sz w:val="19"/>
+              </w:rPr>
               <w:t>11</w:t>
             </w:r>
           </w:p>
         </w:tc>
         <w:tc>
           <w:tcPr>
-            <w:tcW w:type="dxa" w:w="2160"/>
+            <w:tcW w:type="dxa" w:w="6236"/>
           </w:tcPr>
           <w:p>
+            <w:r/>
             <w:r>
-              <w:t>Severidad del impacto legal ante una interrupción del proceso</w:t>
+              <w:rPr>
+                <w:b w:val="0"/>
+                <w:sz w:val="19"/>
+              </w:rPr>
+              <w:t>Impacto legal o regulatorio: ¿qué severidad tendría una interrupción del proceso?</w:t>
             </w:r>
           </w:p>
         </w:tc>
         <w:tc>
           <w:tcPr>
-            <w:tcW w:type="dxa" w:w="2160"/>
+            <w:tcW w:type="dxa" w:w="1474"/>
           </w:tcPr>
           <w:p>
+            <w:pPr>
+              <w:jc w:val="center"/>
+            </w:pPr>
+            <w:r/>
             <w:r>
+              <w:rPr>
+                <w:b w:val="0"/>
+                <w:sz w:val="19"/>
+              </w:rPr>
               <w:t>Opción</w:t>
             </w:r>
           </w:p>
         </w:tc>
         <w:tc>
           <w:tcPr>
-            <w:tcW w:type="dxa" w:w="2160"/>
+            <w:tcW w:type="dxa" w:w="1304"/>
           </w:tcPr>
           <w:p>
+            <w:pPr>
+              <w:jc w:val="center"/>
+            </w:pPr>
             <w:r>
+              <w:rPr>
+                <w:b/>
+              </w:rPr>
+            </w:r>
+            <w:r>
+              <w:rPr>
+                <w:b w:val="0"/>
+                <w:sz w:val="19"/>
+              </w:rPr>
               <w:t>Sí</w:t>
             </w:r>
           </w:p>
@@ -614,40 +1667,77 @@
       <w:tr>
         <w:tc>
           <w:tcPr>
-            <w:tcW w:type="dxa" w:w="2160"/>
+            <w:tcW w:type="dxa" w:w="624"/>
+            <w:shd w:val="clear" w:color="auto" w:fill="F2F2F2"/>
           </w:tcPr>
           <w:p>
+            <w:pPr>
+              <w:jc w:val="center"/>
+            </w:pPr>
+            <w:r/>
             <w:r>
+              <w:rPr>
+                <w:b w:val="0"/>
+                <w:sz w:val="19"/>
+              </w:rPr>
               <w:t>12</w:t>
             </w:r>
           </w:p>
         </w:tc>
         <w:tc>
           <w:tcPr>
-            <w:tcW w:type="dxa" w:w="2160"/>
+            <w:tcW w:type="dxa" w:w="6236"/>
+            <w:shd w:val="clear" w:color="auto" w:fill="F2F2F2"/>
           </w:tcPr>
           <w:p>
+            <w:r/>
             <w:r>
-              <w:t>Severidad del impacto reputacional ante una interrupción del proceso</w:t>
+              <w:rPr>
+                <w:b w:val="0"/>
+                <w:sz w:val="19"/>
+              </w:rPr>
+              <w:t>Impacto reputacional: ¿qué severidad tendría una interrupción del proceso?</w:t>
             </w:r>
           </w:p>
         </w:tc>
         <w:tc>
           <w:tcPr>
-            <w:tcW w:type="dxa" w:w="2160"/>
+            <w:tcW w:type="dxa" w:w="1474"/>
+            <w:shd w:val="clear" w:color="auto" w:fill="F2F2F2"/>
           </w:tcPr>
           <w:p>
+            <w:pPr>
+              <w:jc w:val="center"/>
+            </w:pPr>
+            <w:r/>
             <w:r>
+              <w:rPr>
+                <w:b w:val="0"/>
+                <w:sz w:val="19"/>
+              </w:rPr>
               <w:t>Opción</w:t>
             </w:r>
           </w:p>
         </w:tc>
         <w:tc>
           <w:tcPr>
-            <w:tcW w:type="dxa" w:w="2160"/>
+            <w:tcW w:type="dxa" w:w="1304"/>
+            <w:shd w:val="clear" w:color="auto" w:fill="F2F2F2"/>
           </w:tcPr>
           <w:p>
+            <w:pPr>
+              <w:jc w:val="center"/>
+            </w:pPr>
             <w:r>
+              <w:rPr>
+                <w:b/>
+              </w:rPr>
+            </w:r>
+            <w:r>
+              <w:rPr>
+                <w:b w:val="0"/>
+                <w:sz w:val="19"/>
+              </w:rPr>
               <w:t>Sí</w:t>
             </w:r>
           </w:p>
@@ -656,40 +1746,73 @@
       <w:tr>
         <w:tc>
           <w:tcPr>
-            <w:tcW w:type="dxa" w:w="2160"/>
+            <w:tcW w:type="dxa" w:w="624"/>
           </w:tcPr>
           <w:p>
+            <w:pPr>
+              <w:jc w:val="center"/>
+            </w:pPr>
+            <w:r/>
             <w:r>
+              <w:rPr>
+                <w:b w:val="0"/>
+                <w:sz w:val="19"/>
+              </w:rPr>
               <w:t>13</w:t>
             </w:r>
           </w:p>
         </w:tc>
         <w:tc>
           <w:tcPr>
-            <w:tcW w:type="dxa" w:w="2160"/>
+            <w:tcW w:type="dxa" w:w="6236"/>
           </w:tcPr>
           <w:p>
+            <w:r/>
             <w:r>
-              <w:t>Severidad del impacto en clientes ante una interrupción del proceso</w:t>
+              <w:rPr>
+                <w:b w:val="0"/>
+                <w:sz w:val="19"/>
+              </w:rPr>
+              <w:t>Impacto en clientes y asociados: ¿qué severidad tendría una interrupción del proceso?</w:t>
             </w:r>
           </w:p>
         </w:tc>
         <w:tc>
           <w:tcPr>
-            <w:tcW w:type="dxa" w:w="2160"/>
+            <w:tcW w:type="dxa" w:w="1474"/>
           </w:tcPr>
           <w:p>
+            <w:pPr>
+              <w:jc w:val="center"/>
+            </w:pPr>
+            <w:r/>
             <w:r>
+              <w:rPr>
+                <w:b w:val="0"/>
+                <w:sz w:val="19"/>
+              </w:rPr>
               <w:t>Opción</w:t>
             </w:r>
           </w:p>
         </w:tc>
         <w:tc>
           <w:tcPr>
-            <w:tcW w:type="dxa" w:w="2160"/>
+            <w:tcW w:type="dxa" w:w="1304"/>
           </w:tcPr>
           <w:p>
+            <w:pPr>
+              <w:jc w:val="center"/>
+            </w:pPr>
             <w:r>
+              <w:rPr>
+                <w:b/>
+              </w:rPr>
+            </w:r>
+            <w:r>
+              <w:rPr>
+                <w:b w:val="0"/>
+                <w:sz w:val="19"/>
+              </w:rPr>
               <w:t>Sí</w:t>
             </w:r>
           </w:p>
@@ -698,40 +1821,77 @@
       <w:tr>
         <w:tc>
           <w:tcPr>
-            <w:tcW w:type="dxa" w:w="2160"/>
+            <w:tcW w:type="dxa" w:w="624"/>
+            <w:shd w:val="clear" w:color="auto" w:fill="F2F2F2"/>
           </w:tcPr>
           <w:p>
+            <w:pPr>
+              <w:jc w:val="center"/>
+            </w:pPr>
+            <w:r/>
             <w:r>
+              <w:rPr>
+                <w:b w:val="0"/>
+                <w:sz w:val="19"/>
+              </w:rPr>
               <w:t>14</w:t>
             </w:r>
           </w:p>
         </w:tc>
         <w:tc>
           <w:tcPr>
-            <w:tcW w:type="dxa" w:w="2160"/>
+            <w:tcW w:type="dxa" w:w="6236"/>
+            <w:shd w:val="clear" w:color="auto" w:fill="F2F2F2"/>
           </w:tcPr>
           <w:p>
+            <w:r/>
             <w:r>
-              <w:t>Severidad del impacto en personas ante una interrupción del proceso</w:t>
+              <w:rPr>
+                <w:b w:val="0"/>
+                <w:sz w:val="19"/>
+              </w:rPr>
+              <w:t>Impacto en personas (colaboradores): ¿qué severidad tendría una interrupción del proceso?</w:t>
             </w:r>
           </w:p>
         </w:tc>
         <w:tc>
           <w:tcPr>
-            <w:tcW w:type="dxa" w:w="2160"/>
+            <w:tcW w:type="dxa" w:w="1474"/>
+            <w:shd w:val="clear" w:color="auto" w:fill="F2F2F2"/>
           </w:tcPr>
           <w:p>
+            <w:pPr>
+              <w:jc w:val="center"/>
+            </w:pPr>
+            <w:r/>
             <w:r>
+              <w:rPr>
+                <w:b w:val="0"/>
+                <w:sz w:val="19"/>
+              </w:rPr>
               <w:t>Opción</w:t>
             </w:r>
           </w:p>
         </w:tc>
         <w:tc>
           <w:tcPr>
-            <w:tcW w:type="dxa" w:w="2160"/>
+            <w:tcW w:type="dxa" w:w="1304"/>
+            <w:shd w:val="clear" w:color="auto" w:fill="F2F2F2"/>
           </w:tcPr>
           <w:p>
+            <w:pPr>
+              <w:jc w:val="center"/>
+            </w:pPr>
             <w:r>
+              <w:rPr>
+                <w:b/>
+              </w:rPr>
+            </w:r>
+            <w:r>
+              <w:rPr>
+                <w:b w:val="0"/>
+                <w:sz w:val="19"/>
+              </w:rPr>
               <w:t>Sí</w:t>
             </w:r>
           </w:p>
@@ -740,40 +1900,73 @@
       <w:tr>
         <w:tc>
           <w:tcPr>
-            <w:tcW w:type="dxa" w:w="2160"/>
+            <w:tcW w:type="dxa" w:w="624"/>
           </w:tcPr>
           <w:p>
+            <w:pPr>
+              <w:jc w:val="center"/>
+            </w:pPr>
+            <w:r/>
             <w:r>
+              <w:rPr>
+                <w:b w:val="0"/>
+                <w:sz w:val="19"/>
+              </w:rPr>
               <w:t>15</w:t>
             </w:r>
           </w:p>
         </w:tc>
         <w:tc>
           <w:tcPr>
-            <w:tcW w:type="dxa" w:w="2160"/>
+            <w:tcW w:type="dxa" w:w="6236"/>
           </w:tcPr>
           <w:p>
+            <w:r/>
             <w:r>
-              <w:t>Severidad del impacto en infraestructura y equipo ante una interrupción del proceso</w:t>
+              <w:rPr>
+                <w:b w:val="0"/>
+                <w:sz w:val="19"/>
+              </w:rPr>
+              <w:t>Impacto en infraestructura y equipo: ¿qué severidad tendría una interrupción del proceso?</w:t>
             </w:r>
           </w:p>
         </w:tc>
         <w:tc>
           <w:tcPr>
-            <w:tcW w:type="dxa" w:w="2160"/>
+            <w:tcW w:type="dxa" w:w="1474"/>
           </w:tcPr>
           <w:p>
+            <w:pPr>
+              <w:jc w:val="center"/>
+            </w:pPr>
+            <w:r/>
             <w:r>
+              <w:rPr>
+                <w:b w:val="0"/>
+                <w:sz w:val="19"/>
+              </w:rPr>
               <w:t>Opción</w:t>
             </w:r>
           </w:p>
         </w:tc>
         <w:tc>
           <w:tcPr>
-            <w:tcW w:type="dxa" w:w="2160"/>
+            <w:tcW w:type="dxa" w:w="1304"/>
           </w:tcPr>
           <w:p>
+            <w:pPr>
+              <w:jc w:val="center"/>
+            </w:pPr>
             <w:r>
+              <w:rPr>
+                <w:b/>
+              </w:rPr>
+            </w:r>
+            <w:r>
+              <w:rPr>
+                <w:b w:val="0"/>
+                <w:sz w:val="19"/>
+              </w:rPr>
               <w:t>Sí</w:t>
             </w:r>
           </w:p>
@@ -782,40 +1975,77 @@
       <w:tr>
         <w:tc>
           <w:tcPr>
-            <w:tcW w:type="dxa" w:w="2160"/>
+            <w:tcW w:type="dxa" w:w="624"/>
+            <w:shd w:val="clear" w:color="auto" w:fill="F2F2F2"/>
           </w:tcPr>
           <w:p>
+            <w:pPr>
+              <w:jc w:val="center"/>
+            </w:pPr>
+            <w:r/>
             <w:r>
+              <w:rPr>
+                <w:b w:val="0"/>
+                <w:sz w:val="19"/>
+              </w:rPr>
               <w:t>16</w:t>
             </w:r>
           </w:p>
         </w:tc>
         <w:tc>
           <w:tcPr>
-            <w:tcW w:type="dxa" w:w="2160"/>
+            <w:tcW w:type="dxa" w:w="6236"/>
+            <w:shd w:val="clear" w:color="auto" w:fill="F2F2F2"/>
           </w:tcPr>
           <w:p>
+            <w:r/>
             <w:r>
-              <w:t>¿El proceso se considera crítico para la continuidad de las operaciones de la Cooperativa?</w:t>
+              <w:rPr>
+                <w:b w:val="0"/>
+                <w:sz w:val="19"/>
+              </w:rPr>
+              <w:t>¿El proceso es crítico para la continuidad de las operaciones de la Cooperativa?</w:t>
             </w:r>
           </w:p>
         </w:tc>
         <w:tc>
           <w:tcPr>
-            <w:tcW w:type="dxa" w:w="2160"/>
+            <w:tcW w:type="dxa" w:w="1474"/>
+            <w:shd w:val="clear" w:color="auto" w:fill="F2F2F2"/>
           </w:tcPr>
           <w:p>
+            <w:pPr>
+              <w:jc w:val="center"/>
+            </w:pPr>
+            <w:r/>
             <w:r>
+              <w:rPr>
+                <w:b w:val="0"/>
+                <w:sz w:val="19"/>
+              </w:rPr>
               <w:t>Opción</w:t>
             </w:r>
           </w:p>
         </w:tc>
         <w:tc>
           <w:tcPr>
-            <w:tcW w:type="dxa" w:w="2160"/>
+            <w:tcW w:type="dxa" w:w="1304"/>
+            <w:shd w:val="clear" w:color="auto" w:fill="F2F2F2"/>
           </w:tcPr>
           <w:p>
+            <w:pPr>
+              <w:jc w:val="center"/>
+            </w:pPr>
             <w:r>
+              <w:rPr>
+                <w:b/>
+              </w:rPr>
+            </w:r>
+            <w:r>
+              <w:rPr>
+                <w:b w:val="0"/>
+                <w:sz w:val="19"/>
+              </w:rPr>
               <w:t>Sí</w:t>
             </w:r>
           </w:p>
@@ -824,40 +2054,73 @@
       <w:tr>
         <w:tc>
           <w:tcPr>
-            <w:tcW w:type="dxa" w:w="2160"/>
+            <w:tcW w:type="dxa" w:w="624"/>
           </w:tcPr>
           <w:p>
+            <w:pPr>
+              <w:jc w:val="center"/>
+            </w:pPr>
+            <w:r/>
             <w:r>
+              <w:rPr>
+                <w:b w:val="0"/>
+                <w:sz w:val="19"/>
+              </w:rPr>
               <w:t>17</w:t>
             </w:r>
           </w:p>
         </w:tc>
         <w:tc>
           <w:tcPr>
-            <w:tcW w:type="dxa" w:w="2160"/>
+            <w:tcW w:type="dxa" w:w="6236"/>
           </w:tcPr>
           <w:p>
+            <w:r/>
             <w:r>
-              <w:t>Describa las consecuencias que tendría la interrupción del proceso: servicios afectados, personas usuarias ...</w:t>
+              <w:rPr>
+                <w:b w:val="0"/>
+                <w:sz w:val="19"/>
+              </w:rPr>
+              <w:t>¿Qué consecuencias tendría la interrupción del proceso? Indique servicios afectados, persona...</w:t>
             </w:r>
           </w:p>
         </w:tc>
         <w:tc>
           <w:tcPr>
-            <w:tcW w:type="dxa" w:w="2160"/>
+            <w:tcW w:type="dxa" w:w="1474"/>
           </w:tcPr>
           <w:p>
+            <w:pPr>
+              <w:jc w:val="center"/>
+            </w:pPr>
+            <w:r/>
             <w:r>
+              <w:rPr>
+                <w:b w:val="0"/>
+                <w:sz w:val="19"/>
+              </w:rPr>
               <w:t>Texto largo</w:t>
             </w:r>
           </w:p>
         </w:tc>
         <w:tc>
           <w:tcPr>
-            <w:tcW w:type="dxa" w:w="2160"/>
+            <w:tcW w:type="dxa" w:w="1304"/>
           </w:tcPr>
           <w:p>
+            <w:pPr>
+              <w:jc w:val="center"/>
+            </w:pPr>
             <w:r>
+              <w:rPr>
+                <w:b/>
+              </w:rPr>
+            </w:r>
+            <w:r>
+              <w:rPr>
+                <w:b w:val="0"/>
+                <w:sz w:val="19"/>
+              </w:rPr>
               <w:t>Sí</w:t>
             </w:r>
           </w:p>
@@ -866,40 +2129,77 @@
       <w:tr>
         <w:tc>
           <w:tcPr>
-            <w:tcW w:type="dxa" w:w="2160"/>
+            <w:tcW w:type="dxa" w:w="624"/>
+            <w:shd w:val="clear" w:color="auto" w:fill="F2F2F2"/>
           </w:tcPr>
           <w:p>
+            <w:pPr>
+              <w:jc w:val="center"/>
+            </w:pPr>
+            <w:r/>
             <w:r>
+              <w:rPr>
+                <w:b w:val="0"/>
+                <w:sz w:val="19"/>
+              </w:rPr>
               <w:t>18</w:t>
             </w:r>
           </w:p>
         </w:tc>
         <w:tc>
           <w:tcPr>
-            <w:tcW w:type="dxa" w:w="2160"/>
+            <w:tcW w:type="dxa" w:w="6236"/>
+            <w:shd w:val="clear" w:color="auto" w:fill="F2F2F2"/>
           </w:tcPr>
           <w:p>
+            <w:r/>
             <w:r>
-              <w:t>¿El proceso cuenta con un mapa de procesos o documentación que permita identificar sus actividades y depend...</w:t>
+              <w:rPr>
+                <w:b w:val="0"/>
+                <w:sz w:val="19"/>
+              </w:rPr>
+              <w:t>¿El proceso cuenta con un mapa de procesos o documentación que identifique sus actividades y...</w:t>
             </w:r>
           </w:p>
         </w:tc>
         <w:tc>
           <w:tcPr>
-            <w:tcW w:type="dxa" w:w="2160"/>
+            <w:tcW w:type="dxa" w:w="1474"/>
+            <w:shd w:val="clear" w:color="auto" w:fill="F2F2F2"/>
           </w:tcPr>
           <w:p>
+            <w:pPr>
+              <w:jc w:val="center"/>
+            </w:pPr>
+            <w:r/>
             <w:r>
+              <w:rPr>
+                <w:b w:val="0"/>
+                <w:sz w:val="19"/>
+              </w:rPr>
               <w:t>Opción</w:t>
             </w:r>
           </w:p>
         </w:tc>
         <w:tc>
           <w:tcPr>
-            <w:tcW w:type="dxa" w:w="2160"/>
+            <w:tcW w:type="dxa" w:w="1304"/>
+            <w:shd w:val="clear" w:color="auto" w:fill="F2F2F2"/>
           </w:tcPr>
           <w:p>
+            <w:pPr>
+              <w:jc w:val="center"/>
+            </w:pPr>
             <w:r>
+              <w:rPr>
+                <w:b/>
+              </w:rPr>
+            </w:r>
+            <w:r>
+              <w:rPr>
+                <w:b w:val="0"/>
+                <w:sz w:val="19"/>
+              </w:rPr>
               <w:t>Sí</w:t>
             </w:r>
           </w:p>
@@ -908,40 +2208,73 @@
       <w:tr>
         <w:tc>
           <w:tcPr>
-            <w:tcW w:type="dxa" w:w="2160"/>
+            <w:tcW w:type="dxa" w:w="624"/>
           </w:tcPr>
           <w:p>
+            <w:pPr>
+              <w:jc w:val="center"/>
+            </w:pPr>
+            <w:r/>
             <w:r>
+              <w:rPr>
+                <w:b w:val="0"/>
+                <w:sz w:val="19"/>
+              </w:rPr>
               <w:t>19</w:t>
             </w:r>
           </w:p>
         </w:tc>
         <w:tc>
           <w:tcPr>
-            <w:tcW w:type="dxa" w:w="2160"/>
+            <w:tcW w:type="dxa" w:w="6236"/>
           </w:tcPr>
           <w:p>
+            <w:r/>
             <w:r>
-              <w:t>Identifique los procesos, áreas, sistemas o servicios de los que depende para operar.</w:t>
+              <w:rPr>
+                <w:b w:val="0"/>
+                <w:sz w:val="19"/>
+              </w:rPr>
+              <w:t>¿De qué procesos, áreas, sistemas o servicios depende el proceso para operar?</w:t>
             </w:r>
           </w:p>
         </w:tc>
         <w:tc>
           <w:tcPr>
-            <w:tcW w:type="dxa" w:w="2160"/>
+            <w:tcW w:type="dxa" w:w="1474"/>
           </w:tcPr>
           <w:p>
+            <w:pPr>
+              <w:jc w:val="center"/>
+            </w:pPr>
+            <w:r/>
             <w:r>
+              <w:rPr>
+                <w:b w:val="0"/>
+                <w:sz w:val="19"/>
+              </w:rPr>
               <w:t>Texto largo</w:t>
             </w:r>
           </w:p>
         </w:tc>
         <w:tc>
           <w:tcPr>
-            <w:tcW w:type="dxa" w:w="2160"/>
+            <w:tcW w:type="dxa" w:w="1304"/>
           </w:tcPr>
           <w:p>
+            <w:pPr>
+              <w:jc w:val="center"/>
+            </w:pPr>
             <w:r>
+              <w:rPr>
+                <w:b/>
+              </w:rPr>
+            </w:r>
+            <w:r>
+              <w:rPr>
+                <w:b w:val="0"/>
+                <w:sz w:val="19"/>
+              </w:rPr>
               <w:t>Sí</w:t>
             </w:r>
           </w:p>
@@ -950,40 +2283,77 @@
       <w:tr>
         <w:tc>
           <w:tcPr>
-            <w:tcW w:type="dxa" w:w="2160"/>
+            <w:tcW w:type="dxa" w:w="624"/>
+            <w:shd w:val="clear" w:color="auto" w:fill="F2F2F2"/>
           </w:tcPr>
           <w:p>
+            <w:pPr>
+              <w:jc w:val="center"/>
+            </w:pPr>
+            <w:r/>
             <w:r>
+              <w:rPr>
+                <w:b w:val="0"/>
+                <w:sz w:val="19"/>
+              </w:rPr>
               <w:t>20</w:t>
             </w:r>
           </w:p>
         </w:tc>
         <w:tc>
           <w:tcPr>
-            <w:tcW w:type="dxa" w:w="2160"/>
+            <w:tcW w:type="dxa" w:w="6236"/>
+            <w:shd w:val="clear" w:color="auto" w:fill="F2F2F2"/>
           </w:tcPr>
           <w:p>
+            <w:r/>
             <w:r>
-              <w:t>¿Existen procedimientos manuales o alternos para continuar las operaciones durante una contingencia?</w:t>
+              <w:rPr>
+                <w:b w:val="0"/>
+                <w:sz w:val="19"/>
+              </w:rPr>
+              <w:t>¿Existen procedimientos manuales o alternos para continuar operando durante una contingencia?</w:t>
             </w:r>
           </w:p>
         </w:tc>
         <w:tc>
           <w:tcPr>
-            <w:tcW w:type="dxa" w:w="2160"/>
+            <w:tcW w:type="dxa" w:w="1474"/>
+            <w:shd w:val="clear" w:color="auto" w:fill="F2F2F2"/>
           </w:tcPr>
           <w:p>
+            <w:pPr>
+              <w:jc w:val="center"/>
+            </w:pPr>
+            <w:r/>
             <w:r>
+              <w:rPr>
+                <w:b w:val="0"/>
+                <w:sz w:val="19"/>
+              </w:rPr>
               <w:t>Opción</w:t>
             </w:r>
           </w:p>
         </w:tc>
         <w:tc>
           <w:tcPr>
-            <w:tcW w:type="dxa" w:w="2160"/>
+            <w:tcW w:type="dxa" w:w="1304"/>
+            <w:shd w:val="clear" w:color="auto" w:fill="F2F2F2"/>
           </w:tcPr>
           <w:p>
+            <w:pPr>
+              <w:jc w:val="center"/>
+            </w:pPr>
             <w:r>
+              <w:rPr>
+                <w:b/>
+              </w:rPr>
+            </w:r>
+            <w:r>
+              <w:rPr>
+                <w:b w:val="0"/>
+                <w:sz w:val="19"/>
+              </w:rPr>
               <w:t>Sí</w:t>
             </w:r>
           </w:p>
@@ -992,40 +2362,69 @@
       <w:tr>
         <w:tc>
           <w:tcPr>
-            <w:tcW w:type="dxa" w:w="2160"/>
+            <w:tcW w:type="dxa" w:w="624"/>
           </w:tcPr>
           <w:p>
+            <w:pPr>
+              <w:jc w:val="center"/>
+            </w:pPr>
+            <w:r/>
             <w:r>
+              <w:rPr>
+                <w:b w:val="0"/>
+                <w:sz w:val="19"/>
+              </w:rPr>
               <w:t>21</w:t>
             </w:r>
           </w:p>
         </w:tc>
         <w:tc>
           <w:tcPr>
-            <w:tcW w:type="dxa" w:w="2160"/>
+            <w:tcW w:type="dxa" w:w="6236"/>
           </w:tcPr>
           <w:p>
+            <w:r/>
             <w:r>
-              <w:t>Describa los procedimientos manuales o alternos que podrían utilizarse durante una contingencia (por ejempl...</w:t>
+              <w:rPr>
+                <w:b w:val="0"/>
+                <w:sz w:val="19"/>
+              </w:rPr>
+              <w:t>Describa los procedimientos manuales o alternos que se utilizarían. (Ejemplo: registros manu...</w:t>
             </w:r>
           </w:p>
         </w:tc>
         <w:tc>
           <w:tcPr>
-            <w:tcW w:type="dxa" w:w="2160"/>
+            <w:tcW w:type="dxa" w:w="1474"/>
           </w:tcPr>
           <w:p>
+            <w:pPr>
+              <w:jc w:val="center"/>
+            </w:pPr>
+            <w:r/>
             <w:r>
+              <w:rPr>
+                <w:b w:val="0"/>
+                <w:sz w:val="19"/>
+              </w:rPr>
               <w:t>Texto largo</w:t>
             </w:r>
           </w:p>
         </w:tc>
         <w:tc>
           <w:tcPr>
-            <w:tcW w:type="dxa" w:w="2160"/>
+            <w:tcW w:type="dxa" w:w="1304"/>
           </w:tcPr>
           <w:p>
+            <w:pPr>
+              <w:jc w:val="center"/>
+            </w:pPr>
+            <w:r/>
             <w:r>
+              <w:rPr>
+                <w:b w:val="0"/>
+                <w:sz w:val="19"/>
+              </w:rPr>
               <w:t>No</w:t>
             </w:r>
           </w:p>
@@ -1034,40 +2433,73 @@
       <w:tr>
         <w:tc>
           <w:tcPr>
-            <w:tcW w:type="dxa" w:w="2160"/>
+            <w:tcW w:type="dxa" w:w="624"/>
+            <w:shd w:val="clear" w:color="auto" w:fill="F2F2F2"/>
           </w:tcPr>
           <w:p>
+            <w:pPr>
+              <w:jc w:val="center"/>
+            </w:pPr>
+            <w:r/>
             <w:r>
+              <w:rPr>
+                <w:b w:val="0"/>
+                <w:sz w:val="19"/>
+              </w:rPr>
               <w:t>22</w:t>
             </w:r>
           </w:p>
         </w:tc>
         <w:tc>
           <w:tcPr>
-            <w:tcW w:type="dxa" w:w="2160"/>
+            <w:tcW w:type="dxa" w:w="6236"/>
+            <w:shd w:val="clear" w:color="auto" w:fill="F2F2F2"/>
           </w:tcPr>
           <w:p>
+            <w:r/>
             <w:r>
-              <w:t>¿Qué limitaciones o dificultades podrían presentarse al utilizar estos procedimientos alternos?</w:t>
+              <w:rPr>
+                <w:b w:val="0"/>
+                <w:sz w:val="19"/>
+              </w:rPr>
+              <w:t>¿Qué limitaciones o dificultades tendrían esos procedimientos alternos?</w:t>
             </w:r>
           </w:p>
         </w:tc>
         <w:tc>
           <w:tcPr>
-            <w:tcW w:type="dxa" w:w="2160"/>
+            <w:tcW w:type="dxa" w:w="1474"/>
+            <w:shd w:val="clear" w:color="auto" w:fill="F2F2F2"/>
           </w:tcPr>
           <w:p>
+            <w:pPr>
+              <w:jc w:val="center"/>
+            </w:pPr>
+            <w:r/>
             <w:r>
+              <w:rPr>
+                <w:b w:val="0"/>
+                <w:sz w:val="19"/>
+              </w:rPr>
               <w:t>Texto largo</w:t>
             </w:r>
           </w:p>
         </w:tc>
         <w:tc>
           <w:tcPr>
-            <w:tcW w:type="dxa" w:w="2160"/>
+            <w:tcW w:type="dxa" w:w="1304"/>
+            <w:shd w:val="clear" w:color="auto" w:fill="F2F2F2"/>
           </w:tcPr>
           <w:p>
+            <w:pPr>
+              <w:jc w:val="center"/>
+            </w:pPr>
+            <w:r/>
             <w:r>
+              <w:rPr>
+                <w:b w:val="0"/>
+                <w:sz w:val="19"/>
+              </w:rPr>
               <w:t>No</w:t>
             </w:r>
           </w:p>
@@ -1076,40 +2508,73 @@
       <w:tr>
         <w:tc>
           <w:tcPr>
-            <w:tcW w:type="dxa" w:w="2160"/>
+            <w:tcW w:type="dxa" w:w="624"/>
           </w:tcPr>
           <w:p>
+            <w:pPr>
+              <w:jc w:val="center"/>
+            </w:pPr>
+            <w:r/>
             <w:r>
+              <w:rPr>
+                <w:b w:val="0"/>
+                <w:sz w:val="19"/>
+              </w:rPr>
               <w:t>23</w:t>
             </w:r>
           </w:p>
         </w:tc>
         <w:tc>
           <w:tcPr>
-            <w:tcW w:type="dxa" w:w="2160"/>
+            <w:tcW w:type="dxa" w:w="6236"/>
           </w:tcPr>
           <w:p>
+            <w:r/>
             <w:r>
-              <w:t>MTPD: ¿Cuál es el tiempo máximo que el proceso puede permanecer interrumpido antes de que los impactos sean...</w:t>
+              <w:rPr>
+                <w:b w:val="0"/>
+                <w:sz w:val="19"/>
+              </w:rPr>
+              <w:t>MTPD: ¿Cuánto tiempo puede estar interrumpido el proceso antes de que los impactos sean inac...</w:t>
             </w:r>
           </w:p>
         </w:tc>
         <w:tc>
           <w:tcPr>
-            <w:tcW w:type="dxa" w:w="2160"/>
+            <w:tcW w:type="dxa" w:w="1474"/>
           </w:tcPr>
           <w:p>
+            <w:pPr>
+              <w:jc w:val="center"/>
+            </w:pPr>
+            <w:r/>
             <w:r>
+              <w:rPr>
+                <w:b w:val="0"/>
+                <w:sz w:val="19"/>
+              </w:rPr>
               <w:t>Texto corto</w:t>
             </w:r>
           </w:p>
         </w:tc>
         <w:tc>
           <w:tcPr>
-            <w:tcW w:type="dxa" w:w="2160"/>
+            <w:tcW w:type="dxa" w:w="1304"/>
           </w:tcPr>
           <w:p>
+            <w:pPr>
+              <w:jc w:val="center"/>
+            </w:pPr>
             <w:r>
+              <w:rPr>
+                <w:b/>
+              </w:rPr>
+            </w:r>
+            <w:r>
+              <w:rPr>
+                <w:b w:val="0"/>
+                <w:sz w:val="19"/>
+              </w:rPr>
               <w:t>Sí</w:t>
             </w:r>
           </w:p>
@@ -1118,40 +2583,77 @@
       <w:tr>
         <w:tc>
           <w:tcPr>
-            <w:tcW w:type="dxa" w:w="2160"/>
+            <w:tcW w:type="dxa" w:w="624"/>
+            <w:shd w:val="clear" w:color="auto" w:fill="F2F2F2"/>
           </w:tcPr>
           <w:p>
+            <w:pPr>
+              <w:jc w:val="center"/>
+            </w:pPr>
+            <w:r/>
             <w:r>
+              <w:rPr>
+                <w:b w:val="0"/>
+                <w:sz w:val="19"/>
+              </w:rPr>
               <w:t>24</w:t>
             </w:r>
           </w:p>
         </w:tc>
         <w:tc>
           <w:tcPr>
-            <w:tcW w:type="dxa" w:w="2160"/>
+            <w:tcW w:type="dxa" w:w="6236"/>
+            <w:shd w:val="clear" w:color="auto" w:fill="F2F2F2"/>
           </w:tcPr>
           <w:p>
+            <w:r/>
             <w:r>
-              <w:t>MBCO: Durante una contingencia, ¿cuál es el nivel mínimo de servicio o capacidad operativa que debe mantene...</w:t>
+              <w:rPr>
+                <w:b w:val="0"/>
+                <w:sz w:val="19"/>
+              </w:rPr>
+              <w:t>MBCO: ¿Qué nivel mínimo de servicio debe mantenerse durante una contingencia? (Indique activ...</w:t>
             </w:r>
           </w:p>
         </w:tc>
         <w:tc>
           <w:tcPr>
-            <w:tcW w:type="dxa" w:w="2160"/>
+            <w:tcW w:type="dxa" w:w="1474"/>
+            <w:shd w:val="clear" w:color="auto" w:fill="F2F2F2"/>
           </w:tcPr>
           <w:p>
+            <w:pPr>
+              <w:jc w:val="center"/>
+            </w:pPr>
+            <w:r/>
             <w:r>
+              <w:rPr>
+                <w:b w:val="0"/>
+                <w:sz w:val="19"/>
+              </w:rPr>
               <w:t>Texto largo</w:t>
             </w:r>
           </w:p>
         </w:tc>
         <w:tc>
           <w:tcPr>
-            <w:tcW w:type="dxa" w:w="2160"/>
+            <w:tcW w:type="dxa" w:w="1304"/>
+            <w:shd w:val="clear" w:color="auto" w:fill="F2F2F2"/>
           </w:tcPr>
           <w:p>
+            <w:pPr>
+              <w:jc w:val="center"/>
+            </w:pPr>
             <w:r>
+              <w:rPr>
+                <w:b/>
+              </w:rPr>
+            </w:r>
+            <w:r>
+              <w:rPr>
+                <w:b w:val="0"/>
+                <w:sz w:val="19"/>
+              </w:rPr>
               <w:t>Sí</w:t>
             </w:r>
           </w:p>
@@ -1160,40 +2662,73 @@
       <w:tr>
         <w:tc>
           <w:tcPr>
-            <w:tcW w:type="dxa" w:w="2160"/>
+            <w:tcW w:type="dxa" w:w="624"/>
           </w:tcPr>
           <w:p>
+            <w:pPr>
+              <w:jc w:val="center"/>
+            </w:pPr>
+            <w:r/>
             <w:r>
+              <w:rPr>
+                <w:b w:val="0"/>
+                <w:sz w:val="19"/>
+              </w:rPr>
               <w:t>25</w:t>
             </w:r>
           </w:p>
         </w:tc>
         <w:tc>
           <w:tcPr>
-            <w:tcW w:type="dxa" w:w="2160"/>
+            <w:tcW w:type="dxa" w:w="6236"/>
           </w:tcPr>
           <w:p>
+            <w:r/>
             <w:r>
-              <w:t>RTO: ¿En cuánto tiempo debe restablecerse el proceso después de una interrupción? (Indique minutos, horas o...</w:t>
+              <w:rPr>
+                <w:b w:val="0"/>
+                <w:sz w:val="19"/>
+              </w:rPr>
+              <w:t>RTO: ¿En cuánto tiempo debe restablecerse el proceso después de una interrupción? (Ejemplo: ...</w:t>
             </w:r>
           </w:p>
         </w:tc>
         <w:tc>
           <w:tcPr>
-            <w:tcW w:type="dxa" w:w="2160"/>
+            <w:tcW w:type="dxa" w:w="1474"/>
           </w:tcPr>
           <w:p>
+            <w:pPr>
+              <w:jc w:val="center"/>
+            </w:pPr>
+            <w:r/>
             <w:r>
+              <w:rPr>
+                <w:b w:val="0"/>
+                <w:sz w:val="19"/>
+              </w:rPr>
               <w:t>Texto corto</w:t>
             </w:r>
           </w:p>
         </w:tc>
         <w:tc>
           <w:tcPr>
-            <w:tcW w:type="dxa" w:w="2160"/>
+            <w:tcW w:type="dxa" w:w="1304"/>
           </w:tcPr>
           <w:p>
+            <w:pPr>
+              <w:jc w:val="center"/>
+            </w:pPr>
             <w:r>
+              <w:rPr>
+                <w:b/>
+              </w:rPr>
+            </w:r>
+            <w:r>
+              <w:rPr>
+                <w:b w:val="0"/>
+                <w:sz w:val="19"/>
+              </w:rPr>
               <w:t>Sí</w:t>
             </w:r>
           </w:p>
@@ -1202,40 +2737,77 @@
       <w:tr>
         <w:tc>
           <w:tcPr>
-            <w:tcW w:type="dxa" w:w="2160"/>
+            <w:tcW w:type="dxa" w:w="624"/>
+            <w:shd w:val="clear" w:color="auto" w:fill="F2F2F2"/>
           </w:tcPr>
           <w:p>
+            <w:pPr>
+              <w:jc w:val="center"/>
+            </w:pPr>
+            <w:r/>
             <w:r>
+              <w:rPr>
+                <w:b w:val="0"/>
+                <w:sz w:val="19"/>
+              </w:rPr>
               <w:t>26</w:t>
             </w:r>
           </w:p>
         </w:tc>
         <w:tc>
           <w:tcPr>
-            <w:tcW w:type="dxa" w:w="2160"/>
+            <w:tcW w:type="dxa" w:w="6236"/>
+            <w:shd w:val="clear" w:color="auto" w:fill="F2F2F2"/>
           </w:tcPr>
           <w:p>
+            <w:r/>
             <w:r>
-              <w:t>RPO: ¿Cuál es la pérdida máxima de información, medida en tiempo, que puede tolerar el proceso? (Ejemplo: 4...</w:t>
+              <w:rPr>
+                <w:b w:val="0"/>
+                <w:sz w:val="19"/>
+              </w:rPr>
+              <w:t>RPO: ¿Cuánta información, medida en tiempo, puede perder el proceso sin consecuencias graves...</w:t>
             </w:r>
           </w:p>
         </w:tc>
         <w:tc>
           <w:tcPr>
-            <w:tcW w:type="dxa" w:w="2160"/>
+            <w:tcW w:type="dxa" w:w="1474"/>
+            <w:shd w:val="clear" w:color="auto" w:fill="F2F2F2"/>
           </w:tcPr>
           <w:p>
+            <w:pPr>
+              <w:jc w:val="center"/>
+            </w:pPr>
+            <w:r/>
             <w:r>
+              <w:rPr>
+                <w:b w:val="0"/>
+                <w:sz w:val="19"/>
+              </w:rPr>
               <w:t>Texto corto</w:t>
             </w:r>
           </w:p>
         </w:tc>
         <w:tc>
           <w:tcPr>
-            <w:tcW w:type="dxa" w:w="2160"/>
+            <w:tcW w:type="dxa" w:w="1304"/>
+            <w:shd w:val="clear" w:color="auto" w:fill="F2F2F2"/>
           </w:tcPr>
           <w:p>
+            <w:pPr>
+              <w:jc w:val="center"/>
+            </w:pPr>
             <w:r>
+              <w:rPr>
+                <w:b/>
+              </w:rPr>
+            </w:r>
+            <w:r>
+              <w:rPr>
+                <w:b w:val="0"/>
+                <w:sz w:val="19"/>
+              </w:rPr>
               <w:t>Sí</w:t>
             </w:r>
           </w:p>
@@ -1244,40 +2816,73 @@
       <w:tr>
         <w:tc>
           <w:tcPr>
-            <w:tcW w:type="dxa" w:w="2160"/>
+            <w:tcW w:type="dxa" w:w="624"/>
           </w:tcPr>
           <w:p>
+            <w:pPr>
+              <w:jc w:val="center"/>
+            </w:pPr>
+            <w:r/>
             <w:r>
+              <w:rPr>
+                <w:b w:val="0"/>
+                <w:sz w:val="19"/>
+              </w:rPr>
               <w:t>27</w:t>
             </w:r>
           </w:p>
         </w:tc>
         <w:tc>
           <w:tcPr>
-            <w:tcW w:type="dxa" w:w="2160"/>
+            <w:tcW w:type="dxa" w:w="6236"/>
           </w:tcPr>
           <w:p>
+            <w:r/>
             <w:r>
-              <w:t>Actualmente, ¿cuánto tiempo tarda el área de Tecnología de la Información en restablecer los sistemas y ser...</w:t>
+              <w:rPr>
+                <w:b w:val="0"/>
+                <w:sz w:val="19"/>
+              </w:rPr>
+              <w:t>¿Cuánto tarda actualmente Tecnología de la Información en restablecer los sistemas que neces...</w:t>
             </w:r>
           </w:p>
         </w:tc>
         <w:tc>
           <w:tcPr>
-            <w:tcW w:type="dxa" w:w="2160"/>
+            <w:tcW w:type="dxa" w:w="1474"/>
           </w:tcPr>
           <w:p>
+            <w:pPr>
+              <w:jc w:val="center"/>
+            </w:pPr>
+            <w:r/>
             <w:r>
+              <w:rPr>
+                <w:b w:val="0"/>
+                <w:sz w:val="19"/>
+              </w:rPr>
               <w:t>Texto corto</w:t>
             </w:r>
           </w:p>
         </w:tc>
         <w:tc>
           <w:tcPr>
-            <w:tcW w:type="dxa" w:w="2160"/>
+            <w:tcW w:type="dxa" w:w="1304"/>
           </w:tcPr>
           <w:p>
+            <w:pPr>
+              <w:jc w:val="center"/>
+            </w:pPr>
             <w:r>
+              <w:rPr>
+                <w:b/>
+              </w:rPr>
+            </w:r>
+            <w:r>
+              <w:rPr>
+                <w:b w:val="0"/>
+                <w:sz w:val="19"/>
+              </w:rPr>
               <w:t>Sí</w:t>
             </w:r>
           </w:p>
@@ -1286,40 +2891,77 @@
       <w:tr>
         <w:tc>
           <w:tcPr>
-            <w:tcW w:type="dxa" w:w="2160"/>
+            <w:tcW w:type="dxa" w:w="624"/>
+            <w:shd w:val="clear" w:color="auto" w:fill="F2F2F2"/>
           </w:tcPr>
           <w:p>
+            <w:pPr>
+              <w:jc w:val="center"/>
+            </w:pPr>
+            <w:r/>
             <w:r>
+              <w:rPr>
+                <w:b w:val="0"/>
+                <w:sz w:val="19"/>
+              </w:rPr>
               <w:t>28</w:t>
             </w:r>
           </w:p>
         </w:tc>
         <w:tc>
           <w:tcPr>
-            <w:tcW w:type="dxa" w:w="2160"/>
+            <w:tcW w:type="dxa" w:w="6236"/>
+            <w:shd w:val="clear" w:color="auto" w:fill="F2F2F2"/>
           </w:tcPr>
           <w:p>
+            <w:r/>
             <w:r>
-              <w:t>¿Cada cuánto tiempo se realiza el respaldo de la información utilizada por este proceso?</w:t>
+              <w:rPr>
+                <w:b w:val="0"/>
+                <w:sz w:val="19"/>
+              </w:rPr>
+              <w:t>¿Cada cuánto se respalda la información que utiliza el proceso?</w:t>
             </w:r>
           </w:p>
         </w:tc>
         <w:tc>
           <w:tcPr>
-            <w:tcW w:type="dxa" w:w="2160"/>
+            <w:tcW w:type="dxa" w:w="1474"/>
+            <w:shd w:val="clear" w:color="auto" w:fill="F2F2F2"/>
           </w:tcPr>
           <w:p>
+            <w:pPr>
+              <w:jc w:val="center"/>
+            </w:pPr>
+            <w:r/>
             <w:r>
+              <w:rPr>
+                <w:b w:val="0"/>
+                <w:sz w:val="19"/>
+              </w:rPr>
               <w:t>Opción</w:t>
             </w:r>
           </w:p>
         </w:tc>
         <w:tc>
           <w:tcPr>
-            <w:tcW w:type="dxa" w:w="2160"/>
+            <w:tcW w:type="dxa" w:w="1304"/>
+            <w:shd w:val="clear" w:color="auto" w:fill="F2F2F2"/>
           </w:tcPr>
           <w:p>
+            <w:pPr>
+              <w:jc w:val="center"/>
+            </w:pPr>
             <w:r>
+              <w:rPr>
+                <w:b/>
+              </w:rPr>
+            </w:r>
+            <w:r>
+              <w:rPr>
+                <w:b w:val="0"/>
+                <w:sz w:val="19"/>
+              </w:rPr>
               <w:t>Sí</w:t>
             </w:r>
           </w:p>
@@ -1328,40 +2970,73 @@
       <w:tr>
         <w:tc>
           <w:tcPr>
-            <w:tcW w:type="dxa" w:w="2160"/>
+            <w:tcW w:type="dxa" w:w="624"/>
           </w:tcPr>
           <w:p>
+            <w:pPr>
+              <w:jc w:val="center"/>
+            </w:pPr>
+            <w:r/>
             <w:r>
+              <w:rPr>
+                <w:b w:val="0"/>
+                <w:sz w:val="19"/>
+              </w:rPr>
               <w:t>29</w:t>
             </w:r>
           </w:p>
         </w:tc>
         <w:tc>
           <w:tcPr>
-            <w:tcW w:type="dxa" w:w="2160"/>
+            <w:tcW w:type="dxa" w:w="6236"/>
           </w:tcPr>
           <w:p>
+            <w:r/>
             <w:r>
-              <w:t>¿Qué acciones deben ejecutarse para recuperar el proceso dentro del tiempo requerido? Indique prioridades y...</w:t>
+              <w:rPr>
+                <w:b w:val="0"/>
+                <w:sz w:val="19"/>
+              </w:rPr>
+              <w:t>¿Qué acciones deben ejecutarse para recuperar el proceso a tiempo? Indique el orden de prior...</w:t>
             </w:r>
           </w:p>
         </w:tc>
         <w:tc>
           <w:tcPr>
-            <w:tcW w:type="dxa" w:w="2160"/>
+            <w:tcW w:type="dxa" w:w="1474"/>
           </w:tcPr>
           <w:p>
+            <w:pPr>
+              <w:jc w:val="center"/>
+            </w:pPr>
+            <w:r/>
             <w:r>
+              <w:rPr>
+                <w:b w:val="0"/>
+                <w:sz w:val="19"/>
+              </w:rPr>
               <w:t>Texto largo</w:t>
             </w:r>
           </w:p>
         </w:tc>
         <w:tc>
           <w:tcPr>
-            <w:tcW w:type="dxa" w:w="2160"/>
+            <w:tcW w:type="dxa" w:w="1304"/>
           </w:tcPr>
           <w:p>
+            <w:pPr>
+              <w:jc w:val="center"/>
+            </w:pPr>
             <w:r>
+              <w:rPr>
+                <w:b/>
+              </w:rPr>
+            </w:r>
+            <w:r>
+              <w:rPr>
+                <w:b w:val="0"/>
+                <w:sz w:val="19"/>
+              </w:rPr>
               <w:t>Sí</w:t>
             </w:r>
           </w:p>
@@ -1370,40 +3045,77 @@
       <w:tr>
         <w:tc>
           <w:tcPr>
-            <w:tcW w:type="dxa" w:w="2160"/>
+            <w:tcW w:type="dxa" w:w="624"/>
+            <w:shd w:val="clear" w:color="auto" w:fill="F2F2F2"/>
           </w:tcPr>
           <w:p>
+            <w:pPr>
+              <w:jc w:val="center"/>
+            </w:pPr>
+            <w:r/>
             <w:r>
+              <w:rPr>
+                <w:b w:val="0"/>
+                <w:sz w:val="19"/>
+              </w:rPr>
               <w:t>30</w:t>
             </w:r>
           </w:p>
         </w:tc>
         <w:tc>
           <w:tcPr>
-            <w:tcW w:type="dxa" w:w="2160"/>
+            <w:tcW w:type="dxa" w:w="6236"/>
+            <w:shd w:val="clear" w:color="auto" w:fill="F2F2F2"/>
           </w:tcPr>
           <w:p>
+            <w:r/>
             <w:r>
-              <w:t>¿Qué tiempo adicional se necesitaría para recuperar la operación completa después de restablecer el servici...</w:t>
+              <w:rPr>
+                <w:b w:val="0"/>
+                <w:sz w:val="19"/>
+              </w:rPr>
+              <w:t>Después de restablecer el servicio mínimo, ¿cuánto tiempo adicional se necesita para recuper...</w:t>
             </w:r>
           </w:p>
         </w:tc>
         <w:tc>
           <w:tcPr>
-            <w:tcW w:type="dxa" w:w="2160"/>
+            <w:tcW w:type="dxa" w:w="1474"/>
+            <w:shd w:val="clear" w:color="auto" w:fill="F2F2F2"/>
           </w:tcPr>
           <w:p>
+            <w:pPr>
+              <w:jc w:val="center"/>
+            </w:pPr>
+            <w:r/>
             <w:r>
+              <w:rPr>
+                <w:b w:val="0"/>
+                <w:sz w:val="19"/>
+              </w:rPr>
               <w:t>Texto corto</w:t>
             </w:r>
           </w:p>
         </w:tc>
         <w:tc>
           <w:tcPr>
-            <w:tcW w:type="dxa" w:w="2160"/>
+            <w:tcW w:type="dxa" w:w="1304"/>
+            <w:shd w:val="clear" w:color="auto" w:fill="F2F2F2"/>
           </w:tcPr>
           <w:p>
+            <w:pPr>
+              <w:jc w:val="center"/>
+            </w:pPr>
             <w:r>
+              <w:rPr>
+                <w:b/>
+              </w:rPr>
+            </w:r>
+            <w:r>
+              <w:rPr>
+                <w:b w:val="0"/>
+                <w:sz w:val="19"/>
+              </w:rPr>
               <w:t>Sí</w:t>
             </w:r>
           </w:p>
@@ -1412,40 +3124,73 @@
       <w:tr>
         <w:tc>
           <w:tcPr>
-            <w:tcW w:type="dxa" w:w="2160"/>
+            <w:tcW w:type="dxa" w:w="624"/>
           </w:tcPr>
           <w:p>
+            <w:pPr>
+              <w:jc w:val="center"/>
+            </w:pPr>
+            <w:r/>
             <w:r>
+              <w:rPr>
+                <w:b w:val="0"/>
+                <w:sz w:val="19"/>
+              </w:rPr>
               <w:t>31</w:t>
             </w:r>
           </w:p>
         </w:tc>
         <w:tc>
           <w:tcPr>
-            <w:tcW w:type="dxa" w:w="2160"/>
+            <w:tcW w:type="dxa" w:w="6236"/>
           </w:tcPr>
           <w:p>
+            <w:r/>
             <w:r>
-              <w:t>Recursos tecnológicos: ¿Qué recursos tecnológicos necesita para mantener o recuperar el proceso? Indique ti...</w:t>
+              <w:rPr>
+                <w:b w:val="0"/>
+                <w:sz w:val="19"/>
+              </w:rPr>
+              <w:t>Recursos tecnológicos: ¿qué equipos, sistemas o accesos necesita, en qué cantidad y en cuánt...</w:t>
             </w:r>
           </w:p>
         </w:tc>
         <w:tc>
           <w:tcPr>
-            <w:tcW w:type="dxa" w:w="2160"/>
+            <w:tcW w:type="dxa" w:w="1474"/>
           </w:tcPr>
           <w:p>
+            <w:pPr>
+              <w:jc w:val="center"/>
+            </w:pPr>
+            <w:r/>
             <w:r>
+              <w:rPr>
+                <w:b w:val="0"/>
+                <w:sz w:val="19"/>
+              </w:rPr>
               <w:t>Texto largo</w:t>
             </w:r>
           </w:p>
         </w:tc>
         <w:tc>
           <w:tcPr>
-            <w:tcW w:type="dxa" w:w="2160"/>
+            <w:tcW w:type="dxa" w:w="1304"/>
           </w:tcPr>
           <w:p>
+            <w:pPr>
+              <w:jc w:val="center"/>
+            </w:pPr>
             <w:r>
+              <w:rPr>
+                <w:b/>
+              </w:rPr>
+            </w:r>
+            <w:r>
+              <w:rPr>
+                <w:b w:val="0"/>
+                <w:sz w:val="19"/>
+              </w:rPr>
               <w:t>Sí</w:t>
             </w:r>
           </w:p>
@@ -1454,40 +3199,77 @@
       <w:tr>
         <w:tc>
           <w:tcPr>
-            <w:tcW w:type="dxa" w:w="2160"/>
+            <w:tcW w:type="dxa" w:w="624"/>
+            <w:shd w:val="clear" w:color="auto" w:fill="F2F2F2"/>
           </w:tcPr>
           <w:p>
+            <w:pPr>
+              <w:jc w:val="center"/>
+            </w:pPr>
+            <w:r/>
             <w:r>
+              <w:rPr>
+                <w:b w:val="0"/>
+                <w:sz w:val="19"/>
+              </w:rPr>
               <w:t>32</w:t>
             </w:r>
           </w:p>
         </w:tc>
         <w:tc>
           <w:tcPr>
-            <w:tcW w:type="dxa" w:w="2160"/>
+            <w:tcW w:type="dxa" w:w="6236"/>
+            <w:shd w:val="clear" w:color="auto" w:fill="F2F2F2"/>
           </w:tcPr>
           <w:p>
+            <w:r/>
             <w:r>
-              <w:t>Mobiliario: ¿Qué mobiliario necesita para mantener o restablecer las operaciones y en qué cantidad?</w:t>
+              <w:rPr>
+                <w:b w:val="0"/>
+                <w:sz w:val="19"/>
+              </w:rPr>
+              <w:t>Mobiliario: ¿qué mobiliario necesita y en qué cantidad?</w:t>
             </w:r>
           </w:p>
         </w:tc>
         <w:tc>
           <w:tcPr>
-            <w:tcW w:type="dxa" w:w="2160"/>
+            <w:tcW w:type="dxa" w:w="1474"/>
+            <w:shd w:val="clear" w:color="auto" w:fill="F2F2F2"/>
           </w:tcPr>
           <w:p>
+            <w:pPr>
+              <w:jc w:val="center"/>
+            </w:pPr>
+            <w:r/>
             <w:r>
+              <w:rPr>
+                <w:b w:val="0"/>
+                <w:sz w:val="19"/>
+              </w:rPr>
               <w:t>Texto largo</w:t>
             </w:r>
           </w:p>
         </w:tc>
         <w:tc>
           <w:tcPr>
-            <w:tcW w:type="dxa" w:w="2160"/>
+            <w:tcW w:type="dxa" w:w="1304"/>
+            <w:shd w:val="clear" w:color="auto" w:fill="F2F2F2"/>
           </w:tcPr>
           <w:p>
+            <w:pPr>
+              <w:jc w:val="center"/>
+            </w:pPr>
             <w:r>
+              <w:rPr>
+                <w:b/>
+              </w:rPr>
+            </w:r>
+            <w:r>
+              <w:rPr>
+                <w:b w:val="0"/>
+                <w:sz w:val="19"/>
+              </w:rPr>
               <w:t>Sí</w:t>
             </w:r>
           </w:p>
@@ -1496,40 +3278,73 @@
       <w:tr>
         <w:tc>
           <w:tcPr>
-            <w:tcW w:type="dxa" w:w="2160"/>
+            <w:tcW w:type="dxa" w:w="624"/>
           </w:tcPr>
           <w:p>
+            <w:pPr>
+              <w:jc w:val="center"/>
+            </w:pPr>
+            <w:r/>
             <w:r>
+              <w:rPr>
+                <w:b w:val="0"/>
+                <w:sz w:val="19"/>
+              </w:rPr>
               <w:t>33</w:t>
             </w:r>
           </w:p>
         </w:tc>
         <w:tc>
           <w:tcPr>
-            <w:tcW w:type="dxa" w:w="2160"/>
+            <w:tcW w:type="dxa" w:w="6236"/>
           </w:tcPr>
           <w:p>
+            <w:r/>
             <w:r>
-              <w:t>Suministros de papelería: ¿Qué suministros necesita para operar manualmente durante una contingencia y en q...</w:t>
+              <w:rPr>
+                <w:b w:val="0"/>
+                <w:sz w:val="19"/>
+              </w:rPr>
+              <w:t>Papelería: ¿qué suministros necesita para operar manualmente y en qué cantidad?</w:t>
             </w:r>
           </w:p>
         </w:tc>
         <w:tc>
           <w:tcPr>
-            <w:tcW w:type="dxa" w:w="2160"/>
+            <w:tcW w:type="dxa" w:w="1474"/>
           </w:tcPr>
           <w:p>
+            <w:pPr>
+              <w:jc w:val="center"/>
+            </w:pPr>
+            <w:r/>
             <w:r>
+              <w:rPr>
+                <w:b w:val="0"/>
+                <w:sz w:val="19"/>
+              </w:rPr>
               <w:t>Texto largo</w:t>
             </w:r>
           </w:p>
         </w:tc>
         <w:tc>
           <w:tcPr>
-            <w:tcW w:type="dxa" w:w="2160"/>
+            <w:tcW w:type="dxa" w:w="1304"/>
           </w:tcPr>
           <w:p>
+            <w:pPr>
+              <w:jc w:val="center"/>
+            </w:pPr>
             <w:r>
+              <w:rPr>
+                <w:b/>
+              </w:rPr>
+            </w:r>
+            <w:r>
+              <w:rPr>
+                <w:b w:val="0"/>
+                <w:sz w:val="19"/>
+              </w:rPr>
               <w:t>Sí</w:t>
             </w:r>
           </w:p>
@@ -1538,40 +3353,77 @@
       <w:tr>
         <w:tc>
           <w:tcPr>
-            <w:tcW w:type="dxa" w:w="2160"/>
+            <w:tcW w:type="dxa" w:w="624"/>
+            <w:shd w:val="clear" w:color="auto" w:fill="F2F2F2"/>
           </w:tcPr>
           <w:p>
+            <w:pPr>
+              <w:jc w:val="center"/>
+            </w:pPr>
+            <w:r/>
             <w:r>
+              <w:rPr>
+                <w:b w:val="0"/>
+                <w:sz w:val="19"/>
+              </w:rPr>
               <w:t>34</w:t>
             </w:r>
           </w:p>
         </w:tc>
         <w:tc>
           <w:tcPr>
-            <w:tcW w:type="dxa" w:w="2160"/>
+            <w:tcW w:type="dxa" w:w="6236"/>
+            <w:shd w:val="clear" w:color="auto" w:fill="F2F2F2"/>
           </w:tcPr>
           <w:p>
+            <w:r/>
             <w:r>
-              <w:t>Personal requerido: ¿Qué puestos y cuántos empleados se necesitan para mantener o recuperar el proceso? Ind...</w:t>
+              <w:rPr>
+                <w:b w:val="0"/>
+                <w:sz w:val="19"/>
+              </w:rPr>
+              <w:t>Personal: ¿qué puestos y cuántas personas necesita, en qué turnos y en cuánto tiempo deben i...</w:t>
             </w:r>
           </w:p>
         </w:tc>
         <w:tc>
           <w:tcPr>
-            <w:tcW w:type="dxa" w:w="2160"/>
+            <w:tcW w:type="dxa" w:w="1474"/>
+            <w:shd w:val="clear" w:color="auto" w:fill="F2F2F2"/>
           </w:tcPr>
           <w:p>
+            <w:pPr>
+              <w:jc w:val="center"/>
+            </w:pPr>
+            <w:r/>
             <w:r>
+              <w:rPr>
+                <w:b w:val="0"/>
+                <w:sz w:val="19"/>
+              </w:rPr>
               <w:t>Texto largo</w:t>
             </w:r>
           </w:p>
         </w:tc>
         <w:tc>
           <w:tcPr>
-            <w:tcW w:type="dxa" w:w="2160"/>
+            <w:tcW w:type="dxa" w:w="1304"/>
+            <w:shd w:val="clear" w:color="auto" w:fill="F2F2F2"/>
           </w:tcPr>
           <w:p>
+            <w:pPr>
+              <w:jc w:val="center"/>
+            </w:pPr>
             <w:r>
+              <w:rPr>
+                <w:b/>
+              </w:rPr>
+            </w:r>
+            <w:r>
+              <w:rPr>
+                <w:b w:val="0"/>
+                <w:sz w:val="19"/>
+              </w:rPr>
               <w:t>Sí</w:t>
             </w:r>
           </w:p>
@@ -1580,40 +3432,73 @@
       <w:tr>
         <w:tc>
           <w:tcPr>
-            <w:tcW w:type="dxa" w:w="2160"/>
+            <w:tcW w:type="dxa" w:w="624"/>
           </w:tcPr>
           <w:p>
+            <w:pPr>
+              <w:jc w:val="center"/>
+            </w:pPr>
+            <w:r/>
             <w:r>
+              <w:rPr>
+                <w:b w:val="0"/>
+                <w:sz w:val="19"/>
+              </w:rPr>
               <w:t>35</w:t>
             </w:r>
           </w:p>
         </w:tc>
         <w:tc>
           <w:tcPr>
-            <w:tcW w:type="dxa" w:w="2160"/>
+            <w:tcW w:type="dxa" w:w="6236"/>
           </w:tcPr>
           <w:p>
+            <w:r/>
             <w:r>
-              <w:t>Otros recursos: ¿Qué recursos adicionales necesita para superar la contingencia (transporte, instalaciones ...</w:t>
+              <w:rPr>
+                <w:b w:val="0"/>
+                <w:sz w:val="19"/>
+              </w:rPr>
+              <w:t>Otros recursos: ¿qué más necesita, en qué cantidad y en cuánto tiempo? (Ejemplo: transporte,...</w:t>
             </w:r>
           </w:p>
         </w:tc>
         <w:tc>
           <w:tcPr>
-            <w:tcW w:type="dxa" w:w="2160"/>
+            <w:tcW w:type="dxa" w:w="1474"/>
           </w:tcPr>
           <w:p>
+            <w:pPr>
+              <w:jc w:val="center"/>
+            </w:pPr>
+            <w:r/>
             <w:r>
+              <w:rPr>
+                <w:b w:val="0"/>
+                <w:sz w:val="19"/>
+              </w:rPr>
               <w:t>Texto largo</w:t>
             </w:r>
           </w:p>
         </w:tc>
         <w:tc>
           <w:tcPr>
-            <w:tcW w:type="dxa" w:w="2160"/>
+            <w:tcW w:type="dxa" w:w="1304"/>
           </w:tcPr>
           <w:p>
+            <w:pPr>
+              <w:jc w:val="center"/>
+            </w:pPr>
             <w:r>
+              <w:rPr>
+                <w:b/>
+              </w:rPr>
+            </w:r>
+            <w:r>
+              <w:rPr>
+                <w:b w:val="0"/>
+                <w:sz w:val="19"/>
+              </w:rPr>
               <w:t>Sí</w:t>
             </w:r>
           </w:p>
@@ -1622,40 +3507,77 @@
       <w:tr>
         <w:tc>
           <w:tcPr>
-            <w:tcW w:type="dxa" w:w="2160"/>
+            <w:tcW w:type="dxa" w:w="624"/>
+            <w:shd w:val="clear" w:color="auto" w:fill="F2F2F2"/>
           </w:tcPr>
           <w:p>
+            <w:pPr>
+              <w:jc w:val="center"/>
+            </w:pPr>
+            <w:r/>
             <w:r>
+              <w:rPr>
+                <w:b w:val="0"/>
+                <w:sz w:val="19"/>
+              </w:rPr>
               <w:t>36</w:t>
             </w:r>
           </w:p>
         </w:tc>
         <w:tc>
           <w:tcPr>
-            <w:tcW w:type="dxa" w:w="2160"/>
+            <w:tcW w:type="dxa" w:w="6236"/>
+            <w:shd w:val="clear" w:color="auto" w:fill="F2F2F2"/>
           </w:tcPr>
           <w:p>
+            <w:r/>
             <w:r>
-              <w:t>¿Existen proveedores críticos para la continuidad del proceso?</w:t>
+              <w:rPr>
+                <w:b w:val="0"/>
+                <w:sz w:val="19"/>
+              </w:rPr>
+              <w:t>¿El proceso depende de proveedores críticos?</w:t>
             </w:r>
           </w:p>
         </w:tc>
         <w:tc>
           <w:tcPr>
-            <w:tcW w:type="dxa" w:w="2160"/>
+            <w:tcW w:type="dxa" w:w="1474"/>
+            <w:shd w:val="clear" w:color="auto" w:fill="F2F2F2"/>
           </w:tcPr>
           <w:p>
+            <w:pPr>
+              <w:jc w:val="center"/>
+            </w:pPr>
+            <w:r/>
             <w:r>
+              <w:rPr>
+                <w:b w:val="0"/>
+                <w:sz w:val="19"/>
+              </w:rPr>
               <w:t>Opción</w:t>
             </w:r>
           </w:p>
         </w:tc>
         <w:tc>
           <w:tcPr>
-            <w:tcW w:type="dxa" w:w="2160"/>
+            <w:tcW w:type="dxa" w:w="1304"/>
+            <w:shd w:val="clear" w:color="auto" w:fill="F2F2F2"/>
           </w:tcPr>
           <w:p>
+            <w:pPr>
+              <w:jc w:val="center"/>
+            </w:pPr>
             <w:r>
+              <w:rPr>
+                <w:b/>
+              </w:rPr>
+            </w:r>
+            <w:r>
+              <w:rPr>
+                <w:b w:val="0"/>
+                <w:sz w:val="19"/>
+              </w:rPr>
               <w:t>Sí</w:t>
             </w:r>
           </w:p>
@@ -1664,40 +3586,69 @@
       <w:tr>
         <w:tc>
           <w:tcPr>
-            <w:tcW w:type="dxa" w:w="2160"/>
+            <w:tcW w:type="dxa" w:w="624"/>
           </w:tcPr>
           <w:p>
+            <w:pPr>
+              <w:jc w:val="center"/>
+            </w:pPr>
+            <w:r/>
             <w:r>
+              <w:rPr>
+                <w:b w:val="0"/>
+                <w:sz w:val="19"/>
+              </w:rPr>
               <w:t>37</w:t>
             </w:r>
           </w:p>
         </w:tc>
         <w:tc>
           <w:tcPr>
-            <w:tcW w:type="dxa" w:w="2160"/>
+            <w:tcW w:type="dxa" w:w="6236"/>
           </w:tcPr>
           <w:p>
+            <w:r/>
             <w:r>
-              <w:t>Por cada proveedor crítico indique: nombre, servicio que presta, nacionalidad, tiempo máximo tolerable sin ...</w:t>
+              <w:rPr>
+                <w:b w:val="0"/>
+                <w:sz w:val="19"/>
+              </w:rPr>
+              <w:t>Para cada proveedor crítico indique, en una línea: nombre, servicio, país, tiempo máximo tol...</w:t>
             </w:r>
           </w:p>
         </w:tc>
         <w:tc>
           <w:tcPr>
-            <w:tcW w:type="dxa" w:w="2160"/>
+            <w:tcW w:type="dxa" w:w="1474"/>
           </w:tcPr>
           <w:p>
+            <w:pPr>
+              <w:jc w:val="center"/>
+            </w:pPr>
+            <w:r/>
             <w:r>
+              <w:rPr>
+                <w:b w:val="0"/>
+                <w:sz w:val="19"/>
+              </w:rPr>
               <w:t>Texto largo</w:t>
             </w:r>
           </w:p>
         </w:tc>
         <w:tc>
           <w:tcPr>
-            <w:tcW w:type="dxa" w:w="2160"/>
+            <w:tcW w:type="dxa" w:w="1304"/>
           </w:tcPr>
           <w:p>
+            <w:pPr>
+              <w:jc w:val="center"/>
+            </w:pPr>
+            <w:r/>
             <w:r>
+              <w:rPr>
+                <w:b w:val="0"/>
+                <w:sz w:val="19"/>
+              </w:rPr>
               <w:t>No</w:t>
             </w:r>
           </w:p>
@@ -1706,40 +3657,77 @@
       <w:tr>
         <w:tc>
           <w:tcPr>
-            <w:tcW w:type="dxa" w:w="2160"/>
+            <w:tcW w:type="dxa" w:w="624"/>
+            <w:shd w:val="clear" w:color="auto" w:fill="F2F2F2"/>
           </w:tcPr>
           <w:p>
+            <w:pPr>
+              <w:jc w:val="center"/>
+            </w:pPr>
+            <w:r/>
             <w:r>
+              <w:rPr>
+                <w:b w:val="0"/>
+                <w:sz w:val="19"/>
+              </w:rPr>
               <w:t>38</w:t>
             </w:r>
           </w:p>
         </w:tc>
         <w:tc>
           <w:tcPr>
-            <w:tcW w:type="dxa" w:w="2160"/>
+            <w:tcW w:type="dxa" w:w="6236"/>
+            <w:shd w:val="clear" w:color="auto" w:fill="F2F2F2"/>
           </w:tcPr>
           <w:p>
+            <w:r/>
             <w:r>
-              <w:t>¿Qué alternativas tiene el proceso si un recurso crítico o proveedor no está disponible? Describa el tiempo...</w:t>
+              <w:rPr>
+                <w:b w:val="0"/>
+                <w:sz w:val="19"/>
+              </w:rPr>
+              <w:t>Si un recurso o proveedor crítico no está disponible, ¿qué alternativa tiene el proceso, cuá...</w:t>
             </w:r>
           </w:p>
         </w:tc>
         <w:tc>
           <w:tcPr>
-            <w:tcW w:type="dxa" w:w="2160"/>
+            <w:tcW w:type="dxa" w:w="1474"/>
+            <w:shd w:val="clear" w:color="auto" w:fill="F2F2F2"/>
           </w:tcPr>
           <w:p>
+            <w:pPr>
+              <w:jc w:val="center"/>
+            </w:pPr>
+            <w:r/>
             <w:r>
+              <w:rPr>
+                <w:b w:val="0"/>
+                <w:sz w:val="19"/>
+              </w:rPr>
               <w:t>Texto largo</w:t>
             </w:r>
           </w:p>
         </w:tc>
         <w:tc>
           <w:tcPr>
-            <w:tcW w:type="dxa" w:w="2160"/>
+            <w:tcW w:type="dxa" w:w="1304"/>
+            <w:shd w:val="clear" w:color="auto" w:fill="F2F2F2"/>
           </w:tcPr>
           <w:p>
+            <w:pPr>
+              <w:jc w:val="center"/>
+            </w:pPr>
             <w:r>
+              <w:rPr>
+                <w:b/>
+              </w:rPr>
+            </w:r>
+            <w:r>
+              <w:rPr>
+                <w:b w:val="0"/>
+                <w:sz w:val="19"/>
+              </w:rPr>
               <w:t>Sí</w:t>
             </w:r>
           </w:p>
@@ -1748,40 +3736,69 @@
       <w:tr>
         <w:tc>
           <w:tcPr>
-            <w:tcW w:type="dxa" w:w="2160"/>
+            <w:tcW w:type="dxa" w:w="624"/>
           </w:tcPr>
           <w:p>
+            <w:pPr>
+              <w:jc w:val="center"/>
+            </w:pPr>
+            <w:r/>
             <w:r>
+              <w:rPr>
+                <w:b w:val="0"/>
+                <w:sz w:val="19"/>
+              </w:rPr>
               <w:t>39</w:t>
             </w:r>
           </w:p>
         </w:tc>
         <w:tc>
           <w:tcPr>
-            <w:tcW w:type="dxa" w:w="2160"/>
+            <w:tcW w:type="dxa" w:w="6236"/>
           </w:tcPr>
           <w:p>
+            <w:r/>
             <w:r>
-              <w:t>Observaciones adicionales relevantes para el análisis del impacto y la continuidad del proceso.</w:t>
+              <w:rPr>
+                <w:b w:val="0"/>
+                <w:sz w:val="19"/>
+              </w:rPr>
+              <w:t>Observaciones adicionales sobre el impacto o la continuidad del proceso</w:t>
             </w:r>
           </w:p>
         </w:tc>
         <w:tc>
           <w:tcPr>
-            <w:tcW w:type="dxa" w:w="2160"/>
+            <w:tcW w:type="dxa" w:w="1474"/>
           </w:tcPr>
           <w:p>
+            <w:pPr>
+              <w:jc w:val="center"/>
+            </w:pPr>
+            <w:r/>
             <w:r>
+              <w:rPr>
+                <w:b w:val="0"/>
+                <w:sz w:val="19"/>
+              </w:rPr>
               <w:t>Texto largo</w:t>
             </w:r>
           </w:p>
         </w:tc>
         <w:tc>
           <w:tcPr>
-            <w:tcW w:type="dxa" w:w="2160"/>
+            <w:tcW w:type="dxa" w:w="1304"/>
           </w:tcPr>
           <w:p>
+            <w:pPr>
+              <w:jc w:val="center"/>
+            </w:pPr>
+            <w:r/>
             <w:r>
+              <w:rPr>
+                <w:b w:val="0"/>
+                <w:sz w:val="19"/>
+              </w:rPr>
               <w:t>No</w:t>
             </w:r>
           </w:p>
@@ -1790,40 +3807,77 @@
       <w:tr>
         <w:tc>
           <w:tcPr>
-            <w:tcW w:type="dxa" w:w="2160"/>
+            <w:tcW w:type="dxa" w:w="624"/>
+            <w:shd w:val="clear" w:color="auto" w:fill="F2F2F2"/>
           </w:tcPr>
           <w:p>
+            <w:pPr>
+              <w:jc w:val="center"/>
+            </w:pPr>
+            <w:r/>
             <w:r>
+              <w:rPr>
+                <w:b w:val="0"/>
+                <w:sz w:val="19"/>
+              </w:rPr>
               <w:t>40</w:t>
             </w:r>
           </w:p>
         </w:tc>
         <w:tc>
           <w:tcPr>
-            <w:tcW w:type="dxa" w:w="2160"/>
+            <w:tcW w:type="dxa" w:w="6236"/>
+            <w:shd w:val="clear" w:color="auto" w:fill="F2F2F2"/>
           </w:tcPr>
           <w:p>
+            <w:r/>
             <w:r>
-              <w:t>Nombre de la persona que elabora la entrevista</w:t>
+              <w:rPr>
+                <w:b w:val="0"/>
+                <w:sz w:val="19"/>
+              </w:rPr>
+              <w:t>Nombre de la persona que realiza la entrevista</w:t>
             </w:r>
           </w:p>
         </w:tc>
         <w:tc>
           <w:tcPr>
-            <w:tcW w:type="dxa" w:w="2160"/>
+            <w:tcW w:type="dxa" w:w="1474"/>
+            <w:shd w:val="clear" w:color="auto" w:fill="F2F2F2"/>
           </w:tcPr>
           <w:p>
+            <w:pPr>
+              <w:jc w:val="center"/>
+            </w:pPr>
+            <w:r/>
             <w:r>
+              <w:rPr>
+                <w:b w:val="0"/>
+                <w:sz w:val="19"/>
+              </w:rPr>
               <w:t>Texto corto</w:t>
             </w:r>
           </w:p>
         </w:tc>
         <w:tc>
           <w:tcPr>
-            <w:tcW w:type="dxa" w:w="2160"/>
+            <w:tcW w:type="dxa" w:w="1304"/>
+            <w:shd w:val="clear" w:color="auto" w:fill="F2F2F2"/>
           </w:tcPr>
           <w:p>
+            <w:pPr>
+              <w:jc w:val="center"/>
+            </w:pPr>
             <w:r>
+              <w:rPr>
+                <w:b/>
+              </w:rPr>
+            </w:r>
+            <w:r>
+              <w:rPr>
+                <w:b w:val="0"/>
+                <w:sz w:val="19"/>
+              </w:rPr>
               <w:t>Sí</w:t>
             </w:r>
           </w:p>
@@ -1832,40 +3886,73 @@
       <w:tr>
         <w:tc>
           <w:tcPr>
-            <w:tcW w:type="dxa" w:w="2160"/>
+            <w:tcW w:type="dxa" w:w="624"/>
           </w:tcPr>
           <w:p>
+            <w:pPr>
+              <w:jc w:val="center"/>
+            </w:pPr>
+            <w:r/>
             <w:r>
+              <w:rPr>
+                <w:b w:val="0"/>
+                <w:sz w:val="19"/>
+              </w:rPr>
               <w:t>41</w:t>
             </w:r>
           </w:p>
         </w:tc>
         <w:tc>
           <w:tcPr>
-            <w:tcW w:type="dxa" w:w="2160"/>
+            <w:tcW w:type="dxa" w:w="6236"/>
           </w:tcPr>
           <w:p>
+            <w:r/>
             <w:r>
+              <w:rPr>
+                <w:b w:val="0"/>
+                <w:sz w:val="19"/>
+              </w:rPr>
               <w:t>Nombre del líder del proceso que valida la información</w:t>
             </w:r>
           </w:p>
         </w:tc>
         <w:tc>
           <w:tcPr>
-            <w:tcW w:type="dxa" w:w="2160"/>
+            <w:tcW w:type="dxa" w:w="1474"/>
           </w:tcPr>
           <w:p>
+            <w:pPr>
+              <w:jc w:val="center"/>
+            </w:pPr>
+            <w:r/>
             <w:r>
+              <w:rPr>
+                <w:b w:val="0"/>
+                <w:sz w:val="19"/>
+              </w:rPr>
               <w:t>Texto corto</w:t>
             </w:r>
           </w:p>
         </w:tc>
         <w:tc>
           <w:tcPr>
-            <w:tcW w:type="dxa" w:w="2160"/>
+            <w:tcW w:type="dxa" w:w="1304"/>
           </w:tcPr>
           <w:p>
+            <w:pPr>
+              <w:jc w:val="center"/>
+            </w:pPr>
             <w:r>
+              <w:rPr>
+                <w:b/>
+              </w:rPr>
+            </w:r>
+            <w:r>
+              <w:rPr>
+                <w:b w:val="0"/>
+                <w:sz w:val="19"/>
+              </w:rPr>
               <w:t>Sí</w:t>
             </w:r>
           </w:p>
@@ -1874,40 +3961,77 @@
       <w:tr>
         <w:tc>
           <w:tcPr>
-            <w:tcW w:type="dxa" w:w="2160"/>
+            <w:tcW w:type="dxa" w:w="624"/>
+            <w:shd w:val="clear" w:color="auto" w:fill="F2F2F2"/>
           </w:tcPr>
           <w:p>
+            <w:pPr>
+              <w:jc w:val="center"/>
+            </w:pPr>
+            <w:r/>
             <w:r>
+              <w:rPr>
+                <w:b w:val="0"/>
+                <w:sz w:val="19"/>
+              </w:rPr>
               <w:t>42</w:t>
             </w:r>
           </w:p>
         </w:tc>
         <w:tc>
           <w:tcPr>
-            <w:tcW w:type="dxa" w:w="2160"/>
+            <w:tcW w:type="dxa" w:w="6236"/>
+            <w:shd w:val="clear" w:color="auto" w:fill="F2F2F2"/>
           </w:tcPr>
           <w:p>
+            <w:r/>
             <w:r>
-              <w:t>¿Confirma que la información proporcionada refleja las condiciones actuales del proceso según su conocimien...</w:t>
+              <w:rPr>
+                <w:b w:val="0"/>
+                <w:sz w:val="19"/>
+              </w:rPr>
+              <w:t>¿Confirma que la información refleja las condiciones actuales del proceso?</w:t>
             </w:r>
           </w:p>
         </w:tc>
         <w:tc>
           <w:tcPr>
-            <w:tcW w:type="dxa" w:w="2160"/>
+            <w:tcW w:type="dxa" w:w="1474"/>
+            <w:shd w:val="clear" w:color="auto" w:fill="F2F2F2"/>
           </w:tcPr>
           <w:p>
+            <w:pPr>
+              <w:jc w:val="center"/>
+            </w:pPr>
+            <w:r/>
             <w:r>
+              <w:rPr>
+                <w:b w:val="0"/>
+                <w:sz w:val="19"/>
+              </w:rPr>
               <w:t>Opción</w:t>
             </w:r>
           </w:p>
         </w:tc>
         <w:tc>
           <w:tcPr>
-            <w:tcW w:type="dxa" w:w="2160"/>
+            <w:tcW w:type="dxa" w:w="1304"/>
+            <w:shd w:val="clear" w:color="auto" w:fill="F2F2F2"/>
           </w:tcPr>
           <w:p>
+            <w:pPr>
+              <w:jc w:val="center"/>
+            </w:pPr>
             <w:r>
+              <w:rPr>
+                <w:b/>
+              </w:rPr>
+            </w:r>
+            <w:r>
+              <w:rPr>
+                <w:b w:val="0"/>
+                <w:sz w:val="19"/>
+              </w:rPr>
               <w:t>Sí</w:t>
             </w:r>
           </w:p>
@@ -1916,49 +4040,343 @@
       <w:tr>
         <w:tc>
           <w:tcPr>
-            <w:tcW w:type="dxa" w:w="2160"/>
+            <w:tcW w:type="dxa" w:w="624"/>
           </w:tcPr>
           <w:p>
+            <w:pPr>
+              <w:jc w:val="center"/>
+            </w:pPr>
+            <w:r/>
             <w:r>
+              <w:rPr>
+                <w:b w:val="0"/>
+                <w:sz w:val="19"/>
+              </w:rPr>
               <w:t>43</w:t>
             </w:r>
           </w:p>
         </w:tc>
         <w:tc>
           <w:tcPr>
-            <w:tcW w:type="dxa" w:w="2160"/>
+            <w:tcW w:type="dxa" w:w="6236"/>
           </w:tcPr>
           <w:p>
+            <w:r/>
             <w:r>
-              <w:t>Si respondió No, explique qué información debe corregirse o validarse y qué área debe confirmar los datos.</w:t>
+              <w:rPr>
+                <w:b w:val="0"/>
+                <w:sz w:val="19"/>
+              </w:rPr>
+              <w:t>¿Qué información debe corregirse o validarse y qué área debe confirmarla?</w:t>
             </w:r>
           </w:p>
         </w:tc>
         <w:tc>
           <w:tcPr>
-            <w:tcW w:type="dxa" w:w="2160"/>
+            <w:tcW w:type="dxa" w:w="1474"/>
           </w:tcPr>
           <w:p>
+            <w:pPr>
+              <w:jc w:val="center"/>
+            </w:pPr>
+            <w:r/>
             <w:r>
+              <w:rPr>
+                <w:b w:val="0"/>
+                <w:sz w:val="19"/>
+              </w:rPr>
               <w:t>Texto largo</w:t>
             </w:r>
           </w:p>
         </w:tc>
         <w:tc>
           <w:tcPr>
-            <w:tcW w:type="dxa" w:w="2160"/>
+            <w:tcW w:type="dxa" w:w="1304"/>
           </w:tcPr>
           <w:p>
+            <w:pPr>
+              <w:jc w:val="center"/>
+            </w:pPr>
+            <w:r/>
             <w:r>
+              <w:rPr>
+                <w:b w:val="0"/>
+                <w:sz w:val="19"/>
+              </w:rPr>
               <w:t>No</w:t>
             </w:r>
           </w:p>
         </w:tc>
       </w:tr>
     </w:tbl>
+    <w:p>
+      <w:pPr>
+        <w:pStyle w:val="Heading1"/>
+      </w:pPr>
+      <w:r>
+        <w:rPr>
+          <w:color w:val="1F3864"/>
+        </w:rPr>
+        <w:t>5. Escala de severidad sugerida (validar antes de usar)</w:t>
+      </w:r>
+    </w:p>
+    <w:p>
+      <w:r>
+        <w:t>Forms no muestra definiciones junto a la escala. Si desea que todos los entrevistados interpreten igual los niveles, puede agregar esta referencia en la descripción de la Sección 2, una vez validada por el Departamento de Administración de Riesgos:</w:t>
+      </w:r>
+    </w:p>
+    <w:tbl>
+      <w:tblPr>
+        <w:tblStyle w:val="TableGrid"/>
+        <w:tblW w:type="auto" w:w="0"/>
+        <w:jc w:val="center"/>
+        <w:tblLayout w:type="fixed"/>
+        <w:tblLook w:firstColumn="1" w:firstRow="1" w:lastColumn="0" w:lastRow="0" w:noHBand="0" w:noVBand="1" w:val="04A0"/>
+      </w:tblPr>
+      <w:tblGrid>
+        <w:gridCol w:w="1701"/>
+        <w:gridCol w:w="7937"/>
+      </w:tblGrid>
+      <w:tr>
+        <w:tc>
+          <w:tcPr>
+            <w:tcW w:type="dxa" w:w="1701"/>
+            <w:shd w:val="clear" w:color="auto" w:fill="1F3864"/>
+          </w:tcPr>
+          <w:p>
+            <w:r/>
+            <w:r>
+              <w:rPr>
+                <w:b/>
+                <w:color w:val="FFFFFF"/>
+                <w:sz w:val="19"/>
+              </w:rPr>
+              <w:t>Nivel</w:t>
+            </w:r>
+          </w:p>
+        </w:tc>
+        <w:tc>
+          <w:tcPr>
+            <w:tcW w:type="dxa" w:w="7937"/>
+            <w:shd w:val="clear" w:color="auto" w:fill="1F3864"/>
+          </w:tcPr>
+          <w:p>
+            <w:r/>
+            <w:r>
+              <w:rPr>
+                <w:b/>
+                <w:color w:val="FFFFFF"/>
+                <w:sz w:val="19"/>
+              </w:rPr>
+              <w:t>Referencia</w:t>
+            </w:r>
+          </w:p>
+        </w:tc>
+      </w:tr>
+      <w:tr>
+        <w:tc>
+          <w:tcPr>
+            <w:tcW w:type="dxa" w:w="1701"/>
+          </w:tcPr>
+          <w:p>
+            <w:r/>
+            <w:r>
+              <w:rPr>
+                <w:b w:val="0"/>
+                <w:sz w:val="19"/>
+              </w:rPr>
+              <w:t>Muy alto</w:t>
+            </w:r>
+          </w:p>
+        </w:tc>
+        <w:tc>
+          <w:tcPr>
+            <w:tcW w:type="dxa" w:w="7937"/>
+          </w:tcPr>
+          <w:p>
+            <w:r/>
+            <w:r>
+              <w:rPr>
+                <w:b w:val="0"/>
+                <w:sz w:val="19"/>
+              </w:rPr>
+              <w:t>Afectación grave y generalizada; compromete la operación, el cumplimiento o la reputación de la Cooperativa.</w:t>
+            </w:r>
+          </w:p>
+        </w:tc>
+      </w:tr>
+      <w:tr>
+        <w:tc>
+          <w:tcPr>
+            <w:tcW w:type="dxa" w:w="1701"/>
+            <w:shd w:val="clear" w:color="auto" w:fill="F2F2F2"/>
+          </w:tcPr>
+          <w:p>
+            <w:r/>
+            <w:r>
+              <w:rPr>
+                <w:b w:val="0"/>
+                <w:sz w:val="19"/>
+              </w:rPr>
+              <w:t>Alto</w:t>
+            </w:r>
+          </w:p>
+        </w:tc>
+        <w:tc>
+          <w:tcPr>
+            <w:tcW w:type="dxa" w:w="7937"/>
+            <w:shd w:val="clear" w:color="auto" w:fill="F2F2F2"/>
+          </w:tcPr>
+          <w:p>
+            <w:r/>
+            <w:r>
+              <w:rPr>
+                <w:b w:val="0"/>
+                <w:sz w:val="19"/>
+              </w:rPr>
+              <w:t>Afectación significativa en varias áreas o servicios; requiere atención inmediata de la alta dirección.</w:t>
+            </w:r>
+          </w:p>
+        </w:tc>
+      </w:tr>
+      <w:tr>
+        <w:tc>
+          <w:tcPr>
+            <w:tcW w:type="dxa" w:w="1701"/>
+          </w:tcPr>
+          <w:p>
+            <w:r/>
+            <w:r>
+              <w:rPr>
+                <w:b w:val="0"/>
+                <w:sz w:val="19"/>
+              </w:rPr>
+              <w:t>Moderado</w:t>
+            </w:r>
+          </w:p>
+        </w:tc>
+        <w:tc>
+          <w:tcPr>
+            <w:tcW w:type="dxa" w:w="7937"/>
+          </w:tcPr>
+          <w:p>
+            <w:r/>
+            <w:r>
+              <w:rPr>
+                <w:b w:val="0"/>
+                <w:sz w:val="19"/>
+              </w:rPr>
+              <w:t>Afectación notable pero controlable con los recursos del área.</w:t>
+            </w:r>
+          </w:p>
+        </w:tc>
+      </w:tr>
+      <w:tr>
+        <w:tc>
+          <w:tcPr>
+            <w:tcW w:type="dxa" w:w="1701"/>
+            <w:shd w:val="clear" w:color="auto" w:fill="F2F2F2"/>
+          </w:tcPr>
+          <w:p>
+            <w:r/>
+            <w:r>
+              <w:rPr>
+                <w:b w:val="0"/>
+                <w:sz w:val="19"/>
+              </w:rPr>
+              <w:t>Bajo</w:t>
+            </w:r>
+          </w:p>
+        </w:tc>
+        <w:tc>
+          <w:tcPr>
+            <w:tcW w:type="dxa" w:w="7937"/>
+            <w:shd w:val="clear" w:color="auto" w:fill="F2F2F2"/>
+          </w:tcPr>
+          <w:p>
+            <w:r/>
+            <w:r>
+              <w:rPr>
+                <w:b w:val="0"/>
+                <w:sz w:val="19"/>
+              </w:rPr>
+              <w:t>Afectación menor y localizada; se resuelve en la operación normal.</w:t>
+            </w:r>
+          </w:p>
+        </w:tc>
+      </w:tr>
+      <w:tr>
+        <w:tc>
+          <w:tcPr>
+            <w:tcW w:type="dxa" w:w="1701"/>
+          </w:tcPr>
+          <w:p>
+            <w:r/>
+            <w:r>
+              <w:rPr>
+                <w:b w:val="0"/>
+                <w:sz w:val="19"/>
+              </w:rPr>
+              <w:t>Muy bajo</w:t>
+            </w:r>
+          </w:p>
+        </w:tc>
+        <w:tc>
+          <w:tcPr>
+            <w:tcW w:type="dxa" w:w="7937"/>
+          </w:tcPr>
+          <w:p>
+            <w:r/>
+            <w:r>
+              <w:rPr>
+                <w:b w:val="0"/>
+                <w:sz w:val="19"/>
+              </w:rPr>
+              <w:t>Afectación mínima o nula.</w:t>
+            </w:r>
+          </w:p>
+        </w:tc>
+      </w:tr>
+    </w:tbl>
+    <w:p>
+      <w:pPr>
+        <w:pStyle w:val="Heading1"/>
+      </w:pPr>
+      <w:r>
+        <w:rPr>
+          <w:color w:val="1F3864"/>
+        </w:rPr>
+        <w:t>6. Antes de compartir</w:t>
+      </w:r>
+    </w:p>
+    <w:p>
+      <w:r>
+        <w:t>☐  Configuración &gt; Solo personas de la organización pueden responder.</w:t>
+      </w:r>
+    </w:p>
+    <w:p>
+      <w:r>
+        <w:t>☐  Configuración &gt; Registrar nombre (opcional, si se desea identificar al entrevistado).</w:t>
+      </w:r>
+    </w:p>
+    <w:p>
+      <w:r>
+        <w:t>☐  Envíe una respuesta de prueba y verifique la ramificación de las preguntas 20, 36 y 42.</w:t>
+      </w:r>
+    </w:p>
+    <w:p>
+      <w:r>
+        <w:t>☐  Revise que los ejemplos de tiempos (MTPD, RTO, RPO) no se lean como metas aprobadas.</w:t>
+      </w:r>
+    </w:p>
+    <w:p>
+      <w:r>
+        <w:t>☐  Elimine la respuesta de prueba en la pestaña Respuestas.</w:t>
+      </w:r>
+    </w:p>
     <w:sectPr>
       <w:pgSz w:w="12240" w:h="15840"/>
-      <w:pgMar w:top="1440" w:right="1800" w:bottom="1440" w:left="1800" w:header="720" w:footer="720" w:gutter="0"/>
+      <w:pgMar w:top="1134" w:right="1134" w:bottom="1134" w:left="1134" w:header="720" w:footer="720" w:gutter="0"/>
       <w:cols w:space="720"/>
       <w:docGrid w:linePitch="360"/>
     </w:sectPr>
@@ -2331,7 +4749,7 @@
     <w:rsid w:val="00FC693F"/>
     <w:rPr>
       <w:rFonts w:ascii="Calibri" w:hAnsi="Calibri"/>
-      <w:sz w:val="22"/>
+      <w:sz w:val="21"/>
     </w:rPr>
   </w:style>
   <w:style w:type="paragraph" w:styleId="Header">

</xml_diff>

<commit_message>
Reduce BIA interview to 25 questions using a mix of Forms question types
Co-Authored-By: Claude Opus 5.5 <noreply@anthropic.com>
Claude-Session: https://claude.ai/code/session_01DNF5smNv24Ekp3ruMBbrsQ
</commit_message>
<xml_diff>
--- a/bia-comedica/BIA_COMEDICA_Guia_Configuracion_Forms.docx
+++ b/bia-comedica/BIA_COMEDICA_Guia_Configuracion_Forms.docx
@@ -117,7 +117,7 @@
         <w:pStyle w:val="ListNumber"/>
       </w:pPr>
       <w:r>
-        <w:t>Revise la vista previa: deben aparecer 6 secciones y 43 preguntas. Luego seleccione Iniciar revisión o Confirmar.</w:t>
+        <w:t>Revise la vista previa: deben aparecer 6 secciones y 25 preguntas. Luego seleccione Iniciar revisión o Confirmar.</w:t>
       </w:r>
     </w:p>
     <w:p>
@@ -128,7 +128,12 @@
         <w:rPr>
           <w:color w:val="1F3864"/>
         </w:rPr>
-        <w:t>2. Ajustes que Forms no hace solo</w:t>
+        <w:t>2. Cambiar el tipo de pregunta</w:t>
+      </w:r>
+    </w:p>
+    <w:p>
+      <w:r>
+        <w:t>La importación crea preguntas de texto y de opción. Las siguientes deben ajustarse para usar todos los tipos de Forms:</w:t>
       </w:r>
     </w:p>
     <w:tbl>
@@ -140,14 +145,14 @@
         <w:tblLook w:firstColumn="1" w:firstRow="1" w:lastColumn="0" w:lastRow="0" w:noHBand="0" w:noVBand="1" w:val="04A0"/>
       </w:tblPr>
       <w:tblGrid>
-        <w:gridCol w:w="2154"/>
-        <w:gridCol w:w="2835"/>
-        <w:gridCol w:w="4649"/>
+        <w:gridCol w:w="1361"/>
+        <w:gridCol w:w="1928"/>
+        <w:gridCol w:w="6350"/>
       </w:tblGrid>
       <w:tr>
         <w:tc>
           <w:tcPr>
-            <w:tcW w:type="dxa" w:w="2154"/>
+            <w:tcW w:type="dxa" w:w="1361"/>
             <w:shd w:val="clear" w:color="auto" w:fill="1F3864"/>
           </w:tcPr>
           <w:p>
@@ -158,13 +163,13 @@
                 <w:color w:val="FFFFFF"/>
                 <w:sz w:val="19"/>
               </w:rPr>
-              <w:t>Ajuste</w:t>
+              <w:t>Pregunta</w:t>
             </w:r>
           </w:p>
         </w:tc>
         <w:tc>
           <w:tcPr>
-            <w:tcW w:type="dxa" w:w="2835"/>
+            <w:tcW w:type="dxa" w:w="1928"/>
             <w:shd w:val="clear" w:color="auto" w:fill="1F3864"/>
           </w:tcPr>
           <w:p>
@@ -175,13 +180,13 @@
                 <w:color w:val="FFFFFF"/>
                 <w:sz w:val="19"/>
               </w:rPr>
-              <w:t>Dónde</w:t>
+              <w:t>Tipo final</w:t>
             </w:r>
           </w:p>
         </w:tc>
         <w:tc>
           <w:tcPr>
-            <w:tcW w:type="dxa" w:w="4649"/>
+            <w:tcW w:type="dxa" w:w="6350"/>
             <w:shd w:val="clear" w:color="auto" w:fill="1F3864"/>
           </w:tcPr>
           <w:p>
@@ -192,7 +197,7 @@
                 <w:color w:val="FFFFFF"/>
                 <w:sz w:val="19"/>
               </w:rPr>
-              <w:t>Cómo</w:t>
+              <w:t>Cómo configurarla</w:t>
             </w:r>
           </w:p>
         </w:tc>
@@ -200,7 +205,7 @@
       <w:tr>
         <w:tc>
           <w:tcPr>
-            <w:tcW w:type="dxa" w:w="2154"/>
+            <w:tcW w:type="dxa" w:w="1361"/>
           </w:tcPr>
           <w:p>
             <w:r/>
@@ -209,13 +214,13 @@
                 <w:b w:val="0"/>
                 <w:sz w:val="19"/>
               </w:rPr>
-              <w:t>Marcar obligatorias</w:t>
+              <w:t>1</w:t>
             </w:r>
           </w:p>
         </w:tc>
         <w:tc>
           <w:tcPr>
-            <w:tcW w:type="dxa" w:w="2835"/>
+            <w:tcW w:type="dxa" w:w="1928"/>
           </w:tcPr>
           <w:p>
             <w:r/>
@@ -224,110 +229,13 @@
                 <w:b w:val="0"/>
                 <w:sz w:val="19"/>
               </w:rPr>
-              <w:t>Preguntas con 'Sí' en la tabla de la sección 4</w:t>
+              <w:t>Fecha</w:t>
             </w:r>
           </w:p>
         </w:tc>
         <w:tc>
           <w:tcPr>
-            <w:tcW w:type="dxa" w:w="4649"/>
-          </w:tcPr>
-          <w:p>
-            <w:r/>
-            <w:r>
-              <w:rPr>
-                <w:b w:val="0"/>
-                <w:sz w:val="19"/>
-              </w:rPr>
-              <w:t>Active el interruptor Obligatorio en cada pregunta.</w:t>
-            </w:r>
-          </w:p>
-        </w:tc>
-      </w:tr>
-      <w:tr>
-        <w:tc>
-          <w:tcPr>
-            <w:tcW w:type="dxa" w:w="2154"/>
-            <w:shd w:val="clear" w:color="auto" w:fill="F2F2F2"/>
-          </w:tcPr>
-          <w:p>
-            <w:r/>
-            <w:r>
-              <w:rPr>
-                <w:b w:val="0"/>
-                <w:sz w:val="19"/>
-              </w:rPr>
-              <w:t>Respuesta larga</w:t>
-            </w:r>
-          </w:p>
-        </w:tc>
-        <w:tc>
-          <w:tcPr>
-            <w:tcW w:type="dxa" w:w="2835"/>
-            <w:shd w:val="clear" w:color="auto" w:fill="F2F2F2"/>
-          </w:tcPr>
-          <w:p>
-            <w:r/>
-            <w:r>
-              <w:rPr>
-                <w:b w:val="0"/>
-                <w:sz w:val="19"/>
-              </w:rPr>
-              <w:t>Preguntas de tipo Texto largo</w:t>
-            </w:r>
-          </w:p>
-        </w:tc>
-        <w:tc>
-          <w:tcPr>
-            <w:tcW w:type="dxa" w:w="4649"/>
-            <w:shd w:val="clear" w:color="auto" w:fill="F2F2F2"/>
-          </w:tcPr>
-          <w:p>
-            <w:r/>
-            <w:r>
-              <w:rPr>
-                <w:b w:val="0"/>
-                <w:sz w:val="19"/>
-              </w:rPr>
-              <w:t>Active Respuesta larga (Forms las importa como texto corto).</w:t>
-            </w:r>
-          </w:p>
-        </w:tc>
-      </w:tr>
-      <w:tr>
-        <w:tc>
-          <w:tcPr>
-            <w:tcW w:type="dxa" w:w="2154"/>
-          </w:tcPr>
-          <w:p>
-            <w:r/>
-            <w:r>
-              <w:rPr>
-                <w:b w:val="0"/>
-                <w:sz w:val="19"/>
-              </w:rPr>
-              <w:t>Pregunta de fecha</w:t>
-            </w:r>
-          </w:p>
-        </w:tc>
-        <w:tc>
-          <w:tcPr>
-            <w:tcW w:type="dxa" w:w="2835"/>
-          </w:tcPr>
-          <w:p>
-            <w:r/>
-            <w:r>
-              <w:rPr>
-                <w:b w:val="0"/>
-                <w:sz w:val="19"/>
-              </w:rPr>
-              <w:t>Pregunta 1</w:t>
-            </w:r>
-          </w:p>
-        </w:tc>
-        <w:tc>
-          <w:tcPr>
-            <w:tcW w:type="dxa" w:w="4649"/>
+            <w:tcW w:type="dxa" w:w="6350"/>
           </w:tcPr>
           <w:p>
             <w:r/>
@@ -344,7 +252,7 @@
       <w:tr>
         <w:tc>
           <w:tcPr>
-            <w:tcW w:type="dxa" w:w="2154"/>
+            <w:tcW w:type="dxa" w:w="1361"/>
             <w:shd w:val="clear" w:color="auto" w:fill="F2F2F2"/>
           </w:tcPr>
           <w:p>
@@ -354,13 +262,13 @@
                 <w:b w:val="0"/>
                 <w:sz w:val="19"/>
               </w:rPr>
-              <w:t>Opción Otro</w:t>
+              <w:t>5 y 20</w:t>
             </w:r>
           </w:p>
         </w:tc>
         <w:tc>
           <w:tcPr>
-            <w:tcW w:type="dxa" w:w="2835"/>
+            <w:tcW w:type="dxa" w:w="1928"/>
             <w:shd w:val="clear" w:color="auto" w:fill="F2F2F2"/>
           </w:tcPr>
           <w:p>
@@ -370,13 +278,13 @@
                 <w:b w:val="0"/>
                 <w:sz w:val="19"/>
               </w:rPr>
-              <w:t>Pregunta 28 (respaldos)</w:t>
+              <w:t>Varias respuestas</w:t>
             </w:r>
           </w:p>
         </w:tc>
         <w:tc>
           <w:tcPr>
-            <w:tcW w:type="dxa" w:w="4649"/>
+            <w:tcW w:type="dxa" w:w="6350"/>
             <w:shd w:val="clear" w:color="auto" w:fill="F2F2F2"/>
           </w:tcPr>
           <w:p>
@@ -386,7 +294,7 @@
                 <w:b w:val="0"/>
                 <w:sz w:val="19"/>
               </w:rPr>
-              <w:t>Seleccione Agregar opción "Otro".</w:t>
+              <w:t>Active Varias respuestas. En la 5, active también Agregar opción Otro.</w:t>
             </w:r>
           </w:p>
         </w:tc>
@@ -394,7 +302,7 @@
       <w:tr>
         <w:tc>
           <w:tcPr>
-            <w:tcW w:type="dxa" w:w="2154"/>
+            <w:tcW w:type="dxa" w:w="1361"/>
           </w:tcPr>
           <w:p>
             <w:r/>
@@ -403,13 +311,13 @@
                 <w:b w:val="0"/>
                 <w:sz w:val="19"/>
               </w:rPr>
-              <w:t>Lista de gerencias (opcional)</w:t>
+              <w:t>7</w:t>
             </w:r>
           </w:p>
         </w:tc>
         <w:tc>
           <w:tcPr>
-            <w:tcW w:type="dxa" w:w="2835"/>
+            <w:tcW w:type="dxa" w:w="1928"/>
           </w:tcPr>
           <w:p>
             <w:r/>
@@ -418,13 +326,13 @@
                 <w:b w:val="0"/>
                 <w:sz w:val="19"/>
               </w:rPr>
-              <w:t>Pregunta 4</w:t>
+              <w:t>Likert</w:t>
             </w:r>
           </w:p>
         </w:tc>
         <w:tc>
           <w:tcPr>
-            <w:tcW w:type="dxa" w:w="4649"/>
+            <w:tcW w:type="dxa" w:w="6350"/>
           </w:tcPr>
           <w:p>
             <w:r/>
@@ -433,7 +341,7 @@
                 <w:b w:val="0"/>
                 <w:sz w:val="19"/>
               </w:rPr>
-              <w:t>Cambie a Opción y active Lista desplegable con las gerencias.</w:t>
+              <w:t>Elimine la pregunta importada y cree una Likert. Opciones: Muy alto, Alto, Moderado, Bajo, Muy bajo. Declaraciones: Financiero, Operacional, Legal o regulatorio, Reputacional, Clientes y asociados, Personas, Infraestructura y equipo.</w:t>
             </w:r>
           </w:p>
         </w:tc>
@@ -441,7 +349,7 @@
       <w:tr>
         <w:tc>
           <w:tcPr>
-            <w:tcW w:type="dxa" w:w="2154"/>
+            <w:tcW w:type="dxa" w:w="1361"/>
             <w:shd w:val="clear" w:color="auto" w:fill="F2F2F2"/>
           </w:tcPr>
           <w:p>
@@ -451,13 +359,13 @@
                 <w:b w:val="0"/>
                 <w:sz w:val="19"/>
               </w:rPr>
-              <w:t>Likert (opcional)</w:t>
+              <w:t>18</w:t>
             </w:r>
           </w:p>
         </w:tc>
         <w:tc>
           <w:tcPr>
-            <w:tcW w:type="dxa" w:w="2835"/>
+            <w:tcW w:type="dxa" w:w="1928"/>
             <w:shd w:val="clear" w:color="auto" w:fill="F2F2F2"/>
           </w:tcPr>
           <w:p>
@@ -467,13 +375,13 @@
                 <w:b w:val="0"/>
                 <w:sz w:val="19"/>
               </w:rPr>
-              <w:t>Preguntas 9 a 15</w:t>
+              <w:t>Lista desplegable</w:t>
             </w:r>
           </w:p>
         </w:tc>
         <w:tc>
           <w:tcPr>
-            <w:tcW w:type="dxa" w:w="4649"/>
+            <w:tcW w:type="dxa" w:w="6350"/>
             <w:shd w:val="clear" w:color="auto" w:fill="F2F2F2"/>
           </w:tcPr>
           <w:p>
@@ -483,7 +391,201 @@
                 <w:b w:val="0"/>
                 <w:sz w:val="19"/>
               </w:rPr>
-              <w:t>Cree una pregunta Likert con las 7 declaraciones y la escala Muy alto a Muy bajo; luego elimine las 7 preguntas.</w:t>
+              <w:t>En el menú ··· de la pregunta, active Lista desplegable.</w:t>
+            </w:r>
+          </w:p>
+        </w:tc>
+      </w:tr>
+      <w:tr>
+        <w:tc>
+          <w:tcPr>
+            <w:tcW w:type="dxa" w:w="1361"/>
+          </w:tcPr>
+          <w:p>
+            <w:r/>
+            <w:r>
+              <w:rPr>
+                <w:b w:val="0"/>
+                <w:sz w:val="19"/>
+              </w:rPr>
+              <w:t>24</w:t>
+            </w:r>
+          </w:p>
+        </w:tc>
+        <w:tc>
+          <w:tcPr>
+            <w:tcW w:type="dxa" w:w="1928"/>
+          </w:tcPr>
+          <w:p>
+            <w:r/>
+            <w:r>
+              <w:rPr>
+                <w:b w:val="0"/>
+                <w:sz w:val="19"/>
+              </w:rPr>
+              <w:t>Calificación</w:t>
+            </w:r>
+          </w:p>
+        </w:tc>
+        <w:tc>
+          <w:tcPr>
+            <w:tcW w:type="dxa" w:w="6350"/>
+          </w:tcPr>
+          <w:p>
+            <w:r/>
+            <w:r>
+              <w:rPr>
+                <w:b w:val="0"/>
+                <w:sz w:val="19"/>
+              </w:rPr>
+              <w:t>Cambie a Calificación, 5 niveles, símbolo Número. Etiquetas: Nada preparado / Totalmente preparado.</w:t>
+            </w:r>
+          </w:p>
+        </w:tc>
+      </w:tr>
+      <w:tr>
+        <w:tc>
+          <w:tcPr>
+            <w:tcW w:type="dxa" w:w="1361"/>
+            <w:shd w:val="clear" w:color="auto" w:fill="F2F2F2"/>
+          </w:tcPr>
+          <w:p>
+            <w:r/>
+            <w:r>
+              <w:rPr>
+                <w:b w:val="0"/>
+                <w:sz w:val="19"/>
+              </w:rPr>
+              <w:t>25</w:t>
+            </w:r>
+          </w:p>
+        </w:tc>
+        <w:tc>
+          <w:tcPr>
+            <w:tcW w:type="dxa" w:w="1928"/>
+            <w:shd w:val="clear" w:color="auto" w:fill="F2F2F2"/>
+          </w:tcPr>
+          <w:p>
+            <w:r/>
+            <w:r>
+              <w:rPr>
+                <w:b w:val="0"/>
+                <w:sz w:val="19"/>
+              </w:rPr>
+              <w:t>Opción + Otro</w:t>
+            </w:r>
+          </w:p>
+        </w:tc>
+        <w:tc>
+          <w:tcPr>
+            <w:tcW w:type="dxa" w:w="6350"/>
+            <w:shd w:val="clear" w:color="auto" w:fill="F2F2F2"/>
+          </w:tcPr>
+          <w:p>
+            <w:r/>
+            <w:r>
+              <w:rPr>
+                <w:b w:val="0"/>
+                <w:sz w:val="19"/>
+              </w:rPr>
+              <w:t>Active Agregar opción Otro para que escriban observaciones.</w:t>
+            </w:r>
+          </w:p>
+        </w:tc>
+      </w:tr>
+      <w:tr>
+        <w:tc>
+          <w:tcPr>
+            <w:tcW w:type="dxa" w:w="1361"/>
+          </w:tcPr>
+          <w:p>
+            <w:r/>
+            <w:r>
+              <w:rPr>
+                <w:b w:val="0"/>
+                <w:sz w:val="19"/>
+              </w:rPr>
+              <w:t>Texto largo</w:t>
+            </w:r>
+          </w:p>
+        </w:tc>
+        <w:tc>
+          <w:tcPr>
+            <w:tcW w:type="dxa" w:w="1928"/>
+          </w:tcPr>
+          <w:p>
+            <w:r/>
+            <w:r>
+              <w:rPr>
+                <w:b w:val="0"/>
+                <w:sz w:val="19"/>
+              </w:rPr>
+              <w:t>Respuesta larga</w:t>
+            </w:r>
+          </w:p>
+        </w:tc>
+        <w:tc>
+          <w:tcPr>
+            <w:tcW w:type="dxa" w:w="6350"/>
+          </w:tcPr>
+          <w:p>
+            <w:r/>
+            <w:r>
+              <w:rPr>
+                <w:b w:val="0"/>
+                <w:sz w:val="19"/>
+              </w:rPr>
+              <w:t>En todas las preguntas de Texto largo, active Respuesta larga.</w:t>
+            </w:r>
+          </w:p>
+        </w:tc>
+      </w:tr>
+      <w:tr>
+        <w:tc>
+          <w:tcPr>
+            <w:tcW w:type="dxa" w:w="1361"/>
+            <w:shd w:val="clear" w:color="auto" w:fill="F2F2F2"/>
+          </w:tcPr>
+          <w:p>
+            <w:r/>
+            <w:r>
+              <w:rPr>
+                <w:b w:val="0"/>
+                <w:sz w:val="19"/>
+              </w:rPr>
+              <w:t>Todas</w:t>
+            </w:r>
+          </w:p>
+        </w:tc>
+        <w:tc>
+          <w:tcPr>
+            <w:tcW w:type="dxa" w:w="1928"/>
+            <w:shd w:val="clear" w:color="auto" w:fill="F2F2F2"/>
+          </w:tcPr>
+          <w:p>
+            <w:r/>
+            <w:r>
+              <w:rPr>
+                <w:b w:val="0"/>
+                <w:sz w:val="19"/>
+              </w:rPr>
+              <w:t>Obligatoria</w:t>
+            </w:r>
+          </w:p>
+        </w:tc>
+        <w:tc>
+          <w:tcPr>
+            <w:tcW w:type="dxa" w:w="6350"/>
+            <w:shd w:val="clear" w:color="auto" w:fill="F2F2F2"/>
+          </w:tcPr>
+          <w:p>
+            <w:r/>
+            <w:r>
+              <w:rPr>
+                <w:b w:val="0"/>
+                <w:sz w:val="19"/>
+              </w:rPr>
+              <w:t>Active Obligatorio en las preguntas marcadas con Sí en la tabla de la sección 4.</w:t>
             </w:r>
           </w:p>
         </w:tc>
@@ -583,7 +685,7 @@
                 <w:b w:val="0"/>
                 <w:sz w:val="19"/>
               </w:rPr>
-              <w:t>20. Procedimientos manuales o alternos</w:t>
+              <w:t>11. Procedimientos alternos</w:t>
             </w:r>
           </w:p>
         </w:tc>
@@ -613,7 +715,7 @@
                 <w:b w:val="0"/>
                 <w:sz w:val="19"/>
               </w:rPr>
-              <w:t>Pregunta 23 (MTPD)</w:t>
+              <w:t>Pregunta 13 (MTPD)</w:t>
             </w:r>
           </w:p>
         </w:tc>
@@ -631,7 +733,7 @@
                 <w:b w:val="0"/>
                 <w:sz w:val="19"/>
               </w:rPr>
-              <w:t>36. Proveedores críticos</w:t>
+              <w:t>22. Proveedores críticos</w:t>
             </w:r>
           </w:p>
         </w:tc>
@@ -663,54 +765,7 @@
                 <w:b w:val="0"/>
                 <w:sz w:val="19"/>
               </w:rPr>
-              <w:t>Pregunta 38 (alternativas)</w:t>
-            </w:r>
-          </w:p>
-        </w:tc>
-      </w:tr>
-      <w:tr>
-        <w:tc>
-          <w:tcPr>
-            <w:tcW w:type="dxa" w:w="4535"/>
-          </w:tcPr>
-          <w:p>
-            <w:r/>
-            <w:r>
-              <w:rPr>
-                <w:b w:val="0"/>
-                <w:sz w:val="19"/>
-              </w:rPr>
-              <w:t>42. Confirmación de la información</w:t>
-            </w:r>
-          </w:p>
-        </w:tc>
-        <w:tc>
-          <w:tcPr>
-            <w:tcW w:type="dxa" w:w="1701"/>
-          </w:tcPr>
-          <w:p>
-            <w:r/>
-            <w:r>
-              <w:rPr>
-                <w:b w:val="0"/>
-                <w:sz w:val="19"/>
-              </w:rPr>
-              <w:t>Sí</w:t>
-            </w:r>
-          </w:p>
-        </w:tc>
-        <w:tc>
-          <w:tcPr>
-            <w:tcW w:type="dxa" w:w="3402"/>
-          </w:tcPr>
-          <w:p>
-            <w:r/>
-            <w:r>
-              <w:rPr>
-                <w:b w:val="0"/>
-                <w:sz w:val="19"/>
-              </w:rPr>
-              <w:t>Fin del formulario</w:t>
+              <w:t>Pregunta 24 (preparación)</w:t>
             </w:r>
           </w:p>
         </w:tc>
@@ -721,7 +776,7 @@
         <w:rPr>
           <w:i/>
         </w:rPr>
-        <w:t>Las preguntas a las que se salta (21, 22, 37 y 43) deben quedar como no obligatorias.</w:t>
+        <w:t>Las preguntas 12 y 23 deben quedar como no obligatorias.</w:t>
       </w:r>
     </w:p>
     <w:p>
@@ -926,7 +981,7 @@
                 <w:b w:val="0"/>
                 <w:sz w:val="19"/>
               </w:rPr>
-              <w:t>Nombre completo del entrevistado</w:t>
+              <w:t>Nombre completo y cargo del entrevistado</w:t>
             </w:r>
           </w:p>
         </w:tc>
@@ -1003,7 +1058,7 @@
                 <w:b w:val="0"/>
                 <w:sz w:val="19"/>
               </w:rPr>
-              <w:t>Cargo del entrevistado</w:t>
+              <w:t>Gerencia o departamento y nombre del proceso que representa</w:t>
             </w:r>
           </w:p>
         </w:tc>
@@ -1065,160 +1120,6 @@
                 <w:sz w:val="19"/>
               </w:rPr>
               <w:t>4</w:t>
-            </w:r>
-          </w:p>
-        </w:tc>
-        <w:tc>
-          <w:tcPr>
-            <w:tcW w:type="dxa" w:w="6236"/>
-            <w:shd w:val="clear" w:color="auto" w:fill="F2F2F2"/>
-          </w:tcPr>
-          <w:p>
-            <w:r/>
-            <w:r>
-              <w:rPr>
-                <w:b w:val="0"/>
-                <w:sz w:val="19"/>
-              </w:rPr>
-              <w:t>Gerencia o departamento al que pertenece</w:t>
-            </w:r>
-          </w:p>
-        </w:tc>
-        <w:tc>
-          <w:tcPr>
-            <w:tcW w:type="dxa" w:w="1474"/>
-            <w:shd w:val="clear" w:color="auto" w:fill="F2F2F2"/>
-          </w:tcPr>
-          <w:p>
-            <w:pPr>
-              <w:jc w:val="center"/>
-            </w:pPr>
-            <w:r/>
-            <w:r>
-              <w:rPr>
-                <w:b w:val="0"/>
-                <w:sz w:val="19"/>
-              </w:rPr>
-              <w:t>Texto corto</w:t>
-            </w:r>
-          </w:p>
-        </w:tc>
-        <w:tc>
-          <w:tcPr>
-            <w:tcW w:type="dxa" w:w="1304"/>
-            <w:shd w:val="clear" w:color="auto" w:fill="F2F2F2"/>
-          </w:tcPr>
-          <w:p>
-            <w:pPr>
-              <w:jc w:val="center"/>
-            </w:pPr>
-            <w:r>
-              <w:rPr>
-                <w:b/>
-              </w:rPr>
-            </w:r>
-            <w:r>
-              <w:rPr>
-                <w:b w:val="0"/>
-                <w:sz w:val="19"/>
-              </w:rPr>
-              <w:t>Sí</w:t>
-            </w:r>
-          </w:p>
-        </w:tc>
-      </w:tr>
-      <w:tr>
-        <w:tc>
-          <w:tcPr>
-            <w:tcW w:type="dxa" w:w="624"/>
-          </w:tcPr>
-          <w:p>
-            <w:pPr>
-              <w:jc w:val="center"/>
-            </w:pPr>
-            <w:r/>
-            <w:r>
-              <w:rPr>
-                <w:b w:val="0"/>
-                <w:sz w:val="19"/>
-              </w:rPr>
-              <w:t>5</w:t>
-            </w:r>
-          </w:p>
-        </w:tc>
-        <w:tc>
-          <w:tcPr>
-            <w:tcW w:type="dxa" w:w="6236"/>
-          </w:tcPr>
-          <w:p>
-            <w:r/>
-            <w:r>
-              <w:rPr>
-                <w:b w:val="0"/>
-                <w:sz w:val="19"/>
-              </w:rPr>
-              <w:t>Nombre del proceso que representa</w:t>
-            </w:r>
-          </w:p>
-        </w:tc>
-        <w:tc>
-          <w:tcPr>
-            <w:tcW w:type="dxa" w:w="1474"/>
-          </w:tcPr>
-          <w:p>
-            <w:pPr>
-              <w:jc w:val="center"/>
-            </w:pPr>
-            <w:r/>
-            <w:r>
-              <w:rPr>
-                <w:b w:val="0"/>
-                <w:sz w:val="19"/>
-              </w:rPr>
-              <w:t>Texto corto</w:t>
-            </w:r>
-          </w:p>
-        </w:tc>
-        <w:tc>
-          <w:tcPr>
-            <w:tcW w:type="dxa" w:w="1304"/>
-          </w:tcPr>
-          <w:p>
-            <w:pPr>
-              <w:jc w:val="center"/>
-            </w:pPr>
-            <w:r>
-              <w:rPr>
-                <w:b/>
-              </w:rPr>
-            </w:r>
-            <w:r>
-              <w:rPr>
-                <w:b w:val="0"/>
-                <w:sz w:val="19"/>
-              </w:rPr>
-              <w:t>Sí</w:t>
-            </w:r>
-          </w:p>
-        </w:tc>
-      </w:tr>
-      <w:tr>
-        <w:tc>
-          <w:tcPr>
-            <w:tcW w:type="dxa" w:w="624"/>
-            <w:shd w:val="clear" w:color="auto" w:fill="F2F2F2"/>
-          </w:tcPr>
-          <w:p>
-            <w:pPr>
-              <w:jc w:val="center"/>
-            </w:pPr>
-            <w:r/>
-            <w:r>
-              <w:rPr>
-                <w:b w:val="0"/>
-                <w:sz w:val="19"/>
-              </w:rPr>
-              <w:t>6</w:t>
             </w:r>
           </w:p>
         </w:tc>
@@ -1296,7 +1197,7 @@
                 <w:b w:val="0"/>
                 <w:sz w:val="19"/>
               </w:rPr>
-              <w:t>7</w:t>
+              <w:t>5</w:t>
             </w:r>
           </w:p>
         </w:tc>
@@ -1311,7 +1212,7 @@
                 <w:b w:val="0"/>
                 <w:sz w:val="19"/>
               </w:rPr>
-              <w:t>¿Qué amenaza podría ocasionar la interrupción del proceso? (Ejemplo: falla tecnológica, cibe...</w:t>
+              <w:t>¿Qué amenazas podrían interrumpir el proceso? Puede seleccionar varias.</w:t>
             </w:r>
           </w:p>
         </w:tc>
@@ -1329,7 +1230,7 @@
                 <w:b w:val="0"/>
                 <w:sz w:val="19"/>
               </w:rPr>
-              <w:t>Texto largo</w:t>
+              <w:t>Varias respuestas</w:t>
             </w:r>
           </w:p>
         </w:tc>
@@ -1372,7 +1273,7 @@
                 <w:b w:val="0"/>
                 <w:sz w:val="19"/>
               </w:rPr>
-              <w:t>8</w:t>
+              <w:t>6</w:t>
             </w:r>
           </w:p>
         </w:tc>
@@ -1388,7 +1289,7 @@
                 <w:b w:val="0"/>
                 <w:sz w:val="19"/>
               </w:rPr>
-              <w:t>¿Qué riesgo podría materializarse si el proceso se interrumpe?</w:t>
+              <w:t>¿Qué riesgo se materializaría y qué consecuencias tendría la interrupción? Indique servicios...</w:t>
             </w:r>
           </w:p>
         </w:tc>
@@ -1450,7 +1351,7 @@
                 <w:b w:val="0"/>
                 <w:sz w:val="19"/>
               </w:rPr>
-              <w:t>9</w:t>
+              <w:t>7</w:t>
             </w:r>
           </w:p>
         </w:tc>
@@ -1465,7 +1366,7 @@
                 <w:b w:val="0"/>
                 <w:sz w:val="19"/>
               </w:rPr>
-              <w:t>Impacto financiero: ¿qué severidad tendría una interrupción del proceso?</w:t>
+              <w:t>Evalúe la severidad del impacto de una interrupción en cada aspecto: Financiero, Operacional...</w:t>
             </w:r>
           </w:p>
         </w:tc>
@@ -1483,7 +1384,7 @@
                 <w:b w:val="0"/>
                 <w:sz w:val="19"/>
               </w:rPr>
-              <w:t>Opción</w:t>
+              <w:t>Likert</w:t>
             </w:r>
           </w:p>
         </w:tc>
@@ -1526,469 +1427,7 @@
                 <w:b w:val="0"/>
                 <w:sz w:val="19"/>
               </w:rPr>
-              <w:t>10</w:t>
-            </w:r>
-          </w:p>
-        </w:tc>
-        <w:tc>
-          <w:tcPr>
-            <w:tcW w:type="dxa" w:w="6236"/>
-            <w:shd w:val="clear" w:color="auto" w:fill="F2F2F2"/>
-          </w:tcPr>
-          <w:p>
-            <w:r/>
-            <w:r>
-              <w:rPr>
-                <w:b w:val="0"/>
-                <w:sz w:val="19"/>
-              </w:rPr>
-              <w:t>Impacto operacional: ¿qué severidad tendría una interrupción del proceso?</w:t>
-            </w:r>
-          </w:p>
-        </w:tc>
-        <w:tc>
-          <w:tcPr>
-            <w:tcW w:type="dxa" w:w="1474"/>
-            <w:shd w:val="clear" w:color="auto" w:fill="F2F2F2"/>
-          </w:tcPr>
-          <w:p>
-            <w:pPr>
-              <w:jc w:val="center"/>
-            </w:pPr>
-            <w:r/>
-            <w:r>
-              <w:rPr>
-                <w:b w:val="0"/>
-                <w:sz w:val="19"/>
-              </w:rPr>
-              <w:t>Opción</w:t>
-            </w:r>
-          </w:p>
-        </w:tc>
-        <w:tc>
-          <w:tcPr>
-            <w:tcW w:type="dxa" w:w="1304"/>
-            <w:shd w:val="clear" w:color="auto" w:fill="F2F2F2"/>
-          </w:tcPr>
-          <w:p>
-            <w:pPr>
-              <w:jc w:val="center"/>
-            </w:pPr>
-            <w:r>
-              <w:rPr>
-                <w:b/>
-              </w:rPr>
-            </w:r>
-            <w:r>
-              <w:rPr>
-                <w:b w:val="0"/>
-                <w:sz w:val="19"/>
-              </w:rPr>
-              <w:t>Sí</w:t>
-            </w:r>
-          </w:p>
-        </w:tc>
-      </w:tr>
-      <w:tr>
-        <w:tc>
-          <w:tcPr>
-            <w:tcW w:type="dxa" w:w="624"/>
-          </w:tcPr>
-          <w:p>
-            <w:pPr>
-              <w:jc w:val="center"/>
-            </w:pPr>
-            <w:r/>
-            <w:r>
-              <w:rPr>
-                <w:b w:val="0"/>
-                <w:sz w:val="19"/>
-              </w:rPr>
-              <w:t>11</w:t>
-            </w:r>
-          </w:p>
-        </w:tc>
-        <w:tc>
-          <w:tcPr>
-            <w:tcW w:type="dxa" w:w="6236"/>
-          </w:tcPr>
-          <w:p>
-            <w:r/>
-            <w:r>
-              <w:rPr>
-                <w:b w:val="0"/>
-                <w:sz w:val="19"/>
-              </w:rPr>
-              <w:t>Impacto legal o regulatorio: ¿qué severidad tendría una interrupción del proceso?</w:t>
-            </w:r>
-          </w:p>
-        </w:tc>
-        <w:tc>
-          <w:tcPr>
-            <w:tcW w:type="dxa" w:w="1474"/>
-          </w:tcPr>
-          <w:p>
-            <w:pPr>
-              <w:jc w:val="center"/>
-            </w:pPr>
-            <w:r/>
-            <w:r>
-              <w:rPr>
-                <w:b w:val="0"/>
-                <w:sz w:val="19"/>
-              </w:rPr>
-              <w:t>Opción</w:t>
-            </w:r>
-          </w:p>
-        </w:tc>
-        <w:tc>
-          <w:tcPr>
-            <w:tcW w:type="dxa" w:w="1304"/>
-          </w:tcPr>
-          <w:p>
-            <w:pPr>
-              <w:jc w:val="center"/>
-            </w:pPr>
-            <w:r>
-              <w:rPr>
-                <w:b/>
-              </w:rPr>
-            </w:r>
-            <w:r>
-              <w:rPr>
-                <w:b w:val="0"/>
-                <w:sz w:val="19"/>
-              </w:rPr>
-              <w:t>Sí</w:t>
-            </w:r>
-          </w:p>
-        </w:tc>
-      </w:tr>
-      <w:tr>
-        <w:tc>
-          <w:tcPr>
-            <w:tcW w:type="dxa" w:w="624"/>
-            <w:shd w:val="clear" w:color="auto" w:fill="F2F2F2"/>
-          </w:tcPr>
-          <w:p>
-            <w:pPr>
-              <w:jc w:val="center"/>
-            </w:pPr>
-            <w:r/>
-            <w:r>
-              <w:rPr>
-                <w:b w:val="0"/>
-                <w:sz w:val="19"/>
-              </w:rPr>
-              <w:t>12</w:t>
-            </w:r>
-          </w:p>
-        </w:tc>
-        <w:tc>
-          <w:tcPr>
-            <w:tcW w:type="dxa" w:w="6236"/>
-            <w:shd w:val="clear" w:color="auto" w:fill="F2F2F2"/>
-          </w:tcPr>
-          <w:p>
-            <w:r/>
-            <w:r>
-              <w:rPr>
-                <w:b w:val="0"/>
-                <w:sz w:val="19"/>
-              </w:rPr>
-              <w:t>Impacto reputacional: ¿qué severidad tendría una interrupción del proceso?</w:t>
-            </w:r>
-          </w:p>
-        </w:tc>
-        <w:tc>
-          <w:tcPr>
-            <w:tcW w:type="dxa" w:w="1474"/>
-            <w:shd w:val="clear" w:color="auto" w:fill="F2F2F2"/>
-          </w:tcPr>
-          <w:p>
-            <w:pPr>
-              <w:jc w:val="center"/>
-            </w:pPr>
-            <w:r/>
-            <w:r>
-              <w:rPr>
-                <w:b w:val="0"/>
-                <w:sz w:val="19"/>
-              </w:rPr>
-              <w:t>Opción</w:t>
-            </w:r>
-          </w:p>
-        </w:tc>
-        <w:tc>
-          <w:tcPr>
-            <w:tcW w:type="dxa" w:w="1304"/>
-            <w:shd w:val="clear" w:color="auto" w:fill="F2F2F2"/>
-          </w:tcPr>
-          <w:p>
-            <w:pPr>
-              <w:jc w:val="center"/>
-            </w:pPr>
-            <w:r>
-              <w:rPr>
-                <w:b/>
-              </w:rPr>
-            </w:r>
-            <w:r>
-              <w:rPr>
-                <w:b w:val="0"/>
-                <w:sz w:val="19"/>
-              </w:rPr>
-              <w:t>Sí</w:t>
-            </w:r>
-          </w:p>
-        </w:tc>
-      </w:tr>
-      <w:tr>
-        <w:tc>
-          <w:tcPr>
-            <w:tcW w:type="dxa" w:w="624"/>
-          </w:tcPr>
-          <w:p>
-            <w:pPr>
-              <w:jc w:val="center"/>
-            </w:pPr>
-            <w:r/>
-            <w:r>
-              <w:rPr>
-                <w:b w:val="0"/>
-                <w:sz w:val="19"/>
-              </w:rPr>
-              <w:t>13</w:t>
-            </w:r>
-          </w:p>
-        </w:tc>
-        <w:tc>
-          <w:tcPr>
-            <w:tcW w:type="dxa" w:w="6236"/>
-          </w:tcPr>
-          <w:p>
-            <w:r/>
-            <w:r>
-              <w:rPr>
-                <w:b w:val="0"/>
-                <w:sz w:val="19"/>
-              </w:rPr>
-              <w:t>Impacto en clientes y asociados: ¿qué severidad tendría una interrupción del proceso?</w:t>
-            </w:r>
-          </w:p>
-        </w:tc>
-        <w:tc>
-          <w:tcPr>
-            <w:tcW w:type="dxa" w:w="1474"/>
-          </w:tcPr>
-          <w:p>
-            <w:pPr>
-              <w:jc w:val="center"/>
-            </w:pPr>
-            <w:r/>
-            <w:r>
-              <w:rPr>
-                <w:b w:val="0"/>
-                <w:sz w:val="19"/>
-              </w:rPr>
-              <w:t>Opción</w:t>
-            </w:r>
-          </w:p>
-        </w:tc>
-        <w:tc>
-          <w:tcPr>
-            <w:tcW w:type="dxa" w:w="1304"/>
-          </w:tcPr>
-          <w:p>
-            <w:pPr>
-              <w:jc w:val="center"/>
-            </w:pPr>
-            <w:r>
-              <w:rPr>
-                <w:b/>
-              </w:rPr>
-            </w:r>
-            <w:r>
-              <w:rPr>
-                <w:b w:val="0"/>
-                <w:sz w:val="19"/>
-              </w:rPr>
-              <w:t>Sí</w:t>
-            </w:r>
-          </w:p>
-        </w:tc>
-      </w:tr>
-      <w:tr>
-        <w:tc>
-          <w:tcPr>
-            <w:tcW w:type="dxa" w:w="624"/>
-            <w:shd w:val="clear" w:color="auto" w:fill="F2F2F2"/>
-          </w:tcPr>
-          <w:p>
-            <w:pPr>
-              <w:jc w:val="center"/>
-            </w:pPr>
-            <w:r/>
-            <w:r>
-              <w:rPr>
-                <w:b w:val="0"/>
-                <w:sz w:val="19"/>
-              </w:rPr>
-              <w:t>14</w:t>
-            </w:r>
-          </w:p>
-        </w:tc>
-        <w:tc>
-          <w:tcPr>
-            <w:tcW w:type="dxa" w:w="6236"/>
-            <w:shd w:val="clear" w:color="auto" w:fill="F2F2F2"/>
-          </w:tcPr>
-          <w:p>
-            <w:r/>
-            <w:r>
-              <w:rPr>
-                <w:b w:val="0"/>
-                <w:sz w:val="19"/>
-              </w:rPr>
-              <w:t>Impacto en personas (colaboradores): ¿qué severidad tendría una interrupción del proceso?</w:t>
-            </w:r>
-          </w:p>
-        </w:tc>
-        <w:tc>
-          <w:tcPr>
-            <w:tcW w:type="dxa" w:w="1474"/>
-            <w:shd w:val="clear" w:color="auto" w:fill="F2F2F2"/>
-          </w:tcPr>
-          <w:p>
-            <w:pPr>
-              <w:jc w:val="center"/>
-            </w:pPr>
-            <w:r/>
-            <w:r>
-              <w:rPr>
-                <w:b w:val="0"/>
-                <w:sz w:val="19"/>
-              </w:rPr>
-              <w:t>Opción</w:t>
-            </w:r>
-          </w:p>
-        </w:tc>
-        <w:tc>
-          <w:tcPr>
-            <w:tcW w:type="dxa" w:w="1304"/>
-            <w:shd w:val="clear" w:color="auto" w:fill="F2F2F2"/>
-          </w:tcPr>
-          <w:p>
-            <w:pPr>
-              <w:jc w:val="center"/>
-            </w:pPr>
-            <w:r>
-              <w:rPr>
-                <w:b/>
-              </w:rPr>
-            </w:r>
-            <w:r>
-              <w:rPr>
-                <w:b w:val="0"/>
-                <w:sz w:val="19"/>
-              </w:rPr>
-              <w:t>Sí</w:t>
-            </w:r>
-          </w:p>
-        </w:tc>
-      </w:tr>
-      <w:tr>
-        <w:tc>
-          <w:tcPr>
-            <w:tcW w:type="dxa" w:w="624"/>
-          </w:tcPr>
-          <w:p>
-            <w:pPr>
-              <w:jc w:val="center"/>
-            </w:pPr>
-            <w:r/>
-            <w:r>
-              <w:rPr>
-                <w:b w:val="0"/>
-                <w:sz w:val="19"/>
-              </w:rPr>
-              <w:t>15</w:t>
-            </w:r>
-          </w:p>
-        </w:tc>
-        <w:tc>
-          <w:tcPr>
-            <w:tcW w:type="dxa" w:w="6236"/>
-          </w:tcPr>
-          <w:p>
-            <w:r/>
-            <w:r>
-              <w:rPr>
-                <w:b w:val="0"/>
-                <w:sz w:val="19"/>
-              </w:rPr>
-              <w:t>Impacto en infraestructura y equipo: ¿qué severidad tendría una interrupción del proceso?</w:t>
-            </w:r>
-          </w:p>
-        </w:tc>
-        <w:tc>
-          <w:tcPr>
-            <w:tcW w:type="dxa" w:w="1474"/>
-          </w:tcPr>
-          <w:p>
-            <w:pPr>
-              <w:jc w:val="center"/>
-            </w:pPr>
-            <w:r/>
-            <w:r>
-              <w:rPr>
-                <w:b w:val="0"/>
-                <w:sz w:val="19"/>
-              </w:rPr>
-              <w:t>Opción</w:t>
-            </w:r>
-          </w:p>
-        </w:tc>
-        <w:tc>
-          <w:tcPr>
-            <w:tcW w:type="dxa" w:w="1304"/>
-          </w:tcPr>
-          <w:p>
-            <w:pPr>
-              <w:jc w:val="center"/>
-            </w:pPr>
-            <w:r>
-              <w:rPr>
-                <w:b/>
-              </w:rPr>
-            </w:r>
-            <w:r>
-              <w:rPr>
-                <w:b w:val="0"/>
-                <w:sz w:val="19"/>
-              </w:rPr>
-              <w:t>Sí</w:t>
-            </w:r>
-          </w:p>
-        </w:tc>
-      </w:tr>
-      <w:tr>
-        <w:tc>
-          <w:tcPr>
-            <w:tcW w:type="dxa" w:w="624"/>
-            <w:shd w:val="clear" w:color="auto" w:fill="F2F2F2"/>
-          </w:tcPr>
-          <w:p>
-            <w:pPr>
-              <w:jc w:val="center"/>
-            </w:pPr>
-            <w:r/>
-            <w:r>
-              <w:rPr>
-                <w:b w:val="0"/>
-                <w:sz w:val="19"/>
-              </w:rPr>
-              <w:t>16</w:t>
+              <w:t>8</w:t>
             </w:r>
           </w:p>
         </w:tc>
@@ -2066,7 +1505,7 @@
                 <w:b w:val="0"/>
                 <w:sz w:val="19"/>
               </w:rPr>
-              <w:t>17</w:t>
+              <w:t>9</w:t>
             </w:r>
           </w:p>
         </w:tc>
@@ -2081,7 +1520,7 @@
                 <w:b w:val="0"/>
                 <w:sz w:val="19"/>
               </w:rPr>
-              <w:t>¿Qué consecuencias tendría la interrupción del proceso? Indique servicios afectados, persona...</w:t>
+              <w:t>¿El proceso cuenta con un mapa de procesos o documentación de sus actividades y dependencias?</w:t>
             </w:r>
           </w:p>
         </w:tc>
@@ -2099,7 +1538,7 @@
                 <w:b w:val="0"/>
                 <w:sz w:val="19"/>
               </w:rPr>
-              <w:t>Texto largo</w:t>
+              <w:t>Opción</w:t>
             </w:r>
           </w:p>
         </w:tc>
@@ -2142,7 +1581,7 @@
                 <w:b w:val="0"/>
                 <w:sz w:val="19"/>
               </w:rPr>
-              <w:t>18</w:t>
+              <w:t>10</w:t>
             </w:r>
           </w:p>
         </w:tc>
@@ -2158,7 +1597,465 @@
                 <w:b w:val="0"/>
                 <w:sz w:val="19"/>
               </w:rPr>
-              <w:t>¿El proceso cuenta con un mapa de procesos o documentación que identifique sus actividades y...</w:t>
+              <w:t>¿De qué procesos, áreas, sistemas o servicios depende el proceso para operar?</w:t>
+            </w:r>
+          </w:p>
+        </w:tc>
+        <w:tc>
+          <w:tcPr>
+            <w:tcW w:type="dxa" w:w="1474"/>
+            <w:shd w:val="clear" w:color="auto" w:fill="F2F2F2"/>
+          </w:tcPr>
+          <w:p>
+            <w:pPr>
+              <w:jc w:val="center"/>
+            </w:pPr>
+            <w:r/>
+            <w:r>
+              <w:rPr>
+                <w:b w:val="0"/>
+                <w:sz w:val="19"/>
+              </w:rPr>
+              <w:t>Texto largo</w:t>
+            </w:r>
+          </w:p>
+        </w:tc>
+        <w:tc>
+          <w:tcPr>
+            <w:tcW w:type="dxa" w:w="1304"/>
+            <w:shd w:val="clear" w:color="auto" w:fill="F2F2F2"/>
+          </w:tcPr>
+          <w:p>
+            <w:pPr>
+              <w:jc w:val="center"/>
+            </w:pPr>
+            <w:r>
+              <w:rPr>
+                <w:b/>
+              </w:rPr>
+            </w:r>
+            <w:r>
+              <w:rPr>
+                <w:b w:val="0"/>
+                <w:sz w:val="19"/>
+              </w:rPr>
+              <w:t>Sí</w:t>
+            </w:r>
+          </w:p>
+        </w:tc>
+      </w:tr>
+      <w:tr>
+        <w:tc>
+          <w:tcPr>
+            <w:tcW w:type="dxa" w:w="624"/>
+          </w:tcPr>
+          <w:p>
+            <w:pPr>
+              <w:jc w:val="center"/>
+            </w:pPr>
+            <w:r/>
+            <w:r>
+              <w:rPr>
+                <w:b w:val="0"/>
+                <w:sz w:val="19"/>
+              </w:rPr>
+              <w:t>11</w:t>
+            </w:r>
+          </w:p>
+        </w:tc>
+        <w:tc>
+          <w:tcPr>
+            <w:tcW w:type="dxa" w:w="6236"/>
+          </w:tcPr>
+          <w:p>
+            <w:r/>
+            <w:r>
+              <w:rPr>
+                <w:b w:val="0"/>
+                <w:sz w:val="19"/>
+              </w:rPr>
+              <w:t>¿Existen procedimientos manuales o alternos para continuar operando durante una contingencia?</w:t>
+            </w:r>
+          </w:p>
+        </w:tc>
+        <w:tc>
+          <w:tcPr>
+            <w:tcW w:type="dxa" w:w="1474"/>
+          </w:tcPr>
+          <w:p>
+            <w:pPr>
+              <w:jc w:val="center"/>
+            </w:pPr>
+            <w:r/>
+            <w:r>
+              <w:rPr>
+                <w:b w:val="0"/>
+                <w:sz w:val="19"/>
+              </w:rPr>
+              <w:t>Opción</w:t>
+            </w:r>
+          </w:p>
+        </w:tc>
+        <w:tc>
+          <w:tcPr>
+            <w:tcW w:type="dxa" w:w="1304"/>
+          </w:tcPr>
+          <w:p>
+            <w:pPr>
+              <w:jc w:val="center"/>
+            </w:pPr>
+            <w:r>
+              <w:rPr>
+                <w:b/>
+              </w:rPr>
+            </w:r>
+            <w:r>
+              <w:rPr>
+                <w:b w:val="0"/>
+                <w:sz w:val="19"/>
+              </w:rPr>
+              <w:t>Sí</w:t>
+            </w:r>
+          </w:p>
+        </w:tc>
+      </w:tr>
+      <w:tr>
+        <w:tc>
+          <w:tcPr>
+            <w:tcW w:type="dxa" w:w="624"/>
+            <w:shd w:val="clear" w:color="auto" w:fill="F2F2F2"/>
+          </w:tcPr>
+          <w:p>
+            <w:pPr>
+              <w:jc w:val="center"/>
+            </w:pPr>
+            <w:r/>
+            <w:r>
+              <w:rPr>
+                <w:b w:val="0"/>
+                <w:sz w:val="19"/>
+              </w:rPr>
+              <w:t>12</w:t>
+            </w:r>
+          </w:p>
+        </w:tc>
+        <w:tc>
+          <w:tcPr>
+            <w:tcW w:type="dxa" w:w="6236"/>
+            <w:shd w:val="clear" w:color="auto" w:fill="F2F2F2"/>
+          </w:tcPr>
+          <w:p>
+            <w:r/>
+            <w:r>
+              <w:rPr>
+                <w:b w:val="0"/>
+                <w:sz w:val="19"/>
+              </w:rPr>
+              <w:t>Describa los procedimientos alternos y sus limitaciones. (Ejemplo: registros manuales, formu...</w:t>
+            </w:r>
+          </w:p>
+        </w:tc>
+        <w:tc>
+          <w:tcPr>
+            <w:tcW w:type="dxa" w:w="1474"/>
+            <w:shd w:val="clear" w:color="auto" w:fill="F2F2F2"/>
+          </w:tcPr>
+          <w:p>
+            <w:pPr>
+              <w:jc w:val="center"/>
+            </w:pPr>
+            <w:r/>
+            <w:r>
+              <w:rPr>
+                <w:b w:val="0"/>
+                <w:sz w:val="19"/>
+              </w:rPr>
+              <w:t>Texto largo</w:t>
+            </w:r>
+          </w:p>
+        </w:tc>
+        <w:tc>
+          <w:tcPr>
+            <w:tcW w:type="dxa" w:w="1304"/>
+            <w:shd w:val="clear" w:color="auto" w:fill="F2F2F2"/>
+          </w:tcPr>
+          <w:p>
+            <w:pPr>
+              <w:jc w:val="center"/>
+            </w:pPr>
+            <w:r/>
+            <w:r>
+              <w:rPr>
+                <w:b w:val="0"/>
+                <w:sz w:val="19"/>
+              </w:rPr>
+              <w:t>No</w:t>
+            </w:r>
+          </w:p>
+        </w:tc>
+      </w:tr>
+      <w:tr>
+        <w:tc>
+          <w:tcPr>
+            <w:tcW w:type="dxa" w:w="624"/>
+          </w:tcPr>
+          <w:p>
+            <w:pPr>
+              <w:jc w:val="center"/>
+            </w:pPr>
+            <w:r/>
+            <w:r>
+              <w:rPr>
+                <w:b w:val="0"/>
+                <w:sz w:val="19"/>
+              </w:rPr>
+              <w:t>13</w:t>
+            </w:r>
+          </w:p>
+        </w:tc>
+        <w:tc>
+          <w:tcPr>
+            <w:tcW w:type="dxa" w:w="6236"/>
+          </w:tcPr>
+          <w:p>
+            <w:r/>
+            <w:r>
+              <w:rPr>
+                <w:b w:val="0"/>
+                <w:sz w:val="19"/>
+              </w:rPr>
+              <w:t>MTPD: ¿Cuánto tiempo puede estar interrumpido el proceso antes de que los impactos sean inac...</w:t>
+            </w:r>
+          </w:p>
+        </w:tc>
+        <w:tc>
+          <w:tcPr>
+            <w:tcW w:type="dxa" w:w="1474"/>
+          </w:tcPr>
+          <w:p>
+            <w:pPr>
+              <w:jc w:val="center"/>
+            </w:pPr>
+            <w:r/>
+            <w:r>
+              <w:rPr>
+                <w:b w:val="0"/>
+                <w:sz w:val="19"/>
+              </w:rPr>
+              <w:t>Opción</w:t>
+            </w:r>
+          </w:p>
+        </w:tc>
+        <w:tc>
+          <w:tcPr>
+            <w:tcW w:type="dxa" w:w="1304"/>
+          </w:tcPr>
+          <w:p>
+            <w:pPr>
+              <w:jc w:val="center"/>
+            </w:pPr>
+            <w:r>
+              <w:rPr>
+                <w:b/>
+              </w:rPr>
+            </w:r>
+            <w:r>
+              <w:rPr>
+                <w:b w:val="0"/>
+                <w:sz w:val="19"/>
+              </w:rPr>
+              <w:t>Sí</w:t>
+            </w:r>
+          </w:p>
+        </w:tc>
+      </w:tr>
+      <w:tr>
+        <w:tc>
+          <w:tcPr>
+            <w:tcW w:type="dxa" w:w="624"/>
+            <w:shd w:val="clear" w:color="auto" w:fill="F2F2F2"/>
+          </w:tcPr>
+          <w:p>
+            <w:pPr>
+              <w:jc w:val="center"/>
+            </w:pPr>
+            <w:r/>
+            <w:r>
+              <w:rPr>
+                <w:b w:val="0"/>
+                <w:sz w:val="19"/>
+              </w:rPr>
+              <w:t>14</w:t>
+            </w:r>
+          </w:p>
+        </w:tc>
+        <w:tc>
+          <w:tcPr>
+            <w:tcW w:type="dxa" w:w="6236"/>
+            <w:shd w:val="clear" w:color="auto" w:fill="F2F2F2"/>
+          </w:tcPr>
+          <w:p>
+            <w:r/>
+            <w:r>
+              <w:rPr>
+                <w:b w:val="0"/>
+                <w:sz w:val="19"/>
+              </w:rPr>
+              <w:t>MBCO: ¿Qué nivel mínimo de servicio debe mantenerse durante una contingencia? Indique activi...</w:t>
+            </w:r>
+          </w:p>
+        </w:tc>
+        <w:tc>
+          <w:tcPr>
+            <w:tcW w:type="dxa" w:w="1474"/>
+            <w:shd w:val="clear" w:color="auto" w:fill="F2F2F2"/>
+          </w:tcPr>
+          <w:p>
+            <w:pPr>
+              <w:jc w:val="center"/>
+            </w:pPr>
+            <w:r/>
+            <w:r>
+              <w:rPr>
+                <w:b w:val="0"/>
+                <w:sz w:val="19"/>
+              </w:rPr>
+              <w:t>Texto largo</w:t>
+            </w:r>
+          </w:p>
+        </w:tc>
+        <w:tc>
+          <w:tcPr>
+            <w:tcW w:type="dxa" w:w="1304"/>
+            <w:shd w:val="clear" w:color="auto" w:fill="F2F2F2"/>
+          </w:tcPr>
+          <w:p>
+            <w:pPr>
+              <w:jc w:val="center"/>
+            </w:pPr>
+            <w:r>
+              <w:rPr>
+                <w:b/>
+              </w:rPr>
+            </w:r>
+            <w:r>
+              <w:rPr>
+                <w:b w:val="0"/>
+                <w:sz w:val="19"/>
+              </w:rPr>
+              <w:t>Sí</w:t>
+            </w:r>
+          </w:p>
+        </w:tc>
+      </w:tr>
+      <w:tr>
+        <w:tc>
+          <w:tcPr>
+            <w:tcW w:type="dxa" w:w="624"/>
+          </w:tcPr>
+          <w:p>
+            <w:pPr>
+              <w:jc w:val="center"/>
+            </w:pPr>
+            <w:r/>
+            <w:r>
+              <w:rPr>
+                <w:b w:val="0"/>
+                <w:sz w:val="19"/>
+              </w:rPr>
+              <w:t>15</w:t>
+            </w:r>
+          </w:p>
+        </w:tc>
+        <w:tc>
+          <w:tcPr>
+            <w:tcW w:type="dxa" w:w="6236"/>
+          </w:tcPr>
+          <w:p>
+            <w:r/>
+            <w:r>
+              <w:rPr>
+                <w:b w:val="0"/>
+                <w:sz w:val="19"/>
+              </w:rPr>
+              <w:t>RTO: ¿En cuánto tiempo debe restablecerse el proceso después de una interrupción?</w:t>
+            </w:r>
+          </w:p>
+        </w:tc>
+        <w:tc>
+          <w:tcPr>
+            <w:tcW w:type="dxa" w:w="1474"/>
+          </w:tcPr>
+          <w:p>
+            <w:pPr>
+              <w:jc w:val="center"/>
+            </w:pPr>
+            <w:r/>
+            <w:r>
+              <w:rPr>
+                <w:b w:val="0"/>
+                <w:sz w:val="19"/>
+              </w:rPr>
+              <w:t>Opción</w:t>
+            </w:r>
+          </w:p>
+        </w:tc>
+        <w:tc>
+          <w:tcPr>
+            <w:tcW w:type="dxa" w:w="1304"/>
+          </w:tcPr>
+          <w:p>
+            <w:pPr>
+              <w:jc w:val="center"/>
+            </w:pPr>
+            <w:r>
+              <w:rPr>
+                <w:b/>
+              </w:rPr>
+            </w:r>
+            <w:r>
+              <w:rPr>
+                <w:b w:val="0"/>
+                <w:sz w:val="19"/>
+              </w:rPr>
+              <w:t>Sí</w:t>
+            </w:r>
+          </w:p>
+        </w:tc>
+      </w:tr>
+      <w:tr>
+        <w:tc>
+          <w:tcPr>
+            <w:tcW w:type="dxa" w:w="624"/>
+            <w:shd w:val="clear" w:color="auto" w:fill="F2F2F2"/>
+          </w:tcPr>
+          <w:p>
+            <w:pPr>
+              <w:jc w:val="center"/>
+            </w:pPr>
+            <w:r/>
+            <w:r>
+              <w:rPr>
+                <w:b w:val="0"/>
+                <w:sz w:val="19"/>
+              </w:rPr>
+              <w:t>16</w:t>
+            </w:r>
+          </w:p>
+        </w:tc>
+        <w:tc>
+          <w:tcPr>
+            <w:tcW w:type="dxa" w:w="6236"/>
+            <w:shd w:val="clear" w:color="auto" w:fill="F2F2F2"/>
+          </w:tcPr>
+          <w:p>
+            <w:r/>
+            <w:r>
+              <w:rPr>
+                <w:b w:val="0"/>
+                <w:sz w:val="19"/>
+              </w:rPr>
+              <w:t>RPO: ¿Cuánta información, medida en tiempo, puede perder el proceso sin consecuencias graves?</w:t>
             </w:r>
           </w:p>
         </w:tc>
@@ -2220,6 +2117,160 @@
                 <w:b w:val="0"/>
                 <w:sz w:val="19"/>
               </w:rPr>
+              <w:t>17</w:t>
+            </w:r>
+          </w:p>
+        </w:tc>
+        <w:tc>
+          <w:tcPr>
+            <w:tcW w:type="dxa" w:w="6236"/>
+          </w:tcPr>
+          <w:p>
+            <w:r/>
+            <w:r>
+              <w:rPr>
+                <w:b w:val="0"/>
+                <w:sz w:val="19"/>
+              </w:rPr>
+              <w:t>¿Cuánto tarda actualmente Tecnología de la Información en restablecer los sistemas que neces...</w:t>
+            </w:r>
+          </w:p>
+        </w:tc>
+        <w:tc>
+          <w:tcPr>
+            <w:tcW w:type="dxa" w:w="1474"/>
+          </w:tcPr>
+          <w:p>
+            <w:pPr>
+              <w:jc w:val="center"/>
+            </w:pPr>
+            <w:r/>
+            <w:r>
+              <w:rPr>
+                <w:b w:val="0"/>
+                <w:sz w:val="19"/>
+              </w:rPr>
+              <w:t>Opción</w:t>
+            </w:r>
+          </w:p>
+        </w:tc>
+        <w:tc>
+          <w:tcPr>
+            <w:tcW w:type="dxa" w:w="1304"/>
+          </w:tcPr>
+          <w:p>
+            <w:pPr>
+              <w:jc w:val="center"/>
+            </w:pPr>
+            <w:r>
+              <w:rPr>
+                <w:b/>
+              </w:rPr>
+            </w:r>
+            <w:r>
+              <w:rPr>
+                <w:b w:val="0"/>
+                <w:sz w:val="19"/>
+              </w:rPr>
+              <w:t>Sí</w:t>
+            </w:r>
+          </w:p>
+        </w:tc>
+      </w:tr>
+      <w:tr>
+        <w:tc>
+          <w:tcPr>
+            <w:tcW w:type="dxa" w:w="624"/>
+            <w:shd w:val="clear" w:color="auto" w:fill="F2F2F2"/>
+          </w:tcPr>
+          <w:p>
+            <w:pPr>
+              <w:jc w:val="center"/>
+            </w:pPr>
+            <w:r/>
+            <w:r>
+              <w:rPr>
+                <w:b w:val="0"/>
+                <w:sz w:val="19"/>
+              </w:rPr>
+              <w:t>18</w:t>
+            </w:r>
+          </w:p>
+        </w:tc>
+        <w:tc>
+          <w:tcPr>
+            <w:tcW w:type="dxa" w:w="6236"/>
+            <w:shd w:val="clear" w:color="auto" w:fill="F2F2F2"/>
+          </w:tcPr>
+          <w:p>
+            <w:r/>
+            <w:r>
+              <w:rPr>
+                <w:b w:val="0"/>
+                <w:sz w:val="19"/>
+              </w:rPr>
+              <w:t>¿Cada cuánto se respalda la información que utiliza el proceso?</w:t>
+            </w:r>
+          </w:p>
+        </w:tc>
+        <w:tc>
+          <w:tcPr>
+            <w:tcW w:type="dxa" w:w="1474"/>
+            <w:shd w:val="clear" w:color="auto" w:fill="F2F2F2"/>
+          </w:tcPr>
+          <w:p>
+            <w:pPr>
+              <w:jc w:val="center"/>
+            </w:pPr>
+            <w:r/>
+            <w:r>
+              <w:rPr>
+                <w:b w:val="0"/>
+                <w:sz w:val="19"/>
+              </w:rPr>
+              <w:t>Lista desplegable</w:t>
+            </w:r>
+          </w:p>
+        </w:tc>
+        <w:tc>
+          <w:tcPr>
+            <w:tcW w:type="dxa" w:w="1304"/>
+            <w:shd w:val="clear" w:color="auto" w:fill="F2F2F2"/>
+          </w:tcPr>
+          <w:p>
+            <w:pPr>
+              <w:jc w:val="center"/>
+            </w:pPr>
+            <w:r>
+              <w:rPr>
+                <w:b/>
+              </w:rPr>
+            </w:r>
+            <w:r>
+              <w:rPr>
+                <w:b w:val="0"/>
+                <w:sz w:val="19"/>
+              </w:rPr>
+              <w:t>Sí</w:t>
+            </w:r>
+          </w:p>
+        </w:tc>
+      </w:tr>
+      <w:tr>
+        <w:tc>
+          <w:tcPr>
+            <w:tcW w:type="dxa" w:w="624"/>
+          </w:tcPr>
+          <w:p>
+            <w:pPr>
+              <w:jc w:val="center"/>
+            </w:pPr>
+            <w:r/>
+            <w:r>
+              <w:rPr>
+                <w:b w:val="0"/>
+                <w:sz w:val="19"/>
+              </w:rPr>
               <w:t>19</w:t>
             </w:r>
           </w:p>
@@ -2235,7 +2286,7 @@
                 <w:b w:val="0"/>
                 <w:sz w:val="19"/>
               </w:rPr>
-              <w:t>¿De qué procesos, áreas, sistemas o servicios depende el proceso para operar?</w:t>
+              <w:t>¿Qué acciones deben ejecutarse para recuperar el proceso, en qué orden, quién es responsable...</w:t>
             </w:r>
           </w:p>
         </w:tc>
@@ -2312,7 +2363,7 @@
                 <w:b w:val="0"/>
                 <w:sz w:val="19"/>
               </w:rPr>
-              <w:t>¿Existen procedimientos manuales o alternos para continuar operando durante una contingencia?</w:t>
+              <w:t>¿Qué tipos de recursos necesita el proceso durante una contingencia? Puede seleccionar varios.</w:t>
             </w:r>
           </w:p>
         </w:tc>
@@ -2331,7 +2382,7 @@
                 <w:b w:val="0"/>
                 <w:sz w:val="19"/>
               </w:rPr>
-              <w:t>Opción</w:t>
+              <w:t>Varias respuestas</w:t>
             </w:r>
           </w:p>
         </w:tc>
@@ -2389,615 +2440,7 @@
                 <w:b w:val="0"/>
                 <w:sz w:val="19"/>
               </w:rPr>
-              <w:t>Describa los procedimientos manuales o alternos que se utilizarían. (Ejemplo: registros manu...</w:t>
-            </w:r>
-          </w:p>
-        </w:tc>
-        <w:tc>
-          <w:tcPr>
-            <w:tcW w:type="dxa" w:w="1474"/>
-          </w:tcPr>
-          <w:p>
-            <w:pPr>
-              <w:jc w:val="center"/>
-            </w:pPr>
-            <w:r/>
-            <w:r>
-              <w:rPr>
-                <w:b w:val="0"/>
-                <w:sz w:val="19"/>
-              </w:rPr>
-              <w:t>Texto largo</w:t>
-            </w:r>
-          </w:p>
-        </w:tc>
-        <w:tc>
-          <w:tcPr>
-            <w:tcW w:type="dxa" w:w="1304"/>
-          </w:tcPr>
-          <w:p>
-            <w:pPr>
-              <w:jc w:val="center"/>
-            </w:pPr>
-            <w:r/>
-            <w:r>
-              <w:rPr>
-                <w:b w:val="0"/>
-                <w:sz w:val="19"/>
-              </w:rPr>
-              <w:t>No</w:t>
-            </w:r>
-          </w:p>
-        </w:tc>
-      </w:tr>
-      <w:tr>
-        <w:tc>
-          <w:tcPr>
-            <w:tcW w:type="dxa" w:w="624"/>
-            <w:shd w:val="clear" w:color="auto" w:fill="F2F2F2"/>
-          </w:tcPr>
-          <w:p>
-            <w:pPr>
-              <w:jc w:val="center"/>
-            </w:pPr>
-            <w:r/>
-            <w:r>
-              <w:rPr>
-                <w:b w:val="0"/>
-                <w:sz w:val="19"/>
-              </w:rPr>
-              <w:t>22</w:t>
-            </w:r>
-          </w:p>
-        </w:tc>
-        <w:tc>
-          <w:tcPr>
-            <w:tcW w:type="dxa" w:w="6236"/>
-            <w:shd w:val="clear" w:color="auto" w:fill="F2F2F2"/>
-          </w:tcPr>
-          <w:p>
-            <w:r/>
-            <w:r>
-              <w:rPr>
-                <w:b w:val="0"/>
-                <w:sz w:val="19"/>
-              </w:rPr>
-              <w:t>¿Qué limitaciones o dificultades tendrían esos procedimientos alternos?</w:t>
-            </w:r>
-          </w:p>
-        </w:tc>
-        <w:tc>
-          <w:tcPr>
-            <w:tcW w:type="dxa" w:w="1474"/>
-            <w:shd w:val="clear" w:color="auto" w:fill="F2F2F2"/>
-          </w:tcPr>
-          <w:p>
-            <w:pPr>
-              <w:jc w:val="center"/>
-            </w:pPr>
-            <w:r/>
-            <w:r>
-              <w:rPr>
-                <w:b w:val="0"/>
-                <w:sz w:val="19"/>
-              </w:rPr>
-              <w:t>Texto largo</w:t>
-            </w:r>
-          </w:p>
-        </w:tc>
-        <w:tc>
-          <w:tcPr>
-            <w:tcW w:type="dxa" w:w="1304"/>
-            <w:shd w:val="clear" w:color="auto" w:fill="F2F2F2"/>
-          </w:tcPr>
-          <w:p>
-            <w:pPr>
-              <w:jc w:val="center"/>
-            </w:pPr>
-            <w:r/>
-            <w:r>
-              <w:rPr>
-                <w:b w:val="0"/>
-                <w:sz w:val="19"/>
-              </w:rPr>
-              <w:t>No</w:t>
-            </w:r>
-          </w:p>
-        </w:tc>
-      </w:tr>
-      <w:tr>
-        <w:tc>
-          <w:tcPr>
-            <w:tcW w:type="dxa" w:w="624"/>
-          </w:tcPr>
-          <w:p>
-            <w:pPr>
-              <w:jc w:val="center"/>
-            </w:pPr>
-            <w:r/>
-            <w:r>
-              <w:rPr>
-                <w:b w:val="0"/>
-                <w:sz w:val="19"/>
-              </w:rPr>
-              <w:t>23</w:t>
-            </w:r>
-          </w:p>
-        </w:tc>
-        <w:tc>
-          <w:tcPr>
-            <w:tcW w:type="dxa" w:w="6236"/>
-          </w:tcPr>
-          <w:p>
-            <w:r/>
-            <w:r>
-              <w:rPr>
-                <w:b w:val="0"/>
-                <w:sz w:val="19"/>
-              </w:rPr>
-              <w:t>MTPD: ¿Cuánto tiempo puede estar interrumpido el proceso antes de que los impactos sean inac...</w:t>
-            </w:r>
-          </w:p>
-        </w:tc>
-        <w:tc>
-          <w:tcPr>
-            <w:tcW w:type="dxa" w:w="1474"/>
-          </w:tcPr>
-          <w:p>
-            <w:pPr>
-              <w:jc w:val="center"/>
-            </w:pPr>
-            <w:r/>
-            <w:r>
-              <w:rPr>
-                <w:b w:val="0"/>
-                <w:sz w:val="19"/>
-              </w:rPr>
-              <w:t>Texto corto</w:t>
-            </w:r>
-          </w:p>
-        </w:tc>
-        <w:tc>
-          <w:tcPr>
-            <w:tcW w:type="dxa" w:w="1304"/>
-          </w:tcPr>
-          <w:p>
-            <w:pPr>
-              <w:jc w:val="center"/>
-            </w:pPr>
-            <w:r>
-              <w:rPr>
-                <w:b/>
-              </w:rPr>
-            </w:r>
-            <w:r>
-              <w:rPr>
-                <w:b w:val="0"/>
-                <w:sz w:val="19"/>
-              </w:rPr>
-              <w:t>Sí</w:t>
-            </w:r>
-          </w:p>
-        </w:tc>
-      </w:tr>
-      <w:tr>
-        <w:tc>
-          <w:tcPr>
-            <w:tcW w:type="dxa" w:w="624"/>
-            <w:shd w:val="clear" w:color="auto" w:fill="F2F2F2"/>
-          </w:tcPr>
-          <w:p>
-            <w:pPr>
-              <w:jc w:val="center"/>
-            </w:pPr>
-            <w:r/>
-            <w:r>
-              <w:rPr>
-                <w:b w:val="0"/>
-                <w:sz w:val="19"/>
-              </w:rPr>
-              <w:t>24</w:t>
-            </w:r>
-          </w:p>
-        </w:tc>
-        <w:tc>
-          <w:tcPr>
-            <w:tcW w:type="dxa" w:w="6236"/>
-            <w:shd w:val="clear" w:color="auto" w:fill="F2F2F2"/>
-          </w:tcPr>
-          <w:p>
-            <w:r/>
-            <w:r>
-              <w:rPr>
-                <w:b w:val="0"/>
-                <w:sz w:val="19"/>
-              </w:rPr>
-              <w:t>MBCO: ¿Qué nivel mínimo de servicio debe mantenerse durante una contingencia? (Indique activ...</w:t>
-            </w:r>
-          </w:p>
-        </w:tc>
-        <w:tc>
-          <w:tcPr>
-            <w:tcW w:type="dxa" w:w="1474"/>
-            <w:shd w:val="clear" w:color="auto" w:fill="F2F2F2"/>
-          </w:tcPr>
-          <w:p>
-            <w:pPr>
-              <w:jc w:val="center"/>
-            </w:pPr>
-            <w:r/>
-            <w:r>
-              <w:rPr>
-                <w:b w:val="0"/>
-                <w:sz w:val="19"/>
-              </w:rPr>
-              <w:t>Texto largo</w:t>
-            </w:r>
-          </w:p>
-        </w:tc>
-        <w:tc>
-          <w:tcPr>
-            <w:tcW w:type="dxa" w:w="1304"/>
-            <w:shd w:val="clear" w:color="auto" w:fill="F2F2F2"/>
-          </w:tcPr>
-          <w:p>
-            <w:pPr>
-              <w:jc w:val="center"/>
-            </w:pPr>
-            <w:r>
-              <w:rPr>
-                <w:b/>
-              </w:rPr>
-            </w:r>
-            <w:r>
-              <w:rPr>
-                <w:b w:val="0"/>
-                <w:sz w:val="19"/>
-              </w:rPr>
-              <w:t>Sí</w:t>
-            </w:r>
-          </w:p>
-        </w:tc>
-      </w:tr>
-      <w:tr>
-        <w:tc>
-          <w:tcPr>
-            <w:tcW w:type="dxa" w:w="624"/>
-          </w:tcPr>
-          <w:p>
-            <w:pPr>
-              <w:jc w:val="center"/>
-            </w:pPr>
-            <w:r/>
-            <w:r>
-              <w:rPr>
-                <w:b w:val="0"/>
-                <w:sz w:val="19"/>
-              </w:rPr>
-              <w:t>25</w:t>
-            </w:r>
-          </w:p>
-        </w:tc>
-        <w:tc>
-          <w:tcPr>
-            <w:tcW w:type="dxa" w:w="6236"/>
-          </w:tcPr>
-          <w:p>
-            <w:r/>
-            <w:r>
-              <w:rPr>
-                <w:b w:val="0"/>
-                <w:sz w:val="19"/>
-              </w:rPr>
-              <w:t>RTO: ¿En cuánto tiempo debe restablecerse el proceso después de una interrupción? (Ejemplo: ...</w:t>
-            </w:r>
-          </w:p>
-        </w:tc>
-        <w:tc>
-          <w:tcPr>
-            <w:tcW w:type="dxa" w:w="1474"/>
-          </w:tcPr>
-          <w:p>
-            <w:pPr>
-              <w:jc w:val="center"/>
-            </w:pPr>
-            <w:r/>
-            <w:r>
-              <w:rPr>
-                <w:b w:val="0"/>
-                <w:sz w:val="19"/>
-              </w:rPr>
-              <w:t>Texto corto</w:t>
-            </w:r>
-          </w:p>
-        </w:tc>
-        <w:tc>
-          <w:tcPr>
-            <w:tcW w:type="dxa" w:w="1304"/>
-          </w:tcPr>
-          <w:p>
-            <w:pPr>
-              <w:jc w:val="center"/>
-            </w:pPr>
-            <w:r>
-              <w:rPr>
-                <w:b/>
-              </w:rPr>
-            </w:r>
-            <w:r>
-              <w:rPr>
-                <w:b w:val="0"/>
-                <w:sz w:val="19"/>
-              </w:rPr>
-              <w:t>Sí</w:t>
-            </w:r>
-          </w:p>
-        </w:tc>
-      </w:tr>
-      <w:tr>
-        <w:tc>
-          <w:tcPr>
-            <w:tcW w:type="dxa" w:w="624"/>
-            <w:shd w:val="clear" w:color="auto" w:fill="F2F2F2"/>
-          </w:tcPr>
-          <w:p>
-            <w:pPr>
-              <w:jc w:val="center"/>
-            </w:pPr>
-            <w:r/>
-            <w:r>
-              <w:rPr>
-                <w:b w:val="0"/>
-                <w:sz w:val="19"/>
-              </w:rPr>
-              <w:t>26</w:t>
-            </w:r>
-          </w:p>
-        </w:tc>
-        <w:tc>
-          <w:tcPr>
-            <w:tcW w:type="dxa" w:w="6236"/>
-            <w:shd w:val="clear" w:color="auto" w:fill="F2F2F2"/>
-          </w:tcPr>
-          <w:p>
-            <w:r/>
-            <w:r>
-              <w:rPr>
-                <w:b w:val="0"/>
-                <w:sz w:val="19"/>
-              </w:rPr>
-              <w:t>RPO: ¿Cuánta información, medida en tiempo, puede perder el proceso sin consecuencias graves...</w:t>
-            </w:r>
-          </w:p>
-        </w:tc>
-        <w:tc>
-          <w:tcPr>
-            <w:tcW w:type="dxa" w:w="1474"/>
-            <w:shd w:val="clear" w:color="auto" w:fill="F2F2F2"/>
-          </w:tcPr>
-          <w:p>
-            <w:pPr>
-              <w:jc w:val="center"/>
-            </w:pPr>
-            <w:r/>
-            <w:r>
-              <w:rPr>
-                <w:b w:val="0"/>
-                <w:sz w:val="19"/>
-              </w:rPr>
-              <w:t>Texto corto</w:t>
-            </w:r>
-          </w:p>
-        </w:tc>
-        <w:tc>
-          <w:tcPr>
-            <w:tcW w:type="dxa" w:w="1304"/>
-            <w:shd w:val="clear" w:color="auto" w:fill="F2F2F2"/>
-          </w:tcPr>
-          <w:p>
-            <w:pPr>
-              <w:jc w:val="center"/>
-            </w:pPr>
-            <w:r>
-              <w:rPr>
-                <w:b/>
-              </w:rPr>
-            </w:r>
-            <w:r>
-              <w:rPr>
-                <w:b w:val="0"/>
-                <w:sz w:val="19"/>
-              </w:rPr>
-              <w:t>Sí</w:t>
-            </w:r>
-          </w:p>
-        </w:tc>
-      </w:tr>
-      <w:tr>
-        <w:tc>
-          <w:tcPr>
-            <w:tcW w:type="dxa" w:w="624"/>
-          </w:tcPr>
-          <w:p>
-            <w:pPr>
-              <w:jc w:val="center"/>
-            </w:pPr>
-            <w:r/>
-            <w:r>
-              <w:rPr>
-                <w:b w:val="0"/>
-                <w:sz w:val="19"/>
-              </w:rPr>
-              <w:t>27</w:t>
-            </w:r>
-          </w:p>
-        </w:tc>
-        <w:tc>
-          <w:tcPr>
-            <w:tcW w:type="dxa" w:w="6236"/>
-          </w:tcPr>
-          <w:p>
-            <w:r/>
-            <w:r>
-              <w:rPr>
-                <w:b w:val="0"/>
-                <w:sz w:val="19"/>
-              </w:rPr>
-              <w:t>¿Cuánto tarda actualmente Tecnología de la Información en restablecer los sistemas que neces...</w:t>
-            </w:r>
-          </w:p>
-        </w:tc>
-        <w:tc>
-          <w:tcPr>
-            <w:tcW w:type="dxa" w:w="1474"/>
-          </w:tcPr>
-          <w:p>
-            <w:pPr>
-              <w:jc w:val="center"/>
-            </w:pPr>
-            <w:r/>
-            <w:r>
-              <w:rPr>
-                <w:b w:val="0"/>
-                <w:sz w:val="19"/>
-              </w:rPr>
-              <w:t>Texto corto</w:t>
-            </w:r>
-          </w:p>
-        </w:tc>
-        <w:tc>
-          <w:tcPr>
-            <w:tcW w:type="dxa" w:w="1304"/>
-          </w:tcPr>
-          <w:p>
-            <w:pPr>
-              <w:jc w:val="center"/>
-            </w:pPr>
-            <w:r>
-              <w:rPr>
-                <w:b/>
-              </w:rPr>
-            </w:r>
-            <w:r>
-              <w:rPr>
-                <w:b w:val="0"/>
-                <w:sz w:val="19"/>
-              </w:rPr>
-              <w:t>Sí</w:t>
-            </w:r>
-          </w:p>
-        </w:tc>
-      </w:tr>
-      <w:tr>
-        <w:tc>
-          <w:tcPr>
-            <w:tcW w:type="dxa" w:w="624"/>
-            <w:shd w:val="clear" w:color="auto" w:fill="F2F2F2"/>
-          </w:tcPr>
-          <w:p>
-            <w:pPr>
-              <w:jc w:val="center"/>
-            </w:pPr>
-            <w:r/>
-            <w:r>
-              <w:rPr>
-                <w:b w:val="0"/>
-                <w:sz w:val="19"/>
-              </w:rPr>
-              <w:t>28</w:t>
-            </w:r>
-          </w:p>
-        </w:tc>
-        <w:tc>
-          <w:tcPr>
-            <w:tcW w:type="dxa" w:w="6236"/>
-            <w:shd w:val="clear" w:color="auto" w:fill="F2F2F2"/>
-          </w:tcPr>
-          <w:p>
-            <w:r/>
-            <w:r>
-              <w:rPr>
-                <w:b w:val="0"/>
-                <w:sz w:val="19"/>
-              </w:rPr>
-              <w:t>¿Cada cuánto se respalda la información que utiliza el proceso?</w:t>
-            </w:r>
-          </w:p>
-        </w:tc>
-        <w:tc>
-          <w:tcPr>
-            <w:tcW w:type="dxa" w:w="1474"/>
-            <w:shd w:val="clear" w:color="auto" w:fill="F2F2F2"/>
-          </w:tcPr>
-          <w:p>
-            <w:pPr>
-              <w:jc w:val="center"/>
-            </w:pPr>
-            <w:r/>
-            <w:r>
-              <w:rPr>
-                <w:b w:val="0"/>
-                <w:sz w:val="19"/>
-              </w:rPr>
-              <w:t>Opción</w:t>
-            </w:r>
-          </w:p>
-        </w:tc>
-        <w:tc>
-          <w:tcPr>
-            <w:tcW w:type="dxa" w:w="1304"/>
-            <w:shd w:val="clear" w:color="auto" w:fill="F2F2F2"/>
-          </w:tcPr>
-          <w:p>
-            <w:pPr>
-              <w:jc w:val="center"/>
-            </w:pPr>
-            <w:r>
-              <w:rPr>
-                <w:b/>
-              </w:rPr>
-            </w:r>
-            <w:r>
-              <w:rPr>
-                <w:b w:val="0"/>
-                <w:sz w:val="19"/>
-              </w:rPr>
-              <w:t>Sí</w:t>
-            </w:r>
-          </w:p>
-        </w:tc>
-      </w:tr>
-      <w:tr>
-        <w:tc>
-          <w:tcPr>
-            <w:tcW w:type="dxa" w:w="624"/>
-          </w:tcPr>
-          <w:p>
-            <w:pPr>
-              <w:jc w:val="center"/>
-            </w:pPr>
-            <w:r/>
-            <w:r>
-              <w:rPr>
-                <w:b w:val="0"/>
-                <w:sz w:val="19"/>
-              </w:rPr>
-              <w:t>29</w:t>
-            </w:r>
-          </w:p>
-        </w:tc>
-        <w:tc>
-          <w:tcPr>
-            <w:tcW w:type="dxa" w:w="6236"/>
-          </w:tcPr>
-          <w:p>
-            <w:r/>
-            <w:r>
-              <w:rPr>
-                <w:b w:val="0"/>
-                <w:sz w:val="19"/>
-              </w:rPr>
-              <w:t>¿Qué acciones deben ejecutarse para recuperar el proceso a tiempo? Indique el orden de prior...</w:t>
+              <w:t>Detalle cada recurso seleccionado: tipo, cantidad y tiempo máximo para disponer de él. (Ejem...</w:t>
             </w:r>
           </w:p>
         </w:tc>
@@ -3058,469 +2501,7 @@
                 <w:b w:val="0"/>
                 <w:sz w:val="19"/>
               </w:rPr>
-              <w:t>30</w:t>
-            </w:r>
-          </w:p>
-        </w:tc>
-        <w:tc>
-          <w:tcPr>
-            <w:tcW w:type="dxa" w:w="6236"/>
-            <w:shd w:val="clear" w:color="auto" w:fill="F2F2F2"/>
-          </w:tcPr>
-          <w:p>
-            <w:r/>
-            <w:r>
-              <w:rPr>
-                <w:b w:val="0"/>
-                <w:sz w:val="19"/>
-              </w:rPr>
-              <w:t>Después de restablecer el servicio mínimo, ¿cuánto tiempo adicional se necesita para recuper...</w:t>
-            </w:r>
-          </w:p>
-        </w:tc>
-        <w:tc>
-          <w:tcPr>
-            <w:tcW w:type="dxa" w:w="1474"/>
-            <w:shd w:val="clear" w:color="auto" w:fill="F2F2F2"/>
-          </w:tcPr>
-          <w:p>
-            <w:pPr>
-              <w:jc w:val="center"/>
-            </w:pPr>
-            <w:r/>
-            <w:r>
-              <w:rPr>
-                <w:b w:val="0"/>
-                <w:sz w:val="19"/>
-              </w:rPr>
-              <w:t>Texto corto</w:t>
-            </w:r>
-          </w:p>
-        </w:tc>
-        <w:tc>
-          <w:tcPr>
-            <w:tcW w:type="dxa" w:w="1304"/>
-            <w:shd w:val="clear" w:color="auto" w:fill="F2F2F2"/>
-          </w:tcPr>
-          <w:p>
-            <w:pPr>
-              <w:jc w:val="center"/>
-            </w:pPr>
-            <w:r>
-              <w:rPr>
-                <w:b/>
-              </w:rPr>
-            </w:r>
-            <w:r>
-              <w:rPr>
-                <w:b w:val="0"/>
-                <w:sz w:val="19"/>
-              </w:rPr>
-              <w:t>Sí</w:t>
-            </w:r>
-          </w:p>
-        </w:tc>
-      </w:tr>
-      <w:tr>
-        <w:tc>
-          <w:tcPr>
-            <w:tcW w:type="dxa" w:w="624"/>
-          </w:tcPr>
-          <w:p>
-            <w:pPr>
-              <w:jc w:val="center"/>
-            </w:pPr>
-            <w:r/>
-            <w:r>
-              <w:rPr>
-                <w:b w:val="0"/>
-                <w:sz w:val="19"/>
-              </w:rPr>
-              <w:t>31</w:t>
-            </w:r>
-          </w:p>
-        </w:tc>
-        <w:tc>
-          <w:tcPr>
-            <w:tcW w:type="dxa" w:w="6236"/>
-          </w:tcPr>
-          <w:p>
-            <w:r/>
-            <w:r>
-              <w:rPr>
-                <w:b w:val="0"/>
-                <w:sz w:val="19"/>
-              </w:rPr>
-              <w:t>Recursos tecnológicos: ¿qué equipos, sistemas o accesos necesita, en qué cantidad y en cuánt...</w:t>
-            </w:r>
-          </w:p>
-        </w:tc>
-        <w:tc>
-          <w:tcPr>
-            <w:tcW w:type="dxa" w:w="1474"/>
-          </w:tcPr>
-          <w:p>
-            <w:pPr>
-              <w:jc w:val="center"/>
-            </w:pPr>
-            <w:r/>
-            <w:r>
-              <w:rPr>
-                <w:b w:val="0"/>
-                <w:sz w:val="19"/>
-              </w:rPr>
-              <w:t>Texto largo</w:t>
-            </w:r>
-          </w:p>
-        </w:tc>
-        <w:tc>
-          <w:tcPr>
-            <w:tcW w:type="dxa" w:w="1304"/>
-          </w:tcPr>
-          <w:p>
-            <w:pPr>
-              <w:jc w:val="center"/>
-            </w:pPr>
-            <w:r>
-              <w:rPr>
-                <w:b/>
-              </w:rPr>
-            </w:r>
-            <w:r>
-              <w:rPr>
-                <w:b w:val="0"/>
-                <w:sz w:val="19"/>
-              </w:rPr>
-              <w:t>Sí</w:t>
-            </w:r>
-          </w:p>
-        </w:tc>
-      </w:tr>
-      <w:tr>
-        <w:tc>
-          <w:tcPr>
-            <w:tcW w:type="dxa" w:w="624"/>
-            <w:shd w:val="clear" w:color="auto" w:fill="F2F2F2"/>
-          </w:tcPr>
-          <w:p>
-            <w:pPr>
-              <w:jc w:val="center"/>
-            </w:pPr>
-            <w:r/>
-            <w:r>
-              <w:rPr>
-                <w:b w:val="0"/>
-                <w:sz w:val="19"/>
-              </w:rPr>
-              <w:t>32</w:t>
-            </w:r>
-          </w:p>
-        </w:tc>
-        <w:tc>
-          <w:tcPr>
-            <w:tcW w:type="dxa" w:w="6236"/>
-            <w:shd w:val="clear" w:color="auto" w:fill="F2F2F2"/>
-          </w:tcPr>
-          <w:p>
-            <w:r/>
-            <w:r>
-              <w:rPr>
-                <w:b w:val="0"/>
-                <w:sz w:val="19"/>
-              </w:rPr>
-              <w:t>Mobiliario: ¿qué mobiliario necesita y en qué cantidad?</w:t>
-            </w:r>
-          </w:p>
-        </w:tc>
-        <w:tc>
-          <w:tcPr>
-            <w:tcW w:type="dxa" w:w="1474"/>
-            <w:shd w:val="clear" w:color="auto" w:fill="F2F2F2"/>
-          </w:tcPr>
-          <w:p>
-            <w:pPr>
-              <w:jc w:val="center"/>
-            </w:pPr>
-            <w:r/>
-            <w:r>
-              <w:rPr>
-                <w:b w:val="0"/>
-                <w:sz w:val="19"/>
-              </w:rPr>
-              <w:t>Texto largo</w:t>
-            </w:r>
-          </w:p>
-        </w:tc>
-        <w:tc>
-          <w:tcPr>
-            <w:tcW w:type="dxa" w:w="1304"/>
-            <w:shd w:val="clear" w:color="auto" w:fill="F2F2F2"/>
-          </w:tcPr>
-          <w:p>
-            <w:pPr>
-              <w:jc w:val="center"/>
-            </w:pPr>
-            <w:r>
-              <w:rPr>
-                <w:b/>
-              </w:rPr>
-            </w:r>
-            <w:r>
-              <w:rPr>
-                <w:b w:val="0"/>
-                <w:sz w:val="19"/>
-              </w:rPr>
-              <w:t>Sí</w:t>
-            </w:r>
-          </w:p>
-        </w:tc>
-      </w:tr>
-      <w:tr>
-        <w:tc>
-          <w:tcPr>
-            <w:tcW w:type="dxa" w:w="624"/>
-          </w:tcPr>
-          <w:p>
-            <w:pPr>
-              <w:jc w:val="center"/>
-            </w:pPr>
-            <w:r/>
-            <w:r>
-              <w:rPr>
-                <w:b w:val="0"/>
-                <w:sz w:val="19"/>
-              </w:rPr>
-              <w:t>33</w:t>
-            </w:r>
-          </w:p>
-        </w:tc>
-        <w:tc>
-          <w:tcPr>
-            <w:tcW w:type="dxa" w:w="6236"/>
-          </w:tcPr>
-          <w:p>
-            <w:r/>
-            <w:r>
-              <w:rPr>
-                <w:b w:val="0"/>
-                <w:sz w:val="19"/>
-              </w:rPr>
-              <w:t>Papelería: ¿qué suministros necesita para operar manualmente y en qué cantidad?</w:t>
-            </w:r>
-          </w:p>
-        </w:tc>
-        <w:tc>
-          <w:tcPr>
-            <w:tcW w:type="dxa" w:w="1474"/>
-          </w:tcPr>
-          <w:p>
-            <w:pPr>
-              <w:jc w:val="center"/>
-            </w:pPr>
-            <w:r/>
-            <w:r>
-              <w:rPr>
-                <w:b w:val="0"/>
-                <w:sz w:val="19"/>
-              </w:rPr>
-              <w:t>Texto largo</w:t>
-            </w:r>
-          </w:p>
-        </w:tc>
-        <w:tc>
-          <w:tcPr>
-            <w:tcW w:type="dxa" w:w="1304"/>
-          </w:tcPr>
-          <w:p>
-            <w:pPr>
-              <w:jc w:val="center"/>
-            </w:pPr>
-            <w:r>
-              <w:rPr>
-                <w:b/>
-              </w:rPr>
-            </w:r>
-            <w:r>
-              <w:rPr>
-                <w:b w:val="0"/>
-                <w:sz w:val="19"/>
-              </w:rPr>
-              <w:t>Sí</w:t>
-            </w:r>
-          </w:p>
-        </w:tc>
-      </w:tr>
-      <w:tr>
-        <w:tc>
-          <w:tcPr>
-            <w:tcW w:type="dxa" w:w="624"/>
-            <w:shd w:val="clear" w:color="auto" w:fill="F2F2F2"/>
-          </w:tcPr>
-          <w:p>
-            <w:pPr>
-              <w:jc w:val="center"/>
-            </w:pPr>
-            <w:r/>
-            <w:r>
-              <w:rPr>
-                <w:b w:val="0"/>
-                <w:sz w:val="19"/>
-              </w:rPr>
-              <w:t>34</w:t>
-            </w:r>
-          </w:p>
-        </w:tc>
-        <w:tc>
-          <w:tcPr>
-            <w:tcW w:type="dxa" w:w="6236"/>
-            <w:shd w:val="clear" w:color="auto" w:fill="F2F2F2"/>
-          </w:tcPr>
-          <w:p>
-            <w:r/>
-            <w:r>
-              <w:rPr>
-                <w:b w:val="0"/>
-                <w:sz w:val="19"/>
-              </w:rPr>
-              <w:t>Personal: ¿qué puestos y cuántas personas necesita, en qué turnos y en cuánto tiempo deben i...</w:t>
-            </w:r>
-          </w:p>
-        </w:tc>
-        <w:tc>
-          <w:tcPr>
-            <w:tcW w:type="dxa" w:w="1474"/>
-            <w:shd w:val="clear" w:color="auto" w:fill="F2F2F2"/>
-          </w:tcPr>
-          <w:p>
-            <w:pPr>
-              <w:jc w:val="center"/>
-            </w:pPr>
-            <w:r/>
-            <w:r>
-              <w:rPr>
-                <w:b w:val="0"/>
-                <w:sz w:val="19"/>
-              </w:rPr>
-              <w:t>Texto largo</w:t>
-            </w:r>
-          </w:p>
-        </w:tc>
-        <w:tc>
-          <w:tcPr>
-            <w:tcW w:type="dxa" w:w="1304"/>
-            <w:shd w:val="clear" w:color="auto" w:fill="F2F2F2"/>
-          </w:tcPr>
-          <w:p>
-            <w:pPr>
-              <w:jc w:val="center"/>
-            </w:pPr>
-            <w:r>
-              <w:rPr>
-                <w:b/>
-              </w:rPr>
-            </w:r>
-            <w:r>
-              <w:rPr>
-                <w:b w:val="0"/>
-                <w:sz w:val="19"/>
-              </w:rPr>
-              <w:t>Sí</w:t>
-            </w:r>
-          </w:p>
-        </w:tc>
-      </w:tr>
-      <w:tr>
-        <w:tc>
-          <w:tcPr>
-            <w:tcW w:type="dxa" w:w="624"/>
-          </w:tcPr>
-          <w:p>
-            <w:pPr>
-              <w:jc w:val="center"/>
-            </w:pPr>
-            <w:r/>
-            <w:r>
-              <w:rPr>
-                <w:b w:val="0"/>
-                <w:sz w:val="19"/>
-              </w:rPr>
-              <w:t>35</w:t>
-            </w:r>
-          </w:p>
-        </w:tc>
-        <w:tc>
-          <w:tcPr>
-            <w:tcW w:type="dxa" w:w="6236"/>
-          </w:tcPr>
-          <w:p>
-            <w:r/>
-            <w:r>
-              <w:rPr>
-                <w:b w:val="0"/>
-                <w:sz w:val="19"/>
-              </w:rPr>
-              <w:t>Otros recursos: ¿qué más necesita, en qué cantidad y en cuánto tiempo? (Ejemplo: transporte,...</w:t>
-            </w:r>
-          </w:p>
-        </w:tc>
-        <w:tc>
-          <w:tcPr>
-            <w:tcW w:type="dxa" w:w="1474"/>
-          </w:tcPr>
-          <w:p>
-            <w:pPr>
-              <w:jc w:val="center"/>
-            </w:pPr>
-            <w:r/>
-            <w:r>
-              <w:rPr>
-                <w:b w:val="0"/>
-                <w:sz w:val="19"/>
-              </w:rPr>
-              <w:t>Texto largo</w:t>
-            </w:r>
-          </w:p>
-        </w:tc>
-        <w:tc>
-          <w:tcPr>
-            <w:tcW w:type="dxa" w:w="1304"/>
-          </w:tcPr>
-          <w:p>
-            <w:pPr>
-              <w:jc w:val="center"/>
-            </w:pPr>
-            <w:r>
-              <w:rPr>
-                <w:b/>
-              </w:rPr>
-            </w:r>
-            <w:r>
-              <w:rPr>
-                <w:b w:val="0"/>
-                <w:sz w:val="19"/>
-              </w:rPr>
-              <w:t>Sí</w:t>
-            </w:r>
-          </w:p>
-        </w:tc>
-      </w:tr>
-      <w:tr>
-        <w:tc>
-          <w:tcPr>
-            <w:tcW w:type="dxa" w:w="624"/>
-            <w:shd w:val="clear" w:color="auto" w:fill="F2F2F2"/>
-          </w:tcPr>
-          <w:p>
-            <w:pPr>
-              <w:jc w:val="center"/>
-            </w:pPr>
-            <w:r/>
-            <w:r>
-              <w:rPr>
-                <w:b w:val="0"/>
-                <w:sz w:val="19"/>
-              </w:rPr>
-              <w:t>36</w:t>
+              <w:t>22</w:t>
             </w:r>
           </w:p>
         </w:tc>
@@ -3598,7 +2579,7 @@
                 <w:b w:val="0"/>
                 <w:sz w:val="19"/>
               </w:rPr>
-              <w:t>37</w:t>
+              <w:t>23</w:t>
             </w:r>
           </w:p>
         </w:tc>
@@ -3613,7 +2594,7 @@
                 <w:b w:val="0"/>
                 <w:sz w:val="19"/>
               </w:rPr>
-              <w:t>Para cada proveedor crítico indique, en una línea: nombre, servicio, país, tiempo máximo tol...</w:t>
+              <w:t>Para cada proveedor crítico indique: nombre, servicio, país, tiempo máximo tolerable sin el ...</w:t>
             </w:r>
           </w:p>
         </w:tc>
@@ -3670,7 +2651,7 @@
                 <w:b w:val="0"/>
                 <w:sz w:val="19"/>
               </w:rPr>
-              <w:t>38</w:t>
+              <w:t>24</w:t>
             </w:r>
           </w:p>
         </w:tc>
@@ -3686,7 +2667,7 @@
                 <w:b w:val="0"/>
                 <w:sz w:val="19"/>
               </w:rPr>
-              <w:t>Si un recurso o proveedor crítico no está disponible, ¿qué alternativa tiene el proceso, cuá...</w:t>
+              <w:t>En una escala de 1 a 5, ¿qué tan preparado está el proceso para enfrentar una interrupción? ...</w:t>
             </w:r>
           </w:p>
         </w:tc>
@@ -3705,7 +2686,7 @@
                 <w:b w:val="0"/>
                 <w:sz w:val="19"/>
               </w:rPr>
-              <w:t>Texto largo</w:t>
+              <w:t>Calificación</w:t>
             </w:r>
           </w:p>
         </w:tc>
@@ -3748,7 +2729,7 @@
                 <w:b w:val="0"/>
                 <w:sz w:val="19"/>
               </w:rPr>
-              <w:t>39</w:t>
+              <w:t>25</w:t>
             </w:r>
           </w:p>
         </w:tc>
@@ -3763,7 +2744,7 @@
                 <w:b w:val="0"/>
                 <w:sz w:val="19"/>
               </w:rPr>
-              <w:t>Observaciones adicionales sobre el impacto o la continuidad del proceso</w:t>
+              <w:t>¿Confirma que la información refleja las condiciones actuales del proceso?</w:t>
             </w:r>
           </w:p>
         </w:tc>
@@ -3781,157 +2762,7 @@
                 <w:b w:val="0"/>
                 <w:sz w:val="19"/>
               </w:rPr>
-              <w:t>Texto largo</w:t>
-            </w:r>
-          </w:p>
-        </w:tc>
-        <w:tc>
-          <w:tcPr>
-            <w:tcW w:type="dxa" w:w="1304"/>
-          </w:tcPr>
-          <w:p>
-            <w:pPr>
-              <w:jc w:val="center"/>
-            </w:pPr>
-            <w:r/>
-            <w:r>
-              <w:rPr>
-                <w:b w:val="0"/>
-                <w:sz w:val="19"/>
-              </w:rPr>
-              <w:t>No</w:t>
-            </w:r>
-          </w:p>
-        </w:tc>
-      </w:tr>
-      <w:tr>
-        <w:tc>
-          <w:tcPr>
-            <w:tcW w:type="dxa" w:w="624"/>
-            <w:shd w:val="clear" w:color="auto" w:fill="F2F2F2"/>
-          </w:tcPr>
-          <w:p>
-            <w:pPr>
-              <w:jc w:val="center"/>
-            </w:pPr>
-            <w:r/>
-            <w:r>
-              <w:rPr>
-                <w:b w:val="0"/>
-                <w:sz w:val="19"/>
-              </w:rPr>
-              <w:t>40</w:t>
-            </w:r>
-          </w:p>
-        </w:tc>
-        <w:tc>
-          <w:tcPr>
-            <w:tcW w:type="dxa" w:w="6236"/>
-            <w:shd w:val="clear" w:color="auto" w:fill="F2F2F2"/>
-          </w:tcPr>
-          <w:p>
-            <w:r/>
-            <w:r>
-              <w:rPr>
-                <w:b w:val="0"/>
-                <w:sz w:val="19"/>
-              </w:rPr>
-              <w:t>Nombre de la persona que realiza la entrevista</w:t>
-            </w:r>
-          </w:p>
-        </w:tc>
-        <w:tc>
-          <w:tcPr>
-            <w:tcW w:type="dxa" w:w="1474"/>
-            <w:shd w:val="clear" w:color="auto" w:fill="F2F2F2"/>
-          </w:tcPr>
-          <w:p>
-            <w:pPr>
-              <w:jc w:val="center"/>
-            </w:pPr>
-            <w:r/>
-            <w:r>
-              <w:rPr>
-                <w:b w:val="0"/>
-                <w:sz w:val="19"/>
-              </w:rPr>
-              <w:t>Texto corto</w:t>
-            </w:r>
-          </w:p>
-        </w:tc>
-        <w:tc>
-          <w:tcPr>
-            <w:tcW w:type="dxa" w:w="1304"/>
-            <w:shd w:val="clear" w:color="auto" w:fill="F2F2F2"/>
-          </w:tcPr>
-          <w:p>
-            <w:pPr>
-              <w:jc w:val="center"/>
-            </w:pPr>
-            <w:r>
-              <w:rPr>
-                <w:b/>
-              </w:rPr>
-            </w:r>
-            <w:r>
-              <w:rPr>
-                <w:b w:val="0"/>
-                <w:sz w:val="19"/>
-              </w:rPr>
-              <w:t>Sí</w:t>
-            </w:r>
-          </w:p>
-        </w:tc>
-      </w:tr>
-      <w:tr>
-        <w:tc>
-          <w:tcPr>
-            <w:tcW w:type="dxa" w:w="624"/>
-          </w:tcPr>
-          <w:p>
-            <w:pPr>
-              <w:jc w:val="center"/>
-            </w:pPr>
-            <w:r/>
-            <w:r>
-              <w:rPr>
-                <w:b w:val="0"/>
-                <w:sz w:val="19"/>
-              </w:rPr>
-              <w:t>41</w:t>
-            </w:r>
-          </w:p>
-        </w:tc>
-        <w:tc>
-          <w:tcPr>
-            <w:tcW w:type="dxa" w:w="6236"/>
-          </w:tcPr>
-          <w:p>
-            <w:r/>
-            <w:r>
-              <w:rPr>
-                <w:b w:val="0"/>
-                <w:sz w:val="19"/>
-              </w:rPr>
-              <w:t>Nombre del líder del proceso que valida la información</w:t>
-            </w:r>
-          </w:p>
-        </w:tc>
-        <w:tc>
-          <w:tcPr>
-            <w:tcW w:type="dxa" w:w="1474"/>
-          </w:tcPr>
-          <w:p>
-            <w:pPr>
-              <w:jc w:val="center"/>
-            </w:pPr>
-            <w:r/>
-            <w:r>
-              <w:rPr>
-                <w:b w:val="0"/>
-                <w:sz w:val="19"/>
-              </w:rPr>
-              <w:t>Texto corto</w:t>
+              <w:t>Opción</w:t>
             </w:r>
           </w:p>
         </w:tc>
@@ -3954,156 +2785,6 @@
                 <w:sz w:val="19"/>
               </w:rPr>
               <w:t>Sí</w:t>
-            </w:r>
-          </w:p>
-        </w:tc>
-      </w:tr>
-      <w:tr>
-        <w:tc>
-          <w:tcPr>
-            <w:tcW w:type="dxa" w:w="624"/>
-            <w:shd w:val="clear" w:color="auto" w:fill="F2F2F2"/>
-          </w:tcPr>
-          <w:p>
-            <w:pPr>
-              <w:jc w:val="center"/>
-            </w:pPr>
-            <w:r/>
-            <w:r>
-              <w:rPr>
-                <w:b w:val="0"/>
-                <w:sz w:val="19"/>
-              </w:rPr>
-              <w:t>42</w:t>
-            </w:r>
-          </w:p>
-        </w:tc>
-        <w:tc>
-          <w:tcPr>
-            <w:tcW w:type="dxa" w:w="6236"/>
-            <w:shd w:val="clear" w:color="auto" w:fill="F2F2F2"/>
-          </w:tcPr>
-          <w:p>
-            <w:r/>
-            <w:r>
-              <w:rPr>
-                <w:b w:val="0"/>
-                <w:sz w:val="19"/>
-              </w:rPr>
-              <w:t>¿Confirma que la información refleja las condiciones actuales del proceso?</w:t>
-            </w:r>
-          </w:p>
-        </w:tc>
-        <w:tc>
-          <w:tcPr>
-            <w:tcW w:type="dxa" w:w="1474"/>
-            <w:shd w:val="clear" w:color="auto" w:fill="F2F2F2"/>
-          </w:tcPr>
-          <w:p>
-            <w:pPr>
-              <w:jc w:val="center"/>
-            </w:pPr>
-            <w:r/>
-            <w:r>
-              <w:rPr>
-                <w:b w:val="0"/>
-                <w:sz w:val="19"/>
-              </w:rPr>
-              <w:t>Opción</w:t>
-            </w:r>
-          </w:p>
-        </w:tc>
-        <w:tc>
-          <w:tcPr>
-            <w:tcW w:type="dxa" w:w="1304"/>
-            <w:shd w:val="clear" w:color="auto" w:fill="F2F2F2"/>
-          </w:tcPr>
-          <w:p>
-            <w:pPr>
-              <w:jc w:val="center"/>
-            </w:pPr>
-            <w:r>
-              <w:rPr>
-                <w:b/>
-              </w:rPr>
-            </w:r>
-            <w:r>
-              <w:rPr>
-                <w:b w:val="0"/>
-                <w:sz w:val="19"/>
-              </w:rPr>
-              <w:t>Sí</w:t>
-            </w:r>
-          </w:p>
-        </w:tc>
-      </w:tr>
-      <w:tr>
-        <w:tc>
-          <w:tcPr>
-            <w:tcW w:type="dxa" w:w="624"/>
-          </w:tcPr>
-          <w:p>
-            <w:pPr>
-              <w:jc w:val="center"/>
-            </w:pPr>
-            <w:r/>
-            <w:r>
-              <w:rPr>
-                <w:b w:val="0"/>
-                <w:sz w:val="19"/>
-              </w:rPr>
-              <w:t>43</w:t>
-            </w:r>
-          </w:p>
-        </w:tc>
-        <w:tc>
-          <w:tcPr>
-            <w:tcW w:type="dxa" w:w="6236"/>
-          </w:tcPr>
-          <w:p>
-            <w:r/>
-            <w:r>
-              <w:rPr>
-                <w:b w:val="0"/>
-                <w:sz w:val="19"/>
-              </w:rPr>
-              <w:t>¿Qué información debe corregirse o validarse y qué área debe confirmarla?</w:t>
-            </w:r>
-          </w:p>
-        </w:tc>
-        <w:tc>
-          <w:tcPr>
-            <w:tcW w:type="dxa" w:w="1474"/>
-          </w:tcPr>
-          <w:p>
-            <w:pPr>
-              <w:jc w:val="center"/>
-            </w:pPr>
-            <w:r/>
-            <w:r>
-              <w:rPr>
-                <w:b w:val="0"/>
-                <w:sz w:val="19"/>
-              </w:rPr>
-              <w:t>Texto largo</w:t>
-            </w:r>
-          </w:p>
-        </w:tc>
-        <w:tc>
-          <w:tcPr>
-            <w:tcW w:type="dxa" w:w="1304"/>
-          </w:tcPr>
-          <w:p>
-            <w:pPr>
-              <w:jc w:val="center"/>
-            </w:pPr>
-            <w:r/>
-            <w:r>
-              <w:rPr>
-                <w:b w:val="0"/>
-                <w:sz w:val="19"/>
-              </w:rPr>
-              <w:t>No</w:t>
             </w:r>
           </w:p>
         </w:tc>
@@ -4356,17 +3037,17 @@
     </w:p>
     <w:p>
       <w:r>
-        <w:t>☐  Configuración &gt; Registrar nombre (opcional, si se desea identificar al entrevistado).</w:t>
+        <w:t>☐  Configuración &gt; Registrar nombre, para dejar constancia de quién llenó la entrevista.</w:t>
       </w:r>
     </w:p>
     <w:p>
       <w:r>
-        <w:t>☐  Envíe una respuesta de prueba y verifique la ramificación de las preguntas 20, 36 y 42.</w:t>
+        <w:t>☐  Envíe una respuesta de prueba y verifique la ramificación de las preguntas 11 y 22.</w:t>
       </w:r>
     </w:p>
     <w:p>
       <w:r>
-        <w:t>☐  Revise que los ejemplos de tiempos (MTPD, RTO, RPO) no se lean como metas aprobadas.</w:t>
+        <w:t>☐  Revise que los rangos de tiempo (MTPD, RTO, RPO) no se lean como metas aprobadas.</w:t>
       </w:r>
     </w:p>
     <w:p>

</xml_diff>